<commit_message>
fix(wyoming-rc): apply Round 3 attorney review — enforceability polish
- Enhance stripEmptyTableRows to remove rows where all cells contain
  only whitespace, fixing empty rows for OFF conditional covenants
- Make Employee Title conditional (hidden when blank)
- Rename "Restriction:" to "Duration:" for non-solicitation rows
- Add "Duration:" prefix to Non-Disparagement
- Change trade secret confidentiality from "Indefinite" to "Perpetual"
  and "indefinitely" to "in perpetuity" to avoid enforceability attacks
- Regenerate DOCX and markdown from updated spec
</commit_message>
<xml_diff>
--- a/content/templates/openagreements-restrictive-covenant-wyoming/template.docx
+++ b/content/templates/openagreements-restrictive-covenant-wyoming/template.docx
@@ -264,7 +264,7 @@
                 <w:sz w:val="22"/>
                 <w:szCs w:val="22"/>
               </w:rPr>
-              <w:t xml:space="preserve">Employee Title / Position</w:t>
+              <w:t xml:space="preserve">{IF employee_title}Employee Title / Position</w:t>
             </w:r>
           </w:p>
         </w:tc>
@@ -300,7 +300,7 @@
                 <w:sz w:val="22"/>
                 <w:szCs w:val="22"/>
               </w:rPr>
-              <w:t xml:space="preserve">{employee_title}</w:t>
+              <w:t xml:space="preserve">{employee_title}{END-IF}</w:t>
             </w:r>
           </w:p>
         </w:tc>
@@ -615,7 +615,7 @@
                 <w:sz w:val="22"/>
                 <w:szCs w:val="22"/>
               </w:rPr>
-              <w:t xml:space="preserve">Restriction: {employee_nonsolicit_duration}</w:t>
+              <w:t xml:space="preserve">Duration: {employee_nonsolicit_duration}</w:t>
             </w:r>
           </w:p>
           <w:p>
@@ -708,7 +708,7 @@
                 <w:sz w:val="22"/>
                 <w:szCs w:val="22"/>
               </w:rPr>
-              <w:t xml:space="preserve">Restriction: {customer_nonsolicit_duration}</w:t>
+              <w:t xml:space="preserve">Duration: {customer_nonsolicit_duration}</w:t>
             </w:r>
           </w:p>
           <w:p>
@@ -1135,7 +1135,7 @@
                 <w:sz w:val="22"/>
                 <w:szCs w:val="22"/>
               </w:rPr>
-              <w:t xml:space="preserve">{nondisparagement_duration}</w:t>
+              <w:t xml:space="preserve">Duration: {nondisparagement_duration}</w:t>
             </w:r>
           </w:p>
         </w:tc>
@@ -1549,7 +1549,7 @@
           <w:sz w:val="22"/>
           <w:szCs w:val="22"/>
         </w:rPr>
-        <w:t xml:space="preserve">Employee must treat all Confidential Information as strictly confidential. Employee must not use or disclose Confidential Information except as required to perform authorized job duties or with Employer's prior written consent. Employee's obligations regarding trade secrets continue indefinitely. Employee's obligations regarding other Confidential Information continue for the period specified in Cover Terms. Trade secrets are protected under Wyoming law, including Wyo. Stat. § 6-3-501(a)(xi).</w:t>
+        <w:t xml:space="preserve">Employee must treat all Confidential Information as strictly confidential. Employee must not use or disclose Confidential Information except as required to perform authorized job duties or with Employer's prior written consent. Employee's obligations regarding trade secrets continue in perpetuity. Employee's obligations regarding other Confidential Information continue for the period specified in Cover Terms. Trade secrets are protected under Wyoming law, including Wyo. Stat. § 6-3-501(a)(xi).</w:t>
       </w:r>
     </w:p>
     <w:p>

</xml_diff>

<commit_message>
refactor(wyoming-rc): DRY polish — move scope logic into Defined Terms
Cover Terms now show durations only; all scope and lookback logic lives
in the Defined Terms section:

- Confidentiality rows add "duration" suffix, capitalize "Confidential
  Information"
- Employee/Customer Non-Solicitation rows simplified to Duration only
- No Business and Non-Investment rows simplified to Duration only
- "Covered Customers" and "Covered Employees" definitions are now
  self-contained with lookback period fields
  (covered_customer_period, covered_employee_period)
- New "Passive Public Holdings" defined term with threshold field
  replaces inline percentage text in Non-Competition and Non-Investment
- Memo clause signal renamed covered-customers-scope to
  covered-customer-period
- Tests updated for renamed fill fields
- Regenerated DOCX and markdown
</commit_message>
<xml_diff>
--- a/content/templates/openagreements-restrictive-covenant-wyoming/template.docx
+++ b/content/templates/openagreements-restrictive-covenant-wyoming/template.docx
@@ -522,7 +522,7 @@
                 <w:sz w:val="22"/>
                 <w:szCs w:val="22"/>
               </w:rPr>
-              <w:t xml:space="preserve">Trade secrets: {confidentiality_trade_secret_duration}</w:t>
+              <w:t xml:space="preserve">Trade secrets duration: {confidentiality_trade_secret_duration}</w:t>
             </w:r>
           </w:p>
           <w:p>
@@ -541,69 +541,21 @@
                 <w:sz w:val="22"/>
                 <w:szCs w:val="22"/>
               </w:rPr>
-              <w:t xml:space="preserve">Other confidential information: {confidentiality_other_duration}</w:t>
-            </w:r>
-          </w:p>
-        </w:tc>
-      </w:tr>
-      <w:tr>
-        <w:trPr>
-          <w:trHeight w:val="700" w:hRule="atLeast"/>
-        </w:trPr>
-        <w:tc>
-          <w:tcPr>
-            <w:tcBorders>
-              <w:top w:val="single" w:color="C7C7C7" w:sz="4"/>
-              <w:left w:val="nil" w:color="FFFFFF" w:sz="0"/>
-              <w:bottom w:val="single" w:color="C7C7C7" w:sz="4"/>
-              <w:right w:val="nil" w:color="FFFFFF" w:sz="0"/>
-            </w:tcBorders>
-            <w:tcMar>
-              <w:top w:type="dxa" w:w="144"/>
-              <w:left w:type="dxa" w:w="115"/>
-              <w:bottom w:type="dxa" w:w="144"/>
-              <w:right w:type="dxa" w:w="115"/>
-            </w:tcMar>
-            <w:vAlign w:val="center"/>
-          </w:tcPr>
-          <w:p>
-            <w:pPr>
-              <w:spacing w:after="0" w:line="340"/>
-            </w:pPr>
+              <w:t xml:space="preserve">Other </w:t>
+            </w:r>
             <w:r>
               <w:rPr>
                 <w:rFonts w:ascii="Arial" w:cs="Arial" w:eastAsia="Arial" w:hAnsi="Arial"/>
                 <w:b/>
                 <w:bCs/>
-                <w:color w:val="1D2021"/>
+                <w:i w:val="false"/>
+                <w:iCs w:val="false"/>
+                <w:color w:val="117086"/>
                 <w:sz w:val="22"/>
                 <w:szCs w:val="22"/>
               </w:rPr>
-              <w:t xml:space="preserve">{IF employee_nonsolicit_included}Employee Non-Solicitation</w:t>
-            </w:r>
-          </w:p>
-        </w:tc>
-        <w:tc>
-          <w:tcPr>
-            <w:tcBorders>
-              <w:top w:val="single" w:color="C7C7C7" w:sz="4"/>
-              <w:left w:val="nil" w:color="FFFFFF" w:sz="0"/>
-              <w:bottom w:val="single" w:color="C7C7C7" w:sz="4"/>
-              <w:right w:val="nil" w:color="FFFFFF" w:sz="0"/>
-            </w:tcBorders>
-            <w:tcMar>
-              <w:top w:type="dxa" w:w="144"/>
-              <w:left w:type="dxa" w:w="115"/>
-              <w:bottom w:type="dxa" w:w="144"/>
-              <w:right w:type="dxa" w:w="115"/>
-            </w:tcMar>
-            <w:vAlign w:val="center"/>
-          </w:tcPr>
-          <w:p>
-            <w:pPr>
-              <w:spacing w:before="0" w:after="40" w:line="340" w:beforeAutospacing="false" w:afterAutospacing="false"/>
-              <w:contextualSpacing w:val="false"/>
-            </w:pPr>
+              <w:t xml:space="preserve">Confidential Information</w:t>
+            </w:r>
             <w:r>
               <w:rPr>
                 <w:rFonts w:ascii="Arial" w:cs="Arial" w:eastAsia="Arial" w:hAnsi="Arial"/>
@@ -615,9 +567,64 @@
                 <w:sz w:val="22"/>
                 <w:szCs w:val="22"/>
               </w:rPr>
-              <w:t xml:space="preserve">Duration: {employee_nonsolicit_duration}</w:t>
-            </w:r>
-          </w:p>
+              <w:t xml:space="preserve"> duration: {confidentiality_other_duration}</w:t>
+            </w:r>
+          </w:p>
+        </w:tc>
+      </w:tr>
+      <w:tr>
+        <w:trPr>
+          <w:trHeight w:val="700" w:hRule="atLeast"/>
+        </w:trPr>
+        <w:tc>
+          <w:tcPr>
+            <w:tcBorders>
+              <w:top w:val="single" w:color="C7C7C7" w:sz="4"/>
+              <w:left w:val="nil" w:color="FFFFFF" w:sz="0"/>
+              <w:bottom w:val="single" w:color="C7C7C7" w:sz="4"/>
+              <w:right w:val="nil" w:color="FFFFFF" w:sz="0"/>
+            </w:tcBorders>
+            <w:tcMar>
+              <w:top w:type="dxa" w:w="144"/>
+              <w:left w:type="dxa" w:w="115"/>
+              <w:bottom w:type="dxa" w:w="144"/>
+              <w:right w:type="dxa" w:w="115"/>
+            </w:tcMar>
+            <w:vAlign w:val="center"/>
+          </w:tcPr>
+          <w:p>
+            <w:pPr>
+              <w:spacing w:after="0" w:line="340"/>
+            </w:pPr>
+            <w:r>
+              <w:rPr>
+                <w:rFonts w:ascii="Arial" w:cs="Arial" w:eastAsia="Arial" w:hAnsi="Arial"/>
+                <w:b/>
+                <w:bCs/>
+                <w:color w:val="1D2021"/>
+                <w:sz w:val="22"/>
+                <w:szCs w:val="22"/>
+              </w:rPr>
+              <w:t xml:space="preserve">{IF employee_nonsolicit_included}Employee Non-Solicitation</w:t>
+            </w:r>
+          </w:p>
+        </w:tc>
+        <w:tc>
+          <w:tcPr>
+            <w:tcBorders>
+              <w:top w:val="single" w:color="C7C7C7" w:sz="4"/>
+              <w:left w:val="nil" w:color="FFFFFF" w:sz="0"/>
+              <w:bottom w:val="single" w:color="C7C7C7" w:sz="4"/>
+              <w:right w:val="nil" w:color="FFFFFF" w:sz="0"/>
+            </w:tcBorders>
+            <w:tcMar>
+              <w:top w:type="dxa" w:w="144"/>
+              <w:left w:type="dxa" w:w="115"/>
+              <w:bottom w:type="dxa" w:w="144"/>
+              <w:right w:type="dxa" w:w="115"/>
+            </w:tcMar>
+            <w:vAlign w:val="center"/>
+          </w:tcPr>
           <w:p>
             <w:pPr>
               <w:spacing w:before="0" w:after="0" w:line="340" w:beforeAutospacing="false" w:afterAutospacing="false"/>
@@ -634,7 +641,7 @@
                 <w:sz w:val="22"/>
                 <w:szCs w:val="22"/>
               </w:rPr>
-              <w:t xml:space="preserve">Covered employees: {covered_employees_scope}{END-IF}</w:t>
+              <w:t xml:space="preserve">Duration: {employee_nonsolicit_duration}{END-IF}</w:t>
             </w:r>
           </w:p>
         </w:tc>
@@ -694,7 +701,7 @@
           </w:tcPr>
           <w:p>
             <w:pPr>
-              <w:spacing w:before="0" w:after="40" w:line="340" w:beforeAutospacing="false" w:afterAutospacing="false"/>
+              <w:spacing w:before="0" w:after="0" w:line="340" w:beforeAutospacing="false" w:afterAutospacing="false"/>
               <w:contextualSpacing w:val="false"/>
             </w:pPr>
             <w:r>
@@ -708,12 +715,67 @@
                 <w:sz w:val="22"/>
                 <w:szCs w:val="22"/>
               </w:rPr>
-              <w:t xml:space="preserve">Duration: {customer_nonsolicit_duration}</w:t>
-            </w:r>
-          </w:p>
-          <w:p>
-            <w:pPr>
-              <w:spacing w:before="0" w:after="0" w:line="340" w:beforeAutospacing="false" w:afterAutospacing="false"/>
+              <w:t xml:space="preserve">Duration: {customer_nonsolicit_duration}{END-IF}</w:t>
+            </w:r>
+          </w:p>
+        </w:tc>
+      </w:tr>
+      <w:tr>
+        <w:trPr>
+          <w:trHeight w:val="700" w:hRule="atLeast"/>
+        </w:trPr>
+        <w:tc>
+          <w:tcPr>
+            <w:tcBorders>
+              <w:top w:val="single" w:color="C7C7C7" w:sz="4"/>
+              <w:left w:val="nil" w:color="FFFFFF" w:sz="0"/>
+              <w:bottom w:val="single" w:color="C7C7C7" w:sz="4"/>
+              <w:right w:val="nil" w:color="FFFFFF" w:sz="0"/>
+            </w:tcBorders>
+            <w:tcMar>
+              <w:top w:type="dxa" w:w="144"/>
+              <w:left w:type="dxa" w:w="115"/>
+              <w:bottom w:type="dxa" w:w="144"/>
+              <w:right w:type="dxa" w:w="115"/>
+            </w:tcMar>
+            <w:vAlign w:val="center"/>
+          </w:tcPr>
+          <w:p>
+            <w:pPr>
+              <w:spacing w:after="0" w:line="340"/>
+            </w:pPr>
+            <w:r>
+              <w:rPr>
+                <w:rFonts w:ascii="Arial" w:cs="Arial" w:eastAsia="Arial" w:hAnsi="Arial"/>
+                <w:b/>
+                <w:bCs/>
+                <w:color w:val="1D2021"/>
+                <w:sz w:val="22"/>
+                <w:szCs w:val="22"/>
+              </w:rPr>
+              <w:t xml:space="preserve">{IF noncompete_included}Non-Competition</w:t>
+            </w:r>
+          </w:p>
+        </w:tc>
+        <w:tc>
+          <w:tcPr>
+            <w:tcBorders>
+              <w:top w:val="single" w:color="C7C7C7" w:sz="4"/>
+              <w:left w:val="nil" w:color="FFFFFF" w:sz="0"/>
+              <w:bottom w:val="single" w:color="C7C7C7" w:sz="4"/>
+              <w:right w:val="nil" w:color="FFFFFF" w:sz="0"/>
+            </w:tcBorders>
+            <w:tcMar>
+              <w:top w:type="dxa" w:w="144"/>
+              <w:left w:type="dxa" w:w="115"/>
+              <w:bottom w:type="dxa" w:w="144"/>
+              <w:right w:type="dxa" w:w="115"/>
+            </w:tcMar>
+            <w:vAlign w:val="center"/>
+          </w:tcPr>
+          <w:p>
+            <w:pPr>
+              <w:spacing w:before="0" w:after="40" w:line="340" w:beforeAutospacing="false" w:afterAutospacing="false"/>
               <w:contextualSpacing w:val="false"/>
             </w:pPr>
             <w:r>
@@ -727,64 +789,9 @@
                 <w:sz w:val="22"/>
                 <w:szCs w:val="22"/>
               </w:rPr>
-              <w:t xml:space="preserve">Covered customers: {covered_customers_scope}{END-IF}</w:t>
-            </w:r>
-          </w:p>
-        </w:tc>
-      </w:tr>
-      <w:tr>
-        <w:trPr>
-          <w:trHeight w:val="700" w:hRule="atLeast"/>
-        </w:trPr>
-        <w:tc>
-          <w:tcPr>
-            <w:tcBorders>
-              <w:top w:val="single" w:color="C7C7C7" w:sz="4"/>
-              <w:left w:val="nil" w:color="FFFFFF" w:sz="0"/>
-              <w:bottom w:val="single" w:color="C7C7C7" w:sz="4"/>
-              <w:right w:val="nil" w:color="FFFFFF" w:sz="0"/>
-            </w:tcBorders>
-            <w:tcMar>
-              <w:top w:type="dxa" w:w="144"/>
-              <w:left w:type="dxa" w:w="115"/>
-              <w:bottom w:type="dxa" w:w="144"/>
-              <w:right w:type="dxa" w:w="115"/>
-            </w:tcMar>
-            <w:vAlign w:val="center"/>
-          </w:tcPr>
-          <w:p>
-            <w:pPr>
-              <w:spacing w:after="0" w:line="340"/>
-            </w:pPr>
-            <w:r>
-              <w:rPr>
-                <w:rFonts w:ascii="Arial" w:cs="Arial" w:eastAsia="Arial" w:hAnsi="Arial"/>
-                <w:b/>
-                <w:bCs/>
-                <w:color w:val="1D2021"/>
-                <w:sz w:val="22"/>
-                <w:szCs w:val="22"/>
-              </w:rPr>
-              <w:t xml:space="preserve">{IF noncompete_included}Non-Competition</w:t>
-            </w:r>
-          </w:p>
-        </w:tc>
-        <w:tc>
-          <w:tcPr>
-            <w:tcBorders>
-              <w:top w:val="single" w:color="C7C7C7" w:sz="4"/>
-              <w:left w:val="nil" w:color="FFFFFF" w:sz="0"/>
-              <w:bottom w:val="single" w:color="C7C7C7" w:sz="4"/>
-              <w:right w:val="nil" w:color="FFFFFF" w:sz="0"/>
-            </w:tcBorders>
-            <w:tcMar>
-              <w:top w:type="dxa" w:w="144"/>
-              <w:left w:type="dxa" w:w="115"/>
-              <w:bottom w:type="dxa" w:w="144"/>
-              <w:right w:type="dxa" w:w="115"/>
-            </w:tcMar>
-            <w:vAlign w:val="center"/>
-          </w:tcPr>
+              <w:t xml:space="preserve">Duration: {noncompete_duration}</w:t>
+            </w:r>
+          </w:p>
           <w:p>
             <w:pPr>
               <w:spacing w:before="0" w:after="40" w:line="340" w:beforeAutospacing="false" w:afterAutospacing="false"/>
@@ -801,12 +808,12 @@
                 <w:sz w:val="22"/>
                 <w:szCs w:val="22"/>
               </w:rPr>
-              <w:t xml:space="preserve">Duration: {noncompete_duration}</w:t>
-            </w:r>
-          </w:p>
-          <w:p>
-            <w:pPr>
-              <w:spacing w:before="0" w:after="40" w:line="340" w:beforeAutospacing="false" w:afterAutospacing="false"/>
+              <w:t xml:space="preserve">Restricted Territory: {territory}</w:t>
+            </w:r>
+          </w:p>
+          <w:p>
+            <w:pPr>
+              <w:spacing w:before="0" w:after="0" w:line="340" w:beforeAutospacing="false" w:afterAutospacing="false"/>
               <w:contextualSpacing w:val="false"/>
             </w:pPr>
             <w:r>
@@ -820,9 +827,64 @@
                 <w:sz w:val="22"/>
                 <w:szCs w:val="22"/>
               </w:rPr>
-              <w:t xml:space="preserve">Restricted Territory: {territory}</w:t>
-            </w:r>
-          </w:p>
+              <w:t xml:space="preserve">Competitive Business: {competitive_business_definition}{END-IF}</w:t>
+            </w:r>
+          </w:p>
+        </w:tc>
+      </w:tr>
+      <w:tr>
+        <w:trPr>
+          <w:trHeight w:val="700" w:hRule="atLeast"/>
+        </w:trPr>
+        <w:tc>
+          <w:tcPr>
+            <w:tcBorders>
+              <w:top w:val="single" w:color="C7C7C7" w:sz="4"/>
+              <w:left w:val="nil" w:color="FFFFFF" w:sz="0"/>
+              <w:bottom w:val="single" w:color="C7C7C7" w:sz="4"/>
+              <w:right w:val="nil" w:color="FFFFFF" w:sz="0"/>
+            </w:tcBorders>
+            <w:tcMar>
+              <w:top w:type="dxa" w:w="144"/>
+              <w:left w:type="dxa" w:w="115"/>
+              <w:bottom w:type="dxa" w:w="144"/>
+              <w:right w:type="dxa" w:w="115"/>
+            </w:tcMar>
+            <w:vAlign w:val="center"/>
+          </w:tcPr>
+          <w:p>
+            <w:pPr>
+              <w:spacing w:after="0" w:line="340"/>
+            </w:pPr>
+            <w:r>
+              <w:rPr>
+                <w:rFonts w:ascii="Arial" w:cs="Arial" w:eastAsia="Arial" w:hAnsi="Arial"/>
+                <w:b/>
+                <w:bCs/>
+                <w:color w:val="1D2021"/>
+                <w:sz w:val="22"/>
+                <w:szCs w:val="22"/>
+              </w:rPr>
+              <w:t xml:space="preserve">{IF noncompete_included}Specified Competitors</w:t>
+            </w:r>
+          </w:p>
+        </w:tc>
+        <w:tc>
+          <w:tcPr>
+            <w:tcBorders>
+              <w:top w:val="single" w:color="C7C7C7" w:sz="4"/>
+              <w:left w:val="nil" w:color="FFFFFF" w:sz="0"/>
+              <w:bottom w:val="single" w:color="C7C7C7" w:sz="4"/>
+              <w:right w:val="nil" w:color="FFFFFF" w:sz="0"/>
+            </w:tcBorders>
+            <w:tcMar>
+              <w:top w:type="dxa" w:w="144"/>
+              <w:left w:type="dxa" w:w="115"/>
+              <w:bottom w:type="dxa" w:w="144"/>
+              <w:right w:type="dxa" w:w="115"/>
+            </w:tcMar>
+            <w:vAlign w:val="center"/>
+          </w:tcPr>
           <w:p>
             <w:pPr>
               <w:spacing w:before="0" w:after="0" w:line="340" w:beforeAutospacing="false" w:afterAutospacing="false"/>
@@ -839,7 +901,7 @@
                 <w:sz w:val="22"/>
                 <w:szCs w:val="22"/>
               </w:rPr>
-              <w:t xml:space="preserve">Competitive Business: {competitive_business_definition}{END-IF}</w:t>
+              <w:t xml:space="preserve">{specified_competitors}{END-IF}</w:t>
             </w:r>
           </w:p>
         </w:tc>
@@ -877,7 +939,7 @@
                 <w:sz w:val="22"/>
                 <w:szCs w:val="22"/>
               </w:rPr>
-              <w:t xml:space="preserve">{IF noncompete_included}Specified Competitors</w:t>
+              <w:t xml:space="preserve">{IF nondealing_included}No Business with Covered Customers</w:t>
             </w:r>
           </w:p>
         </w:tc>
@@ -913,7 +975,7 @@
                 <w:sz w:val="22"/>
                 <w:szCs w:val="22"/>
               </w:rPr>
-              <w:t xml:space="preserve">{specified_competitors}{END-IF}</w:t>
+              <w:t xml:space="preserve">Duration: {nondealing_duration}{END-IF}</w:t>
             </w:r>
           </w:p>
         </w:tc>
@@ -951,7 +1013,7 @@
                 <w:sz w:val="22"/>
                 <w:szCs w:val="22"/>
               </w:rPr>
-              <w:t xml:space="preserve">{IF nondealing_included}No Business with Covered Customers</w:t>
+              <w:t xml:space="preserve">{IF noninvestment_included}Non-Investment</w:t>
             </w:r>
           </w:p>
         </w:tc>
@@ -987,81 +1049,7 @@
                 <w:sz w:val="22"/>
                 <w:szCs w:val="22"/>
               </w:rPr>
-              <w:t xml:space="preserve">{nondealing_duration}; same scope as customer non-solicitation{END-IF}</w:t>
-            </w:r>
-          </w:p>
-        </w:tc>
-      </w:tr>
-      <w:tr>
-        <w:trPr>
-          <w:trHeight w:val="700" w:hRule="atLeast"/>
-        </w:trPr>
-        <w:tc>
-          <w:tcPr>
-            <w:tcBorders>
-              <w:top w:val="single" w:color="C7C7C7" w:sz="4"/>
-              <w:left w:val="nil" w:color="FFFFFF" w:sz="0"/>
-              <w:bottom w:val="single" w:color="C7C7C7" w:sz="4"/>
-              <w:right w:val="nil" w:color="FFFFFF" w:sz="0"/>
-            </w:tcBorders>
-            <w:tcMar>
-              <w:top w:type="dxa" w:w="144"/>
-              <w:left w:type="dxa" w:w="115"/>
-              <w:bottom w:type="dxa" w:w="144"/>
-              <w:right w:type="dxa" w:w="115"/>
-            </w:tcMar>
-            <w:vAlign w:val="center"/>
-          </w:tcPr>
-          <w:p>
-            <w:pPr>
-              <w:spacing w:after="0" w:line="340"/>
-            </w:pPr>
-            <w:r>
-              <w:rPr>
-                <w:rFonts w:ascii="Arial" w:cs="Arial" w:eastAsia="Arial" w:hAnsi="Arial"/>
-                <w:b/>
-                <w:bCs/>
-                <w:color w:val="1D2021"/>
-                <w:sz w:val="22"/>
-                <w:szCs w:val="22"/>
-              </w:rPr>
-              <w:t xml:space="preserve">{IF noninvestment_included}Non-Investment</w:t>
-            </w:r>
-          </w:p>
-        </w:tc>
-        <w:tc>
-          <w:tcPr>
-            <w:tcBorders>
-              <w:top w:val="single" w:color="C7C7C7" w:sz="4"/>
-              <w:left w:val="nil" w:color="FFFFFF" w:sz="0"/>
-              <w:bottom w:val="single" w:color="C7C7C7" w:sz="4"/>
-              <w:right w:val="nil" w:color="FFFFFF" w:sz="0"/>
-            </w:tcBorders>
-            <w:tcMar>
-              <w:top w:type="dxa" w:w="144"/>
-              <w:left w:type="dxa" w:w="115"/>
-              <w:bottom w:type="dxa" w:w="144"/>
-              <w:right w:type="dxa" w:w="115"/>
-            </w:tcMar>
-            <w:vAlign w:val="center"/>
-          </w:tcPr>
-          <w:p>
-            <w:pPr>
-              <w:spacing w:before="0" w:after="0" w:line="340" w:beforeAutospacing="false" w:afterAutospacing="false"/>
-              <w:contextualSpacing w:val="false"/>
-            </w:pPr>
-            <w:r>
-              <w:rPr>
-                <w:rFonts w:ascii="Arial" w:cs="Arial" w:eastAsia="Arial" w:hAnsi="Arial"/>
-                <w:b w:val="false"/>
-                <w:bCs w:val="false"/>
-                <w:i w:val="false"/>
-                <w:iCs w:val="false"/>
-                <w:color w:val="1D2021"/>
-                <w:sz w:val="22"/>
-                <w:szCs w:val="22"/>
-              </w:rPr>
-              <w:t xml:space="preserve">{noninvestment_duration}; active ownership barred, passive public holdings permitted{END-IF}</w:t>
+              <w:t xml:space="preserve">Duration: {noninvestment_duration}{END-IF}</w:t>
             </w:r>
           </w:p>
         </w:tc>
@@ -1293,7 +1281,7 @@
           <w:sz w:val="22"/>
           <w:szCs w:val="22"/>
         </w:rPr>
-        <w:t xml:space="preserve"> means the customers, vendors, referral sources, and business partners described in Cover Terms, limited to those with whom Employee had material contact or for whom Employee had responsibility during the covered customer period specified in Cover Terms.</w:t>
+        <w:t xml:space="preserve"> means customers, vendors, referral sources, and business partners with whom Employee had material contact or for whom Employee had responsibility during the {covered_customer_period} before termination of employment.</w:t>
       </w:r>
     </w:p>
     <w:p>
@@ -1329,7 +1317,7 @@
           <w:sz w:val="22"/>
           <w:szCs w:val="22"/>
         </w:rPr>
-        <w:t xml:space="preserve"> means the employees described in Cover Terms under Covered Employees.</w:t>
+        <w:t xml:space="preserve"> means employees with whom Employee worked or whom Employee managed during the {covered_employee_period} before termination of employment.</w:t>
       </w:r>
     </w:p>
     <w:p>
@@ -1356,16 +1344,16 @@
           <w:sz w:val="22"/>
           <w:szCs w:val="22"/>
         </w:rPr>
-        <w:t xml:space="preserve">“Protected Interests”</w:t>
-      </w:r>
-      <w:r>
-        <w:rPr>
-          <w:rFonts w:ascii="Arial" w:cs="Arial" w:eastAsia="Arial" w:hAnsi="Arial"/>
-          <w:color w:val="1D2021"/>
-          <w:sz w:val="22"/>
-          <w:szCs w:val="22"/>
-        </w:rPr>
-        <w:t xml:space="preserve"> means Employer's legitimate business interests in its Confidential Information, customer and business-partner relationships, workforce stability, and goodwill.</w:t>
+        <w:t xml:space="preserve">“Passive Public Holdings”</w:t>
+      </w:r>
+      <w:r>
+        <w:rPr>
+          <w:rFonts w:ascii="Arial" w:cs="Arial" w:eastAsia="Arial" w:hAnsi="Arial"/>
+          <w:color w:val="1D2021"/>
+          <w:sz w:val="22"/>
+          <w:szCs w:val="22"/>
+        </w:rPr>
+        <w:t xml:space="preserve"> means ownership of securities of a publicly traded company representing less than {passive_public_holdings_threshold} of any class of such company’s securities, and interests in diversified mutual funds, index funds, and exchange-traded funds that may hold securities of a Competitive Business.</w:t>
       </w:r>
     </w:p>
     <w:p>
@@ -1392,16 +1380,16 @@
           <w:sz w:val="22"/>
           <w:szCs w:val="22"/>
         </w:rPr>
-        <w:t xml:space="preserve">“Restricted Period”</w:t>
-      </w:r>
-      <w:r>
-        <w:rPr>
-          <w:rFonts w:ascii="Arial" w:cs="Arial" w:eastAsia="Arial" w:hAnsi="Arial"/>
-          <w:color w:val="1D2021"/>
-          <w:sz w:val="22"/>
-          <w:szCs w:val="22"/>
-        </w:rPr>
-        <w:t xml:space="preserve"> means the duration specified in Cover Terms for each covenant, beginning on the date Employee's employment with Employer ends for any reason.</w:t>
+        <w:t xml:space="preserve">“Protected Interests”</w:t>
+      </w:r>
+      <w:r>
+        <w:rPr>
+          <w:rFonts w:ascii="Arial" w:cs="Arial" w:eastAsia="Arial" w:hAnsi="Arial"/>
+          <w:color w:val="1D2021"/>
+          <w:sz w:val="22"/>
+          <w:szCs w:val="22"/>
+        </w:rPr>
+        <w:t xml:space="preserve"> means Employer's legitimate business interests in its Confidential Information, customer and business-partner relationships, workforce stability, and goodwill.</w:t>
       </w:r>
     </w:p>
     <w:p>
@@ -1428,16 +1416,16 @@
           <w:sz w:val="22"/>
           <w:szCs w:val="22"/>
         </w:rPr>
-        <w:t xml:space="preserve">“Restricted Territory”</w:t>
-      </w:r>
-      <w:r>
-        <w:rPr>
-          <w:rFonts w:ascii="Arial" w:cs="Arial" w:eastAsia="Arial" w:hAnsi="Arial"/>
-          <w:color w:val="1D2021"/>
-          <w:sz w:val="22"/>
-          <w:szCs w:val="22"/>
-        </w:rPr>
-        <w:t xml:space="preserve"> means the geographic area described in Cover Terms under Restricted Territory.</w:t>
+        <w:t xml:space="preserve">“Restricted Period”</w:t>
+      </w:r>
+      <w:r>
+        <w:rPr>
+          <w:rFonts w:ascii="Arial" w:cs="Arial" w:eastAsia="Arial" w:hAnsi="Arial"/>
+          <w:color w:val="1D2021"/>
+          <w:sz w:val="22"/>
+          <w:szCs w:val="22"/>
+        </w:rPr>
+        <w:t xml:space="preserve"> means the duration specified in Cover Terms for each covenant, beginning on the date Employee's employment with Employer ends for any reason.</w:t>
       </w:r>
     </w:p>
     <w:p>
@@ -1464,6 +1452,42 @@
           <w:sz w:val="22"/>
           <w:szCs w:val="22"/>
         </w:rPr>
+        <w:t xml:space="preserve">“Restricted Territory”</w:t>
+      </w:r>
+      <w:r>
+        <w:rPr>
+          <w:rFonts w:ascii="Arial" w:cs="Arial" w:eastAsia="Arial" w:hAnsi="Arial"/>
+          <w:color w:val="1D2021"/>
+          <w:sz w:val="22"/>
+          <w:szCs w:val="22"/>
+        </w:rPr>
+        <w:t xml:space="preserve"> means the geographic area described in Cover Terms under Restricted Territory.</w:t>
+      </w:r>
+    </w:p>
+    <w:p>
+      <w:pPr>
+        <w:pStyle w:val="OAClauseBody"/>
+        <w:spacing w:before="320" w:after="280" w:line="340" w:beforeAutospacing="false" w:afterAutospacing="false"/>
+        <w:contextualSpacing w:val="false"/>
+      </w:pPr>
+      <w:r>
+        <w:rPr>
+          <w:rFonts w:ascii="Arial" w:cs="Arial" w:eastAsia="Arial" w:hAnsi="Arial"/>
+          <w:color w:val="1D2021"/>
+          <w:sz w:val="22"/>
+          <w:szCs w:val="22"/>
+        </w:rPr>
+        <w:t xml:space="preserve">1.9 </w:t>
+      </w:r>
+      <w:r>
+        <w:rPr>
+          <w:rFonts w:ascii="Arial" w:cs="Arial" w:eastAsia="Arial" w:hAnsi="Arial"/>
+          <w:b/>
+          <w:bCs/>
+          <w:color w:val="117086"/>
+          <w:sz w:val="22"/>
+          <w:szCs w:val="22"/>
+        </w:rPr>
         <w:t xml:space="preserve">“Solicit”</w:t>
       </w:r>
       <w:r>
@@ -2097,7 +2121,7 @@
           <w:sz w:val="22"/>
           <w:szCs w:val="22"/>
         </w:rPr>
-        <w:t xml:space="preserve">During the Restricted Period, Employee must not engage in, be employed by, consult for, or have an active ownership interest in any Competitive Business within the Restricted Territory. This covenant is included only because the restriction pathway specified by Employer supports its enforceability under Wyo. Stat. § 1-23-108. Passive ownership of publicly traded securities representing less than five percent of any class of securities is permitted. Ownership of interests in diversified mutual funds, index funds, or exchange-traded funds that may hold securities of a Competitive Business is permitted.</w:t>
+        <w:t xml:space="preserve">During the Restricted Period, Employee must not engage in, be employed by, consult for, or have an active ownership interest in any Competitive Business within the Restricted Territory. This covenant is included only because the restriction pathway specified by Employer supports its enforceability under Wyo. Stat. § 1-23-108. Passive Public Holdings are permitted.</w:t>
       </w:r>
     </w:p>
     <w:p>
@@ -2235,7 +2259,7 @@
           <w:sz w:val="22"/>
           <w:szCs w:val="22"/>
         </w:rPr>
-        <w:t xml:space="preserve">During the Restricted Period, Employee must not acquire or hold any active ownership interest in, serve as a director, officer, manager, or advisor to, or have material economic participation in any Competitive Business. This restriction primarily targets active or material ownership in private competitors. Passive ownership of publicly traded securities representing less than five percent of any class of securities is permitted, as are interests in diversified mutual funds, index funds, and exchange-traded funds. This covenant requires a lawful restriction pathway under Wyo. Stat. § 1-23-108.</w:t>
+        <w:t xml:space="preserve">During the Restricted Period, Employee must not acquire or hold any active ownership interest in, serve as a director, officer, manager, or advisor to, or have material economic participation in any Competitive Business. This restriction primarily targets active or material ownership in private competitors. Passive Public Holdings are permitted. This covenant requires a lawful restriction pathway under Wyo. Stat. § 1-23-108.</w:t>
       </w:r>
     </w:p>
     <w:p>

</xml_diff>

<commit_message>
feat(wyoming-rc): add cover terms sub-clause grouping and Trade Secrets definition
- Add `sub` boolean to coverRowSchema for sub-clause rows
- Sub-rows render with italic labels, ink_soft color, and left indent in DOCX
- Suppress defined term highlighting in cover term values (definition_site_only mode)
- Markdown renderer prefixes sub-row labels with parent context (e.g., "Non-Competition — Duration")
- Restructure cover terms with parent headers + sub-rows grouped under each covenant category
- Add "Trade Secrets" defined term with statutory cross-reference to Wyo. Stat. § 6-3-501(a)(xi)
- Regenerate DOCX and markdown outputs
</commit_message>
<xml_diff>
--- a/content/templates/openagreements-restrictive-covenant-wyoming/template.docx
+++ b/content/templates/openagreements-restrictive-covenant-wyoming/template.docx
@@ -112,6 +112,8 @@
                 <w:rFonts w:ascii="Arial" w:cs="Arial" w:eastAsia="Arial" w:hAnsi="Arial"/>
                 <w:b/>
                 <w:bCs/>
+                <w:i w:val="false"/>
+                <w:iCs w:val="false"/>
                 <w:color w:val="1D2021"/>
                 <w:sz w:val="22"/>
                 <w:szCs w:val="22"/>
@@ -186,6 +188,8 @@
                 <w:rFonts w:ascii="Arial" w:cs="Arial" w:eastAsia="Arial" w:hAnsi="Arial"/>
                 <w:b/>
                 <w:bCs/>
+                <w:i w:val="false"/>
+                <w:iCs w:val="false"/>
                 <w:color w:val="1D2021"/>
                 <w:sz w:val="22"/>
                 <w:szCs w:val="22"/>
@@ -260,6 +264,8 @@
                 <w:rFonts w:ascii="Arial" w:cs="Arial" w:eastAsia="Arial" w:hAnsi="Arial"/>
                 <w:b/>
                 <w:bCs/>
+                <w:i w:val="false"/>
+                <w:iCs w:val="false"/>
                 <w:color w:val="1D2021"/>
                 <w:sz w:val="22"/>
                 <w:szCs w:val="22"/>
@@ -334,6 +340,8 @@
                 <w:rFonts w:ascii="Arial" w:cs="Arial" w:eastAsia="Arial" w:hAnsi="Arial"/>
                 <w:b/>
                 <w:bCs/>
+                <w:i w:val="false"/>
+                <w:iCs w:val="false"/>
                 <w:color w:val="1D2021"/>
                 <w:sz w:val="22"/>
                 <w:szCs w:val="22"/>
@@ -408,6 +416,8 @@
                 <w:rFonts w:ascii="Arial" w:cs="Arial" w:eastAsia="Arial" w:hAnsi="Arial"/>
                 <w:b/>
                 <w:bCs/>
+                <w:i w:val="false"/>
+                <w:iCs w:val="false"/>
                 <w:color w:val="1D2021"/>
                 <w:sz w:val="22"/>
                 <w:szCs w:val="22"/>
@@ -482,6 +492,8 @@
                 <w:rFonts w:ascii="Arial" w:cs="Arial" w:eastAsia="Arial" w:hAnsi="Arial"/>
                 <w:b/>
                 <w:bCs/>
+                <w:i w:val="false"/>
+                <w:iCs w:val="false"/>
                 <w:color w:val="1D2021"/>
                 <w:sz w:val="22"/>
                 <w:szCs w:val="22"/>
@@ -508,7 +520,70 @@
           </w:tcPr>
           <w:p>
             <w:pPr>
-              <w:spacing w:before="0" w:after="40" w:line="340" w:beforeAutospacing="false" w:afterAutospacing="false"/>
+              <w:spacing w:before="0" w:after="0" w:line="340" w:beforeAutospacing="false" w:afterAutospacing="false"/>
+              <w:contextualSpacing w:val="false"/>
+            </w:pPr>
+          </w:p>
+        </w:tc>
+      </w:tr>
+      <w:tr>
+        <w:trPr>
+          <w:trHeight w:val="700" w:hRule="atLeast"/>
+        </w:trPr>
+        <w:tc>
+          <w:tcPr>
+            <w:tcBorders>
+              <w:top w:val="single" w:color="C7C7C7" w:sz="4"/>
+              <w:left w:val="nil" w:color="FFFFFF" w:sz="0"/>
+              <w:bottom w:val="single" w:color="C7C7C7" w:sz="4"/>
+              <w:right w:val="nil" w:color="FFFFFF" w:sz="0"/>
+            </w:tcBorders>
+            <w:tcMar>
+              <w:top w:type="dxa" w:w="144"/>
+              <w:left w:type="dxa" w:w="345"/>
+              <w:bottom w:type="dxa" w:w="144"/>
+              <w:right w:type="dxa" w:w="115"/>
+            </w:tcMar>
+            <w:vAlign w:val="center"/>
+          </w:tcPr>
+          <w:p>
+            <w:pPr>
+              <w:spacing w:after="0" w:line="340"/>
+            </w:pPr>
+            <w:r>
+              <w:rPr>
+                <w:rFonts w:ascii="Arial" w:cs="Arial" w:eastAsia="Arial" w:hAnsi="Arial"/>
+                <w:b w:val="false"/>
+                <w:bCs w:val="false"/>
+                <w:i/>
+                <w:iCs/>
+                <w:color w:val="494A4B"/>
+                <w:sz w:val="20"/>
+                <w:szCs w:val="20"/>
+              </w:rPr>
+              <w:t xml:space="preserve">Trade Secrets Duration</w:t>
+            </w:r>
+          </w:p>
+        </w:tc>
+        <w:tc>
+          <w:tcPr>
+            <w:tcBorders>
+              <w:top w:val="single" w:color="C7C7C7" w:sz="4"/>
+              <w:left w:val="nil" w:color="FFFFFF" w:sz="0"/>
+              <w:bottom w:val="single" w:color="C7C7C7" w:sz="4"/>
+              <w:right w:val="nil" w:color="FFFFFF" w:sz="0"/>
+            </w:tcBorders>
+            <w:tcMar>
+              <w:top w:type="dxa" w:w="144"/>
+              <w:left w:type="dxa" w:w="115"/>
+              <w:bottom w:type="dxa" w:w="144"/>
+              <w:right w:type="dxa" w:w="115"/>
+            </w:tcMar>
+            <w:vAlign w:val="center"/>
+          </w:tcPr>
+          <w:p>
+            <w:pPr>
+              <w:spacing w:before="0" w:after="0" w:line="340" w:beforeAutospacing="false" w:afterAutospacing="false"/>
               <w:contextualSpacing w:val="false"/>
             </w:pPr>
             <w:r>
@@ -522,9 +597,66 @@
                 <w:sz w:val="22"/>
                 <w:szCs w:val="22"/>
               </w:rPr>
-              <w:t xml:space="preserve">Trade secrets duration: {confidentiality_trade_secret_duration}</w:t>
-            </w:r>
-          </w:p>
+              <w:t xml:space="preserve">{confidentiality_trade_secret_duration}</w:t>
+            </w:r>
+          </w:p>
+        </w:tc>
+      </w:tr>
+      <w:tr>
+        <w:trPr>
+          <w:trHeight w:val="700" w:hRule="atLeast"/>
+        </w:trPr>
+        <w:tc>
+          <w:tcPr>
+            <w:tcBorders>
+              <w:top w:val="single" w:color="C7C7C7" w:sz="4"/>
+              <w:left w:val="nil" w:color="FFFFFF" w:sz="0"/>
+              <w:bottom w:val="single" w:color="C7C7C7" w:sz="4"/>
+              <w:right w:val="nil" w:color="FFFFFF" w:sz="0"/>
+            </w:tcBorders>
+            <w:tcMar>
+              <w:top w:type="dxa" w:w="144"/>
+              <w:left w:type="dxa" w:w="345"/>
+              <w:bottom w:type="dxa" w:w="144"/>
+              <w:right w:type="dxa" w:w="115"/>
+            </w:tcMar>
+            <w:vAlign w:val="center"/>
+          </w:tcPr>
+          <w:p>
+            <w:pPr>
+              <w:spacing w:after="0" w:line="340"/>
+            </w:pPr>
+            <w:r>
+              <w:rPr>
+                <w:rFonts w:ascii="Arial" w:cs="Arial" w:eastAsia="Arial" w:hAnsi="Arial"/>
+                <w:b w:val="false"/>
+                <w:bCs w:val="false"/>
+                <w:i/>
+                <w:iCs/>
+                <w:color w:val="494A4B"/>
+                <w:sz w:val="20"/>
+                <w:szCs w:val="20"/>
+              </w:rPr>
+              <w:t xml:space="preserve">Other Confidential Information Duration</w:t>
+            </w:r>
+          </w:p>
+        </w:tc>
+        <w:tc>
+          <w:tcPr>
+            <w:tcBorders>
+              <w:top w:val="single" w:color="C7C7C7" w:sz="4"/>
+              <w:left w:val="nil" w:color="FFFFFF" w:sz="0"/>
+              <w:bottom w:val="single" w:color="C7C7C7" w:sz="4"/>
+              <w:right w:val="nil" w:color="FFFFFF" w:sz="0"/>
+            </w:tcBorders>
+            <w:tcMar>
+              <w:top w:type="dxa" w:w="144"/>
+              <w:left w:type="dxa" w:w="115"/>
+              <w:bottom w:type="dxa" w:w="144"/>
+              <w:right w:type="dxa" w:w="115"/>
+            </w:tcMar>
+            <w:vAlign w:val="center"/>
+          </w:tcPr>
           <w:p>
             <w:pPr>
               <w:spacing w:before="0" w:after="0" w:line="340" w:beforeAutospacing="false" w:afterAutospacing="false"/>
@@ -541,8 +673,35 @@
                 <w:sz w:val="22"/>
                 <w:szCs w:val="22"/>
               </w:rPr>
-              <w:t xml:space="preserve">Other </w:t>
-            </w:r>
+              <w:t xml:space="preserve">{confidentiality_other_duration}</w:t>
+            </w:r>
+          </w:p>
+        </w:tc>
+      </w:tr>
+      <w:tr>
+        <w:trPr>
+          <w:trHeight w:val="700" w:hRule="atLeast"/>
+        </w:trPr>
+        <w:tc>
+          <w:tcPr>
+            <w:tcBorders>
+              <w:top w:val="single" w:color="C7C7C7" w:sz="4"/>
+              <w:left w:val="nil" w:color="FFFFFF" w:sz="0"/>
+              <w:bottom w:val="single" w:color="C7C7C7" w:sz="4"/>
+              <w:right w:val="nil" w:color="FFFFFF" w:sz="0"/>
+            </w:tcBorders>
+            <w:tcMar>
+              <w:top w:type="dxa" w:w="144"/>
+              <w:left w:type="dxa" w:w="115"/>
+              <w:bottom w:type="dxa" w:w="144"/>
+              <w:right w:type="dxa" w:w="115"/>
+            </w:tcMar>
+            <w:vAlign w:val="center"/>
+          </w:tcPr>
+          <w:p>
+            <w:pPr>
+              <w:spacing w:after="0" w:line="340"/>
+            </w:pPr>
             <w:r>
               <w:rPr>
                 <w:rFonts w:ascii="Arial" w:cs="Arial" w:eastAsia="Arial" w:hAnsi="Arial"/>
@@ -550,12 +709,98 @@
                 <w:bCs/>
                 <w:i w:val="false"/>
                 <w:iCs w:val="false"/>
-                <w:color w:val="117086"/>
+                <w:color w:val="1D2021"/>
                 <w:sz w:val="22"/>
                 <w:szCs w:val="22"/>
               </w:rPr>
-              <w:t xml:space="preserve">Confidential Information</w:t>
-            </w:r>
+              <w:t xml:space="preserve">Non-Solicitation</w:t>
+            </w:r>
+          </w:p>
+        </w:tc>
+        <w:tc>
+          <w:tcPr>
+            <w:tcBorders>
+              <w:top w:val="single" w:color="C7C7C7" w:sz="4"/>
+              <w:left w:val="nil" w:color="FFFFFF" w:sz="0"/>
+              <w:bottom w:val="single" w:color="C7C7C7" w:sz="4"/>
+              <w:right w:val="nil" w:color="FFFFFF" w:sz="0"/>
+            </w:tcBorders>
+            <w:tcMar>
+              <w:top w:type="dxa" w:w="144"/>
+              <w:left w:type="dxa" w:w="115"/>
+              <w:bottom w:type="dxa" w:w="144"/>
+              <w:right w:type="dxa" w:w="115"/>
+            </w:tcMar>
+            <w:vAlign w:val="center"/>
+          </w:tcPr>
+          <w:p>
+            <w:pPr>
+              <w:spacing w:before="0" w:after="0" w:line="340" w:beforeAutospacing="false" w:afterAutospacing="false"/>
+              <w:contextualSpacing w:val="false"/>
+            </w:pPr>
+          </w:p>
+        </w:tc>
+      </w:tr>
+      <w:tr>
+        <w:trPr>
+          <w:trHeight w:val="700" w:hRule="atLeast"/>
+        </w:trPr>
+        <w:tc>
+          <w:tcPr>
+            <w:tcBorders>
+              <w:top w:val="single" w:color="C7C7C7" w:sz="4"/>
+              <w:left w:val="nil" w:color="FFFFFF" w:sz="0"/>
+              <w:bottom w:val="single" w:color="C7C7C7" w:sz="4"/>
+              <w:right w:val="nil" w:color="FFFFFF" w:sz="0"/>
+            </w:tcBorders>
+            <w:tcMar>
+              <w:top w:type="dxa" w:w="144"/>
+              <w:left w:type="dxa" w:w="345"/>
+              <w:bottom w:type="dxa" w:w="144"/>
+              <w:right w:type="dxa" w:w="115"/>
+            </w:tcMar>
+            <w:vAlign w:val="center"/>
+          </w:tcPr>
+          <w:p>
+            <w:pPr>
+              <w:spacing w:after="0" w:line="340"/>
+            </w:pPr>
+            <w:r>
+              <w:rPr>
+                <w:rFonts w:ascii="Arial" w:cs="Arial" w:eastAsia="Arial" w:hAnsi="Arial"/>
+                <w:b w:val="false"/>
+                <w:bCs w:val="false"/>
+                <w:i/>
+                <w:iCs/>
+                <w:color w:val="494A4B"/>
+                <w:sz w:val="20"/>
+                <w:szCs w:val="20"/>
+              </w:rPr>
+              <w:t xml:space="preserve">{IF employee_nonsolicit_included}Employee Duration</w:t>
+            </w:r>
+          </w:p>
+        </w:tc>
+        <w:tc>
+          <w:tcPr>
+            <w:tcBorders>
+              <w:top w:val="single" w:color="C7C7C7" w:sz="4"/>
+              <w:left w:val="nil" w:color="FFFFFF" w:sz="0"/>
+              <w:bottom w:val="single" w:color="C7C7C7" w:sz="4"/>
+              <w:right w:val="nil" w:color="FFFFFF" w:sz="0"/>
+            </w:tcBorders>
+            <w:tcMar>
+              <w:top w:type="dxa" w:w="144"/>
+              <w:left w:type="dxa" w:w="115"/>
+              <w:bottom w:type="dxa" w:w="144"/>
+              <w:right w:type="dxa" w:w="115"/>
+            </w:tcMar>
+            <w:vAlign w:val="center"/>
+          </w:tcPr>
+          <w:p>
+            <w:pPr>
+              <w:spacing w:before="0" w:after="0" w:line="340" w:beforeAutospacing="false" w:afterAutospacing="false"/>
+              <w:contextualSpacing w:val="false"/>
+            </w:pPr>
             <w:r>
               <w:rPr>
                 <w:rFonts w:ascii="Arial" w:cs="Arial" w:eastAsia="Arial" w:hAnsi="Arial"/>
@@ -567,7 +812,7 @@
                 <w:sz w:val="22"/>
                 <w:szCs w:val="22"/>
               </w:rPr>
-              <w:t xml:space="preserve"> duration: {confidentiality_other_duration}</w:t>
+              <w:t xml:space="preserve">{employee_nonsolicit_duration}{END-IF}</w:t>
             </w:r>
           </w:p>
         </w:tc>
@@ -586,7 +831,7 @@
             </w:tcBorders>
             <w:tcMar>
               <w:top w:type="dxa" w:w="144"/>
-              <w:left w:type="dxa" w:w="115"/>
+              <w:left w:type="dxa" w:w="345"/>
               <w:bottom w:type="dxa" w:w="144"/>
               <w:right w:type="dxa" w:w="115"/>
             </w:tcMar>
@@ -599,13 +844,15 @@
             <w:r>
               <w:rPr>
                 <w:rFonts w:ascii="Arial" w:cs="Arial" w:eastAsia="Arial" w:hAnsi="Arial"/>
-                <w:b/>
-                <w:bCs/>
-                <w:color w:val="1D2021"/>
-                <w:sz w:val="22"/>
-                <w:szCs w:val="22"/>
-              </w:rPr>
-              <w:t xml:space="preserve">{IF employee_nonsolicit_included}Employee Non-Solicitation</w:t>
+                <w:b w:val="false"/>
+                <w:bCs w:val="false"/>
+                <w:i/>
+                <w:iCs/>
+                <w:color w:val="494A4B"/>
+                <w:sz w:val="20"/>
+                <w:szCs w:val="20"/>
+              </w:rPr>
+              <w:t xml:space="preserve">{IF customer_nonsolicit_included}Customer Duration</w:t>
             </w:r>
           </w:p>
         </w:tc>
@@ -641,7 +888,7 @@
                 <w:sz w:val="22"/>
                 <w:szCs w:val="22"/>
               </w:rPr>
-              <w:t xml:space="preserve">Duration: {employee_nonsolicit_duration}{END-IF}</w:t>
+              <w:t xml:space="preserve">{customer_nonsolicit_duration}{END-IF}</w:t>
             </w:r>
           </w:p>
         </w:tc>
@@ -675,11 +922,13 @@
                 <w:rFonts w:ascii="Arial" w:cs="Arial" w:eastAsia="Arial" w:hAnsi="Arial"/>
                 <w:b/>
                 <w:bCs/>
+                <w:i w:val="false"/>
+                <w:iCs w:val="false"/>
                 <w:color w:val="1D2021"/>
                 <w:sz w:val="22"/>
                 <w:szCs w:val="22"/>
               </w:rPr>
-              <w:t xml:space="preserve">{IF customer_nonsolicit_included}Customer Non-Solicitation</w:t>
+              <w:t xml:space="preserve">{IF noncompete_included}Non-Competition</w:t>
             </w:r>
           </w:p>
         </w:tc>
@@ -715,7 +964,7 @@
                 <w:sz w:val="22"/>
                 <w:szCs w:val="22"/>
               </w:rPr>
-              <w:t xml:space="preserve">Duration: {customer_nonsolicit_duration}{END-IF}</w:t>
+              <w:t xml:space="preserve">{END-IF}</w:t>
             </w:r>
           </w:p>
         </w:tc>
@@ -734,7 +983,7 @@
             </w:tcBorders>
             <w:tcMar>
               <w:top w:type="dxa" w:w="144"/>
-              <w:left w:type="dxa" w:w="115"/>
+              <w:left w:type="dxa" w:w="345"/>
               <w:bottom w:type="dxa" w:w="144"/>
               <w:right w:type="dxa" w:w="115"/>
             </w:tcMar>
@@ -747,13 +996,15 @@
             <w:r>
               <w:rPr>
                 <w:rFonts w:ascii="Arial" w:cs="Arial" w:eastAsia="Arial" w:hAnsi="Arial"/>
-                <w:b/>
-                <w:bCs/>
-                <w:color w:val="1D2021"/>
-                <w:sz w:val="22"/>
-                <w:szCs w:val="22"/>
-              </w:rPr>
-              <w:t xml:space="preserve">{IF noncompete_included}Non-Competition</w:t>
+                <w:b w:val="false"/>
+                <w:bCs w:val="false"/>
+                <w:i/>
+                <w:iCs/>
+                <w:color w:val="494A4B"/>
+                <w:sz w:val="20"/>
+                <w:szCs w:val="20"/>
+              </w:rPr>
+              <w:t xml:space="preserve">{IF noncompete_included}Duration</w:t>
             </w:r>
           </w:p>
         </w:tc>
@@ -775,7 +1026,7 @@
           </w:tcPr>
           <w:p>
             <w:pPr>
-              <w:spacing w:before="0" w:after="40" w:line="340" w:beforeAutospacing="false" w:afterAutospacing="false"/>
+              <w:spacing w:before="0" w:after="0" w:line="340" w:beforeAutospacing="false" w:afterAutospacing="false"/>
               <w:contextualSpacing w:val="false"/>
             </w:pPr>
             <w:r>
@@ -789,12 +1040,69 @@
                 <w:sz w:val="22"/>
                 <w:szCs w:val="22"/>
               </w:rPr>
-              <w:t xml:space="preserve">Duration: {noncompete_duration}</w:t>
-            </w:r>
-          </w:p>
-          <w:p>
-            <w:pPr>
-              <w:spacing w:before="0" w:after="40" w:line="340" w:beforeAutospacing="false" w:afterAutospacing="false"/>
+              <w:t xml:space="preserve">{noncompete_duration}{END-IF}</w:t>
+            </w:r>
+          </w:p>
+        </w:tc>
+      </w:tr>
+      <w:tr>
+        <w:trPr>
+          <w:trHeight w:val="700" w:hRule="atLeast"/>
+        </w:trPr>
+        <w:tc>
+          <w:tcPr>
+            <w:tcBorders>
+              <w:top w:val="single" w:color="C7C7C7" w:sz="4"/>
+              <w:left w:val="nil" w:color="FFFFFF" w:sz="0"/>
+              <w:bottom w:val="single" w:color="C7C7C7" w:sz="4"/>
+              <w:right w:val="nil" w:color="FFFFFF" w:sz="0"/>
+            </w:tcBorders>
+            <w:tcMar>
+              <w:top w:type="dxa" w:w="144"/>
+              <w:left w:type="dxa" w:w="345"/>
+              <w:bottom w:type="dxa" w:w="144"/>
+              <w:right w:type="dxa" w:w="115"/>
+            </w:tcMar>
+            <w:vAlign w:val="center"/>
+          </w:tcPr>
+          <w:p>
+            <w:pPr>
+              <w:spacing w:after="0" w:line="340"/>
+            </w:pPr>
+            <w:r>
+              <w:rPr>
+                <w:rFonts w:ascii="Arial" w:cs="Arial" w:eastAsia="Arial" w:hAnsi="Arial"/>
+                <w:b w:val="false"/>
+                <w:bCs w:val="false"/>
+                <w:i/>
+                <w:iCs/>
+                <w:color w:val="494A4B"/>
+                <w:sz w:val="20"/>
+                <w:szCs w:val="20"/>
+              </w:rPr>
+              <w:t xml:space="preserve">{IF noncompete_included}Restricted Territory</w:t>
+            </w:r>
+          </w:p>
+        </w:tc>
+        <w:tc>
+          <w:tcPr>
+            <w:tcBorders>
+              <w:top w:val="single" w:color="C7C7C7" w:sz="4"/>
+              <w:left w:val="nil" w:color="FFFFFF" w:sz="0"/>
+              <w:bottom w:val="single" w:color="C7C7C7" w:sz="4"/>
+              <w:right w:val="nil" w:color="FFFFFF" w:sz="0"/>
+            </w:tcBorders>
+            <w:tcMar>
+              <w:top w:type="dxa" w:w="144"/>
+              <w:left w:type="dxa" w:w="115"/>
+              <w:bottom w:type="dxa" w:w="144"/>
+              <w:right w:type="dxa" w:w="115"/>
+            </w:tcMar>
+            <w:vAlign w:val="center"/>
+          </w:tcPr>
+          <w:p>
+            <w:pPr>
+              <w:spacing w:before="0" w:after="0" w:line="340" w:beforeAutospacing="false" w:afterAutospacing="false"/>
               <w:contextualSpacing w:val="false"/>
             </w:pPr>
             <w:r>
@@ -808,9 +1116,66 @@
                 <w:sz w:val="22"/>
                 <w:szCs w:val="22"/>
               </w:rPr>
-              <w:t xml:space="preserve">Restricted Territory: {territory}</w:t>
-            </w:r>
-          </w:p>
+              <w:t xml:space="preserve">{territory}{END-IF}</w:t>
+            </w:r>
+          </w:p>
+        </w:tc>
+      </w:tr>
+      <w:tr>
+        <w:trPr>
+          <w:trHeight w:val="700" w:hRule="atLeast"/>
+        </w:trPr>
+        <w:tc>
+          <w:tcPr>
+            <w:tcBorders>
+              <w:top w:val="single" w:color="C7C7C7" w:sz="4"/>
+              <w:left w:val="nil" w:color="FFFFFF" w:sz="0"/>
+              <w:bottom w:val="single" w:color="C7C7C7" w:sz="4"/>
+              <w:right w:val="nil" w:color="FFFFFF" w:sz="0"/>
+            </w:tcBorders>
+            <w:tcMar>
+              <w:top w:type="dxa" w:w="144"/>
+              <w:left w:type="dxa" w:w="345"/>
+              <w:bottom w:type="dxa" w:w="144"/>
+              <w:right w:type="dxa" w:w="115"/>
+            </w:tcMar>
+            <w:vAlign w:val="center"/>
+          </w:tcPr>
+          <w:p>
+            <w:pPr>
+              <w:spacing w:after="0" w:line="340"/>
+            </w:pPr>
+            <w:r>
+              <w:rPr>
+                <w:rFonts w:ascii="Arial" w:cs="Arial" w:eastAsia="Arial" w:hAnsi="Arial"/>
+                <w:b w:val="false"/>
+                <w:bCs w:val="false"/>
+                <w:i/>
+                <w:iCs/>
+                <w:color w:val="494A4B"/>
+                <w:sz w:val="20"/>
+                <w:szCs w:val="20"/>
+              </w:rPr>
+              <w:t xml:space="preserve">{IF noncompete_included}Competitive Business</w:t>
+            </w:r>
+          </w:p>
+        </w:tc>
+        <w:tc>
+          <w:tcPr>
+            <w:tcBorders>
+              <w:top w:val="single" w:color="C7C7C7" w:sz="4"/>
+              <w:left w:val="nil" w:color="FFFFFF" w:sz="0"/>
+              <w:bottom w:val="single" w:color="C7C7C7" w:sz="4"/>
+              <w:right w:val="nil" w:color="FFFFFF" w:sz="0"/>
+            </w:tcBorders>
+            <w:tcMar>
+              <w:top w:type="dxa" w:w="144"/>
+              <w:left w:type="dxa" w:w="115"/>
+              <w:bottom w:type="dxa" w:w="144"/>
+              <w:right w:type="dxa" w:w="115"/>
+            </w:tcMar>
+            <w:vAlign w:val="center"/>
+          </w:tcPr>
           <w:p>
             <w:pPr>
               <w:spacing w:before="0" w:after="0" w:line="340" w:beforeAutospacing="false" w:afterAutospacing="false"/>
@@ -827,7 +1192,7 @@
                 <w:sz w:val="22"/>
                 <w:szCs w:val="22"/>
               </w:rPr>
-              <w:t xml:space="preserve">Competitive Business: {competitive_business_definition}{END-IF}</w:t>
+              <w:t xml:space="preserve">{competitive_business_definition}{END-IF}</w:t>
             </w:r>
           </w:p>
         </w:tc>
@@ -846,7 +1211,7 @@
             </w:tcBorders>
             <w:tcMar>
               <w:top w:type="dxa" w:w="144"/>
-              <w:left w:type="dxa" w:w="115"/>
+              <w:left w:type="dxa" w:w="345"/>
               <w:bottom w:type="dxa" w:w="144"/>
               <w:right w:type="dxa" w:w="115"/>
             </w:tcMar>
@@ -859,11 +1224,13 @@
             <w:r>
               <w:rPr>
                 <w:rFonts w:ascii="Arial" w:cs="Arial" w:eastAsia="Arial" w:hAnsi="Arial"/>
-                <w:b/>
-                <w:bCs/>
-                <w:color w:val="1D2021"/>
-                <w:sz w:val="22"/>
-                <w:szCs w:val="22"/>
+                <w:b w:val="false"/>
+                <w:bCs w:val="false"/>
+                <w:i/>
+                <w:iCs/>
+                <w:color w:val="494A4B"/>
+                <w:sz w:val="20"/>
+                <w:szCs w:val="20"/>
               </w:rPr>
               <w:t xml:space="preserve">{IF noncompete_included}Specified Competitors</w:t>
             </w:r>
@@ -935,6 +1302,8 @@
                 <w:rFonts w:ascii="Arial" w:cs="Arial" w:eastAsia="Arial" w:hAnsi="Arial"/>
                 <w:b/>
                 <w:bCs/>
+                <w:i w:val="false"/>
+                <w:iCs w:val="false"/>
                 <w:color w:val="1D2021"/>
                 <w:sz w:val="22"/>
                 <w:szCs w:val="22"/>
@@ -975,7 +1344,7 @@
                 <w:sz w:val="22"/>
                 <w:szCs w:val="22"/>
               </w:rPr>
-              <w:t xml:space="preserve">Duration: {nondealing_duration}{END-IF}</w:t>
+              <w:t xml:space="preserve">{END-IF}</w:t>
             </w:r>
           </w:p>
         </w:tc>
@@ -994,7 +1363,7 @@
             </w:tcBorders>
             <w:tcMar>
               <w:top w:type="dxa" w:w="144"/>
-              <w:left w:type="dxa" w:w="115"/>
+              <w:left w:type="dxa" w:w="345"/>
               <w:bottom w:type="dxa" w:w="144"/>
               <w:right w:type="dxa" w:w="115"/>
             </w:tcMar>
@@ -1007,13 +1376,15 @@
             <w:r>
               <w:rPr>
                 <w:rFonts w:ascii="Arial" w:cs="Arial" w:eastAsia="Arial" w:hAnsi="Arial"/>
-                <w:b/>
-                <w:bCs/>
-                <w:color w:val="1D2021"/>
-                <w:sz w:val="22"/>
-                <w:szCs w:val="22"/>
-              </w:rPr>
-              <w:t xml:space="preserve">{IF noninvestment_included}Non-Investment</w:t>
+                <w:b w:val="false"/>
+                <w:bCs w:val="false"/>
+                <w:i/>
+                <w:iCs/>
+                <w:color w:val="494A4B"/>
+                <w:sz w:val="20"/>
+                <w:szCs w:val="20"/>
+              </w:rPr>
+              <w:t xml:space="preserve">{IF nondealing_included}Duration</w:t>
             </w:r>
           </w:p>
         </w:tc>
@@ -1049,7 +1420,7 @@
                 <w:sz w:val="22"/>
                 <w:szCs w:val="22"/>
               </w:rPr>
-              <w:t xml:space="preserve">Duration: {noninvestment_duration}{END-IF}</w:t>
+              <w:t xml:space="preserve">{nondealing_duration}{END-IF}</w:t>
             </w:r>
           </w:p>
         </w:tc>
@@ -1083,11 +1454,13 @@
                 <w:rFonts w:ascii="Arial" w:cs="Arial" w:eastAsia="Arial" w:hAnsi="Arial"/>
                 <w:b/>
                 <w:bCs/>
+                <w:i w:val="false"/>
+                <w:iCs w:val="false"/>
                 <w:color w:val="1D2021"/>
                 <w:sz w:val="22"/>
                 <w:szCs w:val="22"/>
               </w:rPr>
-              <w:t xml:space="preserve">Non-Disparagement</w:t>
+              <w:t xml:space="preserve">{IF noninvestment_included}Non-Investment</w:t>
             </w:r>
           </w:p>
         </w:tc>
@@ -1123,7 +1496,222 @@
                 <w:sz w:val="22"/>
                 <w:szCs w:val="22"/>
               </w:rPr>
-              <w:t xml:space="preserve">Duration: {nondisparagement_duration}</w:t>
+              <w:t xml:space="preserve">{END-IF}</w:t>
+            </w:r>
+          </w:p>
+        </w:tc>
+      </w:tr>
+      <w:tr>
+        <w:trPr>
+          <w:trHeight w:val="700" w:hRule="atLeast"/>
+        </w:trPr>
+        <w:tc>
+          <w:tcPr>
+            <w:tcBorders>
+              <w:top w:val="single" w:color="C7C7C7" w:sz="4"/>
+              <w:left w:val="nil" w:color="FFFFFF" w:sz="0"/>
+              <w:bottom w:val="single" w:color="C7C7C7" w:sz="4"/>
+              <w:right w:val="nil" w:color="FFFFFF" w:sz="0"/>
+            </w:tcBorders>
+            <w:tcMar>
+              <w:top w:type="dxa" w:w="144"/>
+              <w:left w:type="dxa" w:w="345"/>
+              <w:bottom w:type="dxa" w:w="144"/>
+              <w:right w:type="dxa" w:w="115"/>
+            </w:tcMar>
+            <w:vAlign w:val="center"/>
+          </w:tcPr>
+          <w:p>
+            <w:pPr>
+              <w:spacing w:after="0" w:line="340"/>
+            </w:pPr>
+            <w:r>
+              <w:rPr>
+                <w:rFonts w:ascii="Arial" w:cs="Arial" w:eastAsia="Arial" w:hAnsi="Arial"/>
+                <w:b w:val="false"/>
+                <w:bCs w:val="false"/>
+                <w:i/>
+                <w:iCs/>
+                <w:color w:val="494A4B"/>
+                <w:sz w:val="20"/>
+                <w:szCs w:val="20"/>
+              </w:rPr>
+              <w:t xml:space="preserve">{IF noninvestment_included}Duration</w:t>
+            </w:r>
+          </w:p>
+        </w:tc>
+        <w:tc>
+          <w:tcPr>
+            <w:tcBorders>
+              <w:top w:val="single" w:color="C7C7C7" w:sz="4"/>
+              <w:left w:val="nil" w:color="FFFFFF" w:sz="0"/>
+              <w:bottom w:val="single" w:color="C7C7C7" w:sz="4"/>
+              <w:right w:val="nil" w:color="FFFFFF" w:sz="0"/>
+            </w:tcBorders>
+            <w:tcMar>
+              <w:top w:type="dxa" w:w="144"/>
+              <w:left w:type="dxa" w:w="115"/>
+              <w:bottom w:type="dxa" w:w="144"/>
+              <w:right w:type="dxa" w:w="115"/>
+            </w:tcMar>
+            <w:vAlign w:val="center"/>
+          </w:tcPr>
+          <w:p>
+            <w:pPr>
+              <w:spacing w:before="0" w:after="0" w:line="340" w:beforeAutospacing="false" w:afterAutospacing="false"/>
+              <w:contextualSpacing w:val="false"/>
+            </w:pPr>
+            <w:r>
+              <w:rPr>
+                <w:rFonts w:ascii="Arial" w:cs="Arial" w:eastAsia="Arial" w:hAnsi="Arial"/>
+                <w:b w:val="false"/>
+                <w:bCs w:val="false"/>
+                <w:i w:val="false"/>
+                <w:iCs w:val="false"/>
+                <w:color w:val="1D2021"/>
+                <w:sz w:val="22"/>
+                <w:szCs w:val="22"/>
+              </w:rPr>
+              <w:t xml:space="preserve">{noninvestment_duration}{END-IF}</w:t>
+            </w:r>
+          </w:p>
+        </w:tc>
+      </w:tr>
+      <w:tr>
+        <w:trPr>
+          <w:trHeight w:val="700" w:hRule="atLeast"/>
+        </w:trPr>
+        <w:tc>
+          <w:tcPr>
+            <w:tcBorders>
+              <w:top w:val="single" w:color="C7C7C7" w:sz="4"/>
+              <w:left w:val="nil" w:color="FFFFFF" w:sz="0"/>
+              <w:bottom w:val="single" w:color="C7C7C7" w:sz="4"/>
+              <w:right w:val="nil" w:color="FFFFFF" w:sz="0"/>
+            </w:tcBorders>
+            <w:tcMar>
+              <w:top w:type="dxa" w:w="144"/>
+              <w:left w:type="dxa" w:w="115"/>
+              <w:bottom w:type="dxa" w:w="144"/>
+              <w:right w:type="dxa" w:w="115"/>
+            </w:tcMar>
+            <w:vAlign w:val="center"/>
+          </w:tcPr>
+          <w:p>
+            <w:pPr>
+              <w:spacing w:after="0" w:line="340"/>
+            </w:pPr>
+            <w:r>
+              <w:rPr>
+                <w:rFonts w:ascii="Arial" w:cs="Arial" w:eastAsia="Arial" w:hAnsi="Arial"/>
+                <w:b/>
+                <w:bCs/>
+                <w:i w:val="false"/>
+                <w:iCs w:val="false"/>
+                <w:color w:val="1D2021"/>
+                <w:sz w:val="22"/>
+                <w:szCs w:val="22"/>
+              </w:rPr>
+              <w:t xml:space="preserve">Non-Disparagement</w:t>
+            </w:r>
+          </w:p>
+        </w:tc>
+        <w:tc>
+          <w:tcPr>
+            <w:tcBorders>
+              <w:top w:val="single" w:color="C7C7C7" w:sz="4"/>
+              <w:left w:val="nil" w:color="FFFFFF" w:sz="0"/>
+              <w:bottom w:val="single" w:color="C7C7C7" w:sz="4"/>
+              <w:right w:val="nil" w:color="FFFFFF" w:sz="0"/>
+            </w:tcBorders>
+            <w:tcMar>
+              <w:top w:type="dxa" w:w="144"/>
+              <w:left w:type="dxa" w:w="115"/>
+              <w:bottom w:type="dxa" w:w="144"/>
+              <w:right w:type="dxa" w:w="115"/>
+            </w:tcMar>
+            <w:vAlign w:val="center"/>
+          </w:tcPr>
+          <w:p>
+            <w:pPr>
+              <w:spacing w:before="0" w:after="0" w:line="340" w:beforeAutospacing="false" w:afterAutospacing="false"/>
+              <w:contextualSpacing w:val="false"/>
+            </w:pPr>
+          </w:p>
+        </w:tc>
+      </w:tr>
+      <w:tr>
+        <w:trPr>
+          <w:trHeight w:val="700" w:hRule="atLeast"/>
+        </w:trPr>
+        <w:tc>
+          <w:tcPr>
+            <w:tcBorders>
+              <w:top w:val="single" w:color="C7C7C7" w:sz="4"/>
+              <w:left w:val="nil" w:color="FFFFFF" w:sz="0"/>
+              <w:bottom w:val="single" w:color="C7C7C7" w:sz="4"/>
+              <w:right w:val="nil" w:color="FFFFFF" w:sz="0"/>
+            </w:tcBorders>
+            <w:tcMar>
+              <w:top w:type="dxa" w:w="144"/>
+              <w:left w:type="dxa" w:w="345"/>
+              <w:bottom w:type="dxa" w:w="144"/>
+              <w:right w:type="dxa" w:w="115"/>
+            </w:tcMar>
+            <w:vAlign w:val="center"/>
+          </w:tcPr>
+          <w:p>
+            <w:pPr>
+              <w:spacing w:after="0" w:line="340"/>
+            </w:pPr>
+            <w:r>
+              <w:rPr>
+                <w:rFonts w:ascii="Arial" w:cs="Arial" w:eastAsia="Arial" w:hAnsi="Arial"/>
+                <w:b w:val="false"/>
+                <w:bCs w:val="false"/>
+                <w:i/>
+                <w:iCs/>
+                <w:color w:val="494A4B"/>
+                <w:sz w:val="20"/>
+                <w:szCs w:val="20"/>
+              </w:rPr>
+              <w:t xml:space="preserve">Duration</w:t>
+            </w:r>
+          </w:p>
+        </w:tc>
+        <w:tc>
+          <w:tcPr>
+            <w:tcBorders>
+              <w:top w:val="single" w:color="C7C7C7" w:sz="4"/>
+              <w:left w:val="nil" w:color="FFFFFF" w:sz="0"/>
+              <w:bottom w:val="single" w:color="C7C7C7" w:sz="4"/>
+              <w:right w:val="nil" w:color="FFFFFF" w:sz="0"/>
+            </w:tcBorders>
+            <w:tcMar>
+              <w:top w:type="dxa" w:w="144"/>
+              <w:left w:type="dxa" w:w="115"/>
+              <w:bottom w:type="dxa" w:w="144"/>
+              <w:right w:type="dxa" w:w="115"/>
+            </w:tcMar>
+            <w:vAlign w:val="center"/>
+          </w:tcPr>
+          <w:p>
+            <w:pPr>
+              <w:spacing w:before="0" w:after="0" w:line="340" w:beforeAutospacing="false" w:afterAutospacing="false"/>
+              <w:contextualSpacing w:val="false"/>
+            </w:pPr>
+            <w:r>
+              <w:rPr>
+                <w:rFonts w:ascii="Arial" w:cs="Arial" w:eastAsia="Arial" w:hAnsi="Arial"/>
+                <w:b w:val="false"/>
+                <w:bCs w:val="false"/>
+                <w:i w:val="false"/>
+                <w:iCs w:val="false"/>
+                <w:color w:val="1D2021"/>
+                <w:sz w:val="22"/>
+                <w:szCs w:val="22"/>
+              </w:rPr>
+              <w:t xml:space="preserve">{nondisparagement_duration}</w:t>
             </w:r>
           </w:p>
         </w:tc>
@@ -1498,6 +2086,42 @@
           <w:szCs w:val="22"/>
         </w:rPr>
         <w:t xml:space="preserve"> means to directly or indirectly contact, approach, induce, encourage, or provide Confidential Information to any person or entity for the purpose of diverting business away from Employer, but does not include responding to general advertisements or unsolicited inquiries not initiated by Employee.</w:t>
+      </w:r>
+    </w:p>
+    <w:p>
+      <w:pPr>
+        <w:pStyle w:val="OAClauseBody"/>
+        <w:spacing w:before="320" w:after="280" w:line="340" w:beforeAutospacing="false" w:afterAutospacing="false"/>
+        <w:contextualSpacing w:val="false"/>
+      </w:pPr>
+      <w:r>
+        <w:rPr>
+          <w:rFonts w:ascii="Arial" w:cs="Arial" w:eastAsia="Arial" w:hAnsi="Arial"/>
+          <w:color w:val="1D2021"/>
+          <w:sz w:val="22"/>
+          <w:szCs w:val="22"/>
+        </w:rPr>
+        <w:t xml:space="preserve">1.10 </w:t>
+      </w:r>
+      <w:r>
+        <w:rPr>
+          <w:rFonts w:ascii="Arial" w:cs="Arial" w:eastAsia="Arial" w:hAnsi="Arial"/>
+          <w:b/>
+          <w:bCs/>
+          <w:color w:val="117086"/>
+          <w:sz w:val="22"/>
+          <w:szCs w:val="22"/>
+        </w:rPr>
+        <w:t xml:space="preserve">“Trade Secrets”</w:t>
+      </w:r>
+      <w:r>
+        <w:rPr>
+          <w:rFonts w:ascii="Arial" w:cs="Arial" w:eastAsia="Arial" w:hAnsi="Arial"/>
+          <w:color w:val="1D2021"/>
+          <w:sz w:val="22"/>
+          <w:szCs w:val="22"/>
+        </w:rPr>
+        <w:t xml:space="preserve"> has the meaning given in Wyo. Stat. § 6-3-501(a)(xi).</w:t>
       </w:r>
     </w:p>
     <w:p>

</xml_diff>

<commit_message>
fix(renderer): add spacing above cover terms group headers
Group header rows (non-sub rows with empty values) now use BOTTOM
vertical alignment with an empty leading paragraph, pushing header
text down to create visual separation between covenant groups.
</commit_message>
<xml_diff>
--- a/content/templates/openagreements-restrictive-covenant-wyoming/template.docx
+++ b/content/templates/openagreements-restrictive-covenant-wyoming/template.docx
@@ -101,7 +101,7 @@
               <w:bottom w:type="dxa" w:w="144"/>
               <w:right w:type="dxa" w:w="115"/>
             </w:tcMar>
-            <w:vAlign w:val="center"/>
+            <w:vAlign w:val="bottom"/>
           </w:tcPr>
           <w:p>
             <w:pPr>
@@ -177,7 +177,7 @@
               <w:bottom w:type="dxa" w:w="144"/>
               <w:right w:type="dxa" w:w="115"/>
             </w:tcMar>
-            <w:vAlign w:val="center"/>
+            <w:vAlign w:val="bottom"/>
           </w:tcPr>
           <w:p>
             <w:pPr>
@@ -253,7 +253,7 @@
               <w:bottom w:type="dxa" w:w="144"/>
               <w:right w:type="dxa" w:w="115"/>
             </w:tcMar>
-            <w:vAlign w:val="center"/>
+            <w:vAlign w:val="bottom"/>
           </w:tcPr>
           <w:p>
             <w:pPr>
@@ -329,7 +329,7 @@
               <w:bottom w:type="dxa" w:w="144"/>
               <w:right w:type="dxa" w:w="115"/>
             </w:tcMar>
-            <w:vAlign w:val="center"/>
+            <w:vAlign w:val="bottom"/>
           </w:tcPr>
           <w:p>
             <w:pPr>
@@ -405,7 +405,7 @@
               <w:bottom w:type="dxa" w:w="144"/>
               <w:right w:type="dxa" w:w="115"/>
             </w:tcMar>
-            <w:vAlign w:val="center"/>
+            <w:vAlign w:val="bottom"/>
           </w:tcPr>
           <w:p>
             <w:pPr>
@@ -481,8 +481,13 @@
               <w:bottom w:type="dxa" w:w="144"/>
               <w:right w:type="dxa" w:w="115"/>
             </w:tcMar>
-            <w:vAlign w:val="center"/>
-          </w:tcPr>
+            <w:vAlign w:val="bottom"/>
+          </w:tcPr>
+          <w:p>
+            <w:pPr>
+              <w:spacing w:after="0" w:line="340"/>
+            </w:pPr>
+          </w:p>
           <w:p>
             <w:pPr>
               <w:spacing w:after="0" w:line="340"/>
@@ -544,7 +549,7 @@
               <w:bottom w:type="dxa" w:w="144"/>
               <w:right w:type="dxa" w:w="115"/>
             </w:tcMar>
-            <w:vAlign w:val="center"/>
+            <w:vAlign w:val="bottom"/>
           </w:tcPr>
           <w:p>
             <w:pPr>
@@ -620,7 +625,7 @@
               <w:bottom w:type="dxa" w:w="144"/>
               <w:right w:type="dxa" w:w="115"/>
             </w:tcMar>
-            <w:vAlign w:val="center"/>
+            <w:vAlign w:val="bottom"/>
           </w:tcPr>
           <w:p>
             <w:pPr>
@@ -696,8 +701,13 @@
               <w:bottom w:type="dxa" w:w="144"/>
               <w:right w:type="dxa" w:w="115"/>
             </w:tcMar>
-            <w:vAlign w:val="center"/>
-          </w:tcPr>
+            <w:vAlign w:val="bottom"/>
+          </w:tcPr>
+          <w:p>
+            <w:pPr>
+              <w:spacing w:after="0" w:line="340"/>
+            </w:pPr>
+          </w:p>
           <w:p>
             <w:pPr>
               <w:spacing w:after="0" w:line="340"/>
@@ -759,7 +769,7 @@
               <w:bottom w:type="dxa" w:w="144"/>
               <w:right w:type="dxa" w:w="115"/>
             </w:tcMar>
-            <w:vAlign w:val="center"/>
+            <w:vAlign w:val="bottom"/>
           </w:tcPr>
           <w:p>
             <w:pPr>
@@ -835,7 +845,7 @@
               <w:bottom w:type="dxa" w:w="144"/>
               <w:right w:type="dxa" w:w="115"/>
             </w:tcMar>
-            <w:vAlign w:val="center"/>
+            <w:vAlign w:val="bottom"/>
           </w:tcPr>
           <w:p>
             <w:pPr>
@@ -911,8 +921,13 @@
               <w:bottom w:type="dxa" w:w="144"/>
               <w:right w:type="dxa" w:w="115"/>
             </w:tcMar>
-            <w:vAlign w:val="center"/>
-          </w:tcPr>
+            <w:vAlign w:val="bottom"/>
+          </w:tcPr>
+          <w:p>
+            <w:pPr>
+              <w:spacing w:after="0" w:line="340"/>
+            </w:pPr>
+          </w:p>
           <w:p>
             <w:pPr>
               <w:spacing w:after="0" w:line="340"/>
@@ -987,7 +1002,7 @@
               <w:bottom w:type="dxa" w:w="144"/>
               <w:right w:type="dxa" w:w="115"/>
             </w:tcMar>
-            <w:vAlign w:val="center"/>
+            <w:vAlign w:val="bottom"/>
           </w:tcPr>
           <w:p>
             <w:pPr>
@@ -1063,7 +1078,7 @@
               <w:bottom w:type="dxa" w:w="144"/>
               <w:right w:type="dxa" w:w="115"/>
             </w:tcMar>
-            <w:vAlign w:val="center"/>
+            <w:vAlign w:val="bottom"/>
           </w:tcPr>
           <w:p>
             <w:pPr>
@@ -1139,7 +1154,7 @@
               <w:bottom w:type="dxa" w:w="144"/>
               <w:right w:type="dxa" w:w="115"/>
             </w:tcMar>
-            <w:vAlign w:val="center"/>
+            <w:vAlign w:val="bottom"/>
           </w:tcPr>
           <w:p>
             <w:pPr>
@@ -1215,7 +1230,7 @@
               <w:bottom w:type="dxa" w:w="144"/>
               <w:right w:type="dxa" w:w="115"/>
             </w:tcMar>
-            <w:vAlign w:val="center"/>
+            <w:vAlign w:val="bottom"/>
           </w:tcPr>
           <w:p>
             <w:pPr>
@@ -1291,8 +1306,13 @@
               <w:bottom w:type="dxa" w:w="144"/>
               <w:right w:type="dxa" w:w="115"/>
             </w:tcMar>
-            <w:vAlign w:val="center"/>
-          </w:tcPr>
+            <w:vAlign w:val="bottom"/>
+          </w:tcPr>
+          <w:p>
+            <w:pPr>
+              <w:spacing w:after="0" w:line="340"/>
+            </w:pPr>
+          </w:p>
           <w:p>
             <w:pPr>
               <w:spacing w:after="0" w:line="340"/>
@@ -1367,7 +1387,7 @@
               <w:bottom w:type="dxa" w:w="144"/>
               <w:right w:type="dxa" w:w="115"/>
             </w:tcMar>
-            <w:vAlign w:val="center"/>
+            <w:vAlign w:val="bottom"/>
           </w:tcPr>
           <w:p>
             <w:pPr>
@@ -1443,8 +1463,13 @@
               <w:bottom w:type="dxa" w:w="144"/>
               <w:right w:type="dxa" w:w="115"/>
             </w:tcMar>
-            <w:vAlign w:val="center"/>
-          </w:tcPr>
+            <w:vAlign w:val="bottom"/>
+          </w:tcPr>
+          <w:p>
+            <w:pPr>
+              <w:spacing w:after="0" w:line="340"/>
+            </w:pPr>
+          </w:p>
           <w:p>
             <w:pPr>
               <w:spacing w:after="0" w:line="340"/>
@@ -1519,7 +1544,7 @@
               <w:bottom w:type="dxa" w:w="144"/>
               <w:right w:type="dxa" w:w="115"/>
             </w:tcMar>
-            <w:vAlign w:val="center"/>
+            <w:vAlign w:val="bottom"/>
           </w:tcPr>
           <w:p>
             <w:pPr>
@@ -1595,8 +1620,13 @@
               <w:bottom w:type="dxa" w:w="144"/>
               <w:right w:type="dxa" w:w="115"/>
             </w:tcMar>
-            <w:vAlign w:val="center"/>
-          </w:tcPr>
+            <w:vAlign w:val="bottom"/>
+          </w:tcPr>
+          <w:p>
+            <w:pPr>
+              <w:spacing w:after="0" w:line="340"/>
+            </w:pPr>
+          </w:p>
           <w:p>
             <w:pPr>
               <w:spacing w:after="0" w:line="340"/>
@@ -1658,7 +1688,7 @@
               <w:bottom w:type="dxa" w:w="144"/>
               <w:right w:type="dxa" w:w="115"/>
             </w:tcMar>
-            <w:vAlign w:val="center"/>
+            <w:vAlign w:val="bottom"/>
           </w:tcPr>
           <w:p>
             <w:pPr>

</xml_diff>

<commit_message>
fix(fill-pipeline): strip empty paragraph artifacts from table cells
After docx-templates processes {IF} conditional tags, empty <w:p>
elements remain in table cells. Extended stripEmptyTableRows to also
remove empty paragraphs from cells that have at least one non-empty
paragraph (Word requires at least one <w:p> per cell).

Also moved {IF} condition tags to separate zero-height paragraphs
in keyLabelCell to prevent inline artifacts, and ensured only group
header rows (not sub-rows) get the spacer paragraph.
</commit_message>
<xml_diff>
--- a/content/templates/openagreements-restrictive-covenant-wyoming/template.docx
+++ b/content/templates/openagreements-restrictive-covenant-wyoming/template.docx
@@ -101,7 +101,7 @@
               <w:bottom w:type="dxa" w:w="144"/>
               <w:right w:type="dxa" w:w="115"/>
             </w:tcMar>
-            <w:vAlign w:val="bottom"/>
+            <w:vAlign w:val="center"/>
           </w:tcPr>
           <w:p>
             <w:pPr>
@@ -177,7 +177,7 @@
               <w:bottom w:type="dxa" w:w="144"/>
               <w:right w:type="dxa" w:w="115"/>
             </w:tcMar>
-            <w:vAlign w:val="bottom"/>
+            <w:vAlign w:val="center"/>
           </w:tcPr>
           <w:p>
             <w:pPr>
@@ -253,8 +253,20 @@
               <w:bottom w:type="dxa" w:w="144"/>
               <w:right w:type="dxa" w:w="115"/>
             </w:tcMar>
-            <w:vAlign w:val="bottom"/>
-          </w:tcPr>
+            <w:vAlign w:val="center"/>
+          </w:tcPr>
+          <w:p>
+            <w:pPr>
+              <w:spacing w:after="0" w:line="0"/>
+            </w:pPr>
+            <w:r>
+              <w:rPr>
+                <w:sz w:val="1"/>
+                <w:szCs w:val="1"/>
+              </w:rPr>
+              <w:t xml:space="preserve">{IF employee_title}</w:t>
+            </w:r>
+          </w:p>
           <w:p>
             <w:pPr>
               <w:spacing w:after="0" w:line="340"/>
@@ -270,7 +282,7 @@
                 <w:sz w:val="22"/>
                 <w:szCs w:val="22"/>
               </w:rPr>
-              <w:t xml:space="preserve">{IF employee_title}Employee Title / Position</w:t>
+              <w:t xml:space="preserve">Employee Title / Position</w:t>
             </w:r>
           </w:p>
         </w:tc>
@@ -329,7 +341,7 @@
               <w:bottom w:type="dxa" w:w="144"/>
               <w:right w:type="dxa" w:w="115"/>
             </w:tcMar>
-            <w:vAlign w:val="bottom"/>
+            <w:vAlign w:val="center"/>
           </w:tcPr>
           <w:p>
             <w:pPr>
@@ -405,7 +417,7 @@
               <w:bottom w:type="dxa" w:w="144"/>
               <w:right w:type="dxa" w:w="115"/>
             </w:tcMar>
-            <w:vAlign w:val="bottom"/>
+            <w:vAlign w:val="center"/>
           </w:tcPr>
           <w:p>
             <w:pPr>
@@ -485,8 +497,15 @@
           </w:tcPr>
           <w:p>
             <w:pPr>
-              <w:spacing w:after="0" w:line="340"/>
-            </w:pPr>
+              <w:spacing w:after="0" w:line="240"/>
+            </w:pPr>
+            <w:r>
+              <w:rPr>
+                <w:sz w:val="22"/>
+                <w:szCs w:val="22"/>
+              </w:rPr>
+              <w:t xml:space="preserve"/>
+            </w:r>
           </w:p>
           <w:p>
             <w:pPr>
@@ -549,7 +568,7 @@
               <w:bottom w:type="dxa" w:w="144"/>
               <w:right w:type="dxa" w:w="115"/>
             </w:tcMar>
-            <w:vAlign w:val="bottom"/>
+            <w:vAlign w:val="center"/>
           </w:tcPr>
           <w:p>
             <w:pPr>
@@ -625,7 +644,7 @@
               <w:bottom w:type="dxa" w:w="144"/>
               <w:right w:type="dxa" w:w="115"/>
             </w:tcMar>
-            <w:vAlign w:val="bottom"/>
+            <w:vAlign w:val="center"/>
           </w:tcPr>
           <w:p>
             <w:pPr>
@@ -705,8 +724,15 @@
           </w:tcPr>
           <w:p>
             <w:pPr>
-              <w:spacing w:after="0" w:line="340"/>
-            </w:pPr>
+              <w:spacing w:after="0" w:line="240"/>
+            </w:pPr>
+            <w:r>
+              <w:rPr>
+                <w:sz w:val="22"/>
+                <w:szCs w:val="22"/>
+              </w:rPr>
+              <w:t xml:space="preserve"/>
+            </w:r>
           </w:p>
           <w:p>
             <w:pPr>
@@ -769,8 +795,20 @@
               <w:bottom w:type="dxa" w:w="144"/>
               <w:right w:type="dxa" w:w="115"/>
             </w:tcMar>
-            <w:vAlign w:val="bottom"/>
-          </w:tcPr>
+            <w:vAlign w:val="center"/>
+          </w:tcPr>
+          <w:p>
+            <w:pPr>
+              <w:spacing w:after="0" w:line="0"/>
+            </w:pPr>
+            <w:r>
+              <w:rPr>
+                <w:sz w:val="1"/>
+                <w:szCs w:val="1"/>
+              </w:rPr>
+              <w:t xml:space="preserve">{IF employee_nonsolicit_included}</w:t>
+            </w:r>
+          </w:p>
           <w:p>
             <w:pPr>
               <w:spacing w:after="0" w:line="340"/>
@@ -786,7 +824,7 @@
                 <w:sz w:val="20"/>
                 <w:szCs w:val="20"/>
               </w:rPr>
-              <w:t xml:space="preserve">{IF employee_nonsolicit_included}Employee Duration</w:t>
+              <w:t xml:space="preserve">Employee Duration</w:t>
             </w:r>
           </w:p>
         </w:tc>
@@ -845,8 +883,20 @@
               <w:bottom w:type="dxa" w:w="144"/>
               <w:right w:type="dxa" w:w="115"/>
             </w:tcMar>
-            <w:vAlign w:val="bottom"/>
-          </w:tcPr>
+            <w:vAlign w:val="center"/>
+          </w:tcPr>
+          <w:p>
+            <w:pPr>
+              <w:spacing w:after="0" w:line="0"/>
+            </w:pPr>
+            <w:r>
+              <w:rPr>
+                <w:sz w:val="1"/>
+                <w:szCs w:val="1"/>
+              </w:rPr>
+              <w:t xml:space="preserve">{IF customer_nonsolicit_included}</w:t>
+            </w:r>
+          </w:p>
           <w:p>
             <w:pPr>
               <w:spacing w:after="0" w:line="340"/>
@@ -862,7 +912,7 @@
                 <w:sz w:val="20"/>
                 <w:szCs w:val="20"/>
               </w:rPr>
-              <w:t xml:space="preserve">{IF customer_nonsolicit_included}Customer Duration</w:t>
+              <w:t xml:space="preserve">Customer Duration</w:t>
             </w:r>
           </w:p>
         </w:tc>
@@ -925,8 +975,27 @@
           </w:tcPr>
           <w:p>
             <w:pPr>
-              <w:spacing w:after="0" w:line="340"/>
-            </w:pPr>
+              <w:spacing w:after="0" w:line="240"/>
+            </w:pPr>
+            <w:r>
+              <w:rPr>
+                <w:sz w:val="22"/>
+                <w:szCs w:val="22"/>
+              </w:rPr>
+              <w:t xml:space="preserve"/>
+            </w:r>
+          </w:p>
+          <w:p>
+            <w:pPr>
+              <w:spacing w:after="0" w:line="0"/>
+            </w:pPr>
+            <w:r>
+              <w:rPr>
+                <w:sz w:val="1"/>
+                <w:szCs w:val="1"/>
+              </w:rPr>
+              <w:t xml:space="preserve">{IF noncompete_included}</w:t>
+            </w:r>
           </w:p>
           <w:p>
             <w:pPr>
@@ -943,7 +1012,7 @@
                 <w:sz w:val="22"/>
                 <w:szCs w:val="22"/>
               </w:rPr>
-              <w:t xml:space="preserve">{IF noncompete_included}Non-Competition</w:t>
+              <w:t xml:space="preserve">Non-Competition</w:t>
             </w:r>
           </w:p>
         </w:tc>
@@ -1002,8 +1071,20 @@
               <w:bottom w:type="dxa" w:w="144"/>
               <w:right w:type="dxa" w:w="115"/>
             </w:tcMar>
-            <w:vAlign w:val="bottom"/>
-          </w:tcPr>
+            <w:vAlign w:val="center"/>
+          </w:tcPr>
+          <w:p>
+            <w:pPr>
+              <w:spacing w:after="0" w:line="0"/>
+            </w:pPr>
+            <w:r>
+              <w:rPr>
+                <w:sz w:val="1"/>
+                <w:szCs w:val="1"/>
+              </w:rPr>
+              <w:t xml:space="preserve">{IF noncompete_included}</w:t>
+            </w:r>
+          </w:p>
           <w:p>
             <w:pPr>
               <w:spacing w:after="0" w:line="340"/>
@@ -1019,7 +1100,7 @@
                 <w:sz w:val="20"/>
                 <w:szCs w:val="20"/>
               </w:rPr>
-              <w:t xml:space="preserve">{IF noncompete_included}Duration</w:t>
+              <w:t xml:space="preserve">Duration</w:t>
             </w:r>
           </w:p>
         </w:tc>
@@ -1078,8 +1159,20 @@
               <w:bottom w:type="dxa" w:w="144"/>
               <w:right w:type="dxa" w:w="115"/>
             </w:tcMar>
-            <w:vAlign w:val="bottom"/>
-          </w:tcPr>
+            <w:vAlign w:val="center"/>
+          </w:tcPr>
+          <w:p>
+            <w:pPr>
+              <w:spacing w:after="0" w:line="0"/>
+            </w:pPr>
+            <w:r>
+              <w:rPr>
+                <w:sz w:val="1"/>
+                <w:szCs w:val="1"/>
+              </w:rPr>
+              <w:t xml:space="preserve">{IF noncompete_included}</w:t>
+            </w:r>
+          </w:p>
           <w:p>
             <w:pPr>
               <w:spacing w:after="0" w:line="340"/>
@@ -1095,7 +1188,7 @@
                 <w:sz w:val="20"/>
                 <w:szCs w:val="20"/>
               </w:rPr>
-              <w:t xml:space="preserve">{IF noncompete_included}Restricted Territory</w:t>
+              <w:t xml:space="preserve">Restricted Territory</w:t>
             </w:r>
           </w:p>
         </w:tc>
@@ -1154,8 +1247,20 @@
               <w:bottom w:type="dxa" w:w="144"/>
               <w:right w:type="dxa" w:w="115"/>
             </w:tcMar>
-            <w:vAlign w:val="bottom"/>
-          </w:tcPr>
+            <w:vAlign w:val="center"/>
+          </w:tcPr>
+          <w:p>
+            <w:pPr>
+              <w:spacing w:after="0" w:line="0"/>
+            </w:pPr>
+            <w:r>
+              <w:rPr>
+                <w:sz w:val="1"/>
+                <w:szCs w:val="1"/>
+              </w:rPr>
+              <w:t xml:space="preserve">{IF noncompete_included}</w:t>
+            </w:r>
+          </w:p>
           <w:p>
             <w:pPr>
               <w:spacing w:after="0" w:line="340"/>
@@ -1171,7 +1276,7 @@
                 <w:sz w:val="20"/>
                 <w:szCs w:val="20"/>
               </w:rPr>
-              <w:t xml:space="preserve">{IF noncompete_included}Competitive Business</w:t>
+              <w:t xml:space="preserve">Competitive Business</w:t>
             </w:r>
           </w:p>
         </w:tc>
@@ -1230,8 +1335,20 @@
               <w:bottom w:type="dxa" w:w="144"/>
               <w:right w:type="dxa" w:w="115"/>
             </w:tcMar>
-            <w:vAlign w:val="bottom"/>
-          </w:tcPr>
+            <w:vAlign w:val="center"/>
+          </w:tcPr>
+          <w:p>
+            <w:pPr>
+              <w:spacing w:after="0" w:line="0"/>
+            </w:pPr>
+            <w:r>
+              <w:rPr>
+                <w:sz w:val="1"/>
+                <w:szCs w:val="1"/>
+              </w:rPr>
+              <w:t xml:space="preserve">{IF noncompete_included}</w:t>
+            </w:r>
+          </w:p>
           <w:p>
             <w:pPr>
               <w:spacing w:after="0" w:line="340"/>
@@ -1247,7 +1364,7 @@
                 <w:sz w:val="20"/>
                 <w:szCs w:val="20"/>
               </w:rPr>
-              <w:t xml:space="preserve">{IF noncompete_included}Specified Competitors</w:t>
+              <w:t xml:space="preserve">Specified Competitors</w:t>
             </w:r>
           </w:p>
         </w:tc>
@@ -1310,8 +1427,27 @@
           </w:tcPr>
           <w:p>
             <w:pPr>
-              <w:spacing w:after="0" w:line="340"/>
-            </w:pPr>
+              <w:spacing w:after="0" w:line="240"/>
+            </w:pPr>
+            <w:r>
+              <w:rPr>
+                <w:sz w:val="22"/>
+                <w:szCs w:val="22"/>
+              </w:rPr>
+              <w:t xml:space="preserve"/>
+            </w:r>
+          </w:p>
+          <w:p>
+            <w:pPr>
+              <w:spacing w:after="0" w:line="0"/>
+            </w:pPr>
+            <w:r>
+              <w:rPr>
+                <w:sz w:val="1"/>
+                <w:szCs w:val="1"/>
+              </w:rPr>
+              <w:t xml:space="preserve">{IF nondealing_included}</w:t>
+            </w:r>
           </w:p>
           <w:p>
             <w:pPr>
@@ -1328,7 +1464,7 @@
                 <w:sz w:val="22"/>
                 <w:szCs w:val="22"/>
               </w:rPr>
-              <w:t xml:space="preserve">{IF nondealing_included}No Business with Covered Customers</w:t>
+              <w:t xml:space="preserve">No Business with Covered Customers</w:t>
             </w:r>
           </w:p>
         </w:tc>
@@ -1387,8 +1523,20 @@
               <w:bottom w:type="dxa" w:w="144"/>
               <w:right w:type="dxa" w:w="115"/>
             </w:tcMar>
-            <w:vAlign w:val="bottom"/>
-          </w:tcPr>
+            <w:vAlign w:val="center"/>
+          </w:tcPr>
+          <w:p>
+            <w:pPr>
+              <w:spacing w:after="0" w:line="0"/>
+            </w:pPr>
+            <w:r>
+              <w:rPr>
+                <w:sz w:val="1"/>
+                <w:szCs w:val="1"/>
+              </w:rPr>
+              <w:t xml:space="preserve">{IF nondealing_included}</w:t>
+            </w:r>
+          </w:p>
           <w:p>
             <w:pPr>
               <w:spacing w:after="0" w:line="340"/>
@@ -1404,7 +1552,7 @@
                 <w:sz w:val="20"/>
                 <w:szCs w:val="20"/>
               </w:rPr>
-              <w:t xml:space="preserve">{IF nondealing_included}Duration</w:t>
+              <w:t xml:space="preserve">Duration</w:t>
             </w:r>
           </w:p>
         </w:tc>
@@ -1467,8 +1615,27 @@
           </w:tcPr>
           <w:p>
             <w:pPr>
-              <w:spacing w:after="0" w:line="340"/>
-            </w:pPr>
+              <w:spacing w:after="0" w:line="240"/>
+            </w:pPr>
+            <w:r>
+              <w:rPr>
+                <w:sz w:val="22"/>
+                <w:szCs w:val="22"/>
+              </w:rPr>
+              <w:t xml:space="preserve"/>
+            </w:r>
+          </w:p>
+          <w:p>
+            <w:pPr>
+              <w:spacing w:after="0" w:line="0"/>
+            </w:pPr>
+            <w:r>
+              <w:rPr>
+                <w:sz w:val="1"/>
+                <w:szCs w:val="1"/>
+              </w:rPr>
+              <w:t xml:space="preserve">{IF noninvestment_included}</w:t>
+            </w:r>
           </w:p>
           <w:p>
             <w:pPr>
@@ -1485,7 +1652,7 @@
                 <w:sz w:val="22"/>
                 <w:szCs w:val="22"/>
               </w:rPr>
-              <w:t xml:space="preserve">{IF noninvestment_included}Non-Investment</w:t>
+              <w:t xml:space="preserve">Non-Investment</w:t>
             </w:r>
           </w:p>
         </w:tc>
@@ -1544,8 +1711,20 @@
               <w:bottom w:type="dxa" w:w="144"/>
               <w:right w:type="dxa" w:w="115"/>
             </w:tcMar>
-            <w:vAlign w:val="bottom"/>
-          </w:tcPr>
+            <w:vAlign w:val="center"/>
+          </w:tcPr>
+          <w:p>
+            <w:pPr>
+              <w:spacing w:after="0" w:line="0"/>
+            </w:pPr>
+            <w:r>
+              <w:rPr>
+                <w:sz w:val="1"/>
+                <w:szCs w:val="1"/>
+              </w:rPr>
+              <w:t xml:space="preserve">{IF noninvestment_included}</w:t>
+            </w:r>
+          </w:p>
           <w:p>
             <w:pPr>
               <w:spacing w:after="0" w:line="340"/>
@@ -1561,7 +1740,7 @@
                 <w:sz w:val="20"/>
                 <w:szCs w:val="20"/>
               </w:rPr>
-              <w:t xml:space="preserve">{IF noninvestment_included}Duration</w:t>
+              <w:t xml:space="preserve">Duration</w:t>
             </w:r>
           </w:p>
         </w:tc>
@@ -1624,8 +1803,15 @@
           </w:tcPr>
           <w:p>
             <w:pPr>
-              <w:spacing w:after="0" w:line="340"/>
-            </w:pPr>
+              <w:spacing w:after="0" w:line="240"/>
+            </w:pPr>
+            <w:r>
+              <w:rPr>
+                <w:sz w:val="22"/>
+                <w:szCs w:val="22"/>
+              </w:rPr>
+              <w:t xml:space="preserve"/>
+            </w:r>
           </w:p>
           <w:p>
             <w:pPr>
@@ -1688,7 +1874,7 @@
               <w:bottom w:type="dxa" w:w="144"/>
               <w:right w:type="dxa" w:w="115"/>
             </w:tcMar>
-            <w:vAlign w:val="bottom"/>
+            <w:vAlign w:val="center"/>
           </w:tcPr>
           <w:p>
             <w:pPr>

</xml_diff>

<commit_message>
fix(renderer): dedup tcPr, split non-solicitation headers, fix spacer margins
- Deduplicate <w:tcPr> elements in post-fill cleanup (docx-templates
  {IF} processing creates duplicates where the first has default
  vAlign:center that overrides our intended vAlign:bottom)
- Split Non-Solicitation group header into separate Employee/Customer
  headers with individual conditions (fixes orphan header when both
  non-solicitations are off)
- Group header inline {IF} for non-sub rows (avoids tcPr corruption),
  separate {IF} paragraph only for sub-rows
- Group header top margin: 200 twips for visual separation
</commit_message>
<xml_diff>
--- a/content/templates/openagreements-restrictive-covenant-wyoming/template.docx
+++ b/content/templates/openagreements-restrictive-covenant-wyoming/template.docx
@@ -257,18 +257,6 @@
           </w:tcPr>
           <w:p>
             <w:pPr>
-              <w:spacing w:after="0" w:line="0"/>
-            </w:pPr>
-            <w:r>
-              <w:rPr>
-                <w:sz w:val="1"/>
-                <w:szCs w:val="1"/>
-              </w:rPr>
-              <w:t xml:space="preserve">{IF employee_title}</w:t>
-            </w:r>
-          </w:p>
-          <w:p>
-            <w:pPr>
               <w:spacing w:after="0" w:line="340"/>
             </w:pPr>
             <w:r>
@@ -282,7 +270,7 @@
                 <w:sz w:val="22"/>
                 <w:szCs w:val="22"/>
               </w:rPr>
-              <w:t xml:space="preserve">Employee Title / Position</w:t>
+              <w:t xml:space="preserve">{IF employee_title}Employee Title / Position</w:t>
             </w:r>
           </w:p>
         </w:tc>
@@ -488,25 +476,13 @@
               <w:right w:val="nil" w:color="FFFFFF" w:sz="0"/>
             </w:tcBorders>
             <w:tcMar>
-              <w:top w:type="dxa" w:w="32"/>
+              <w:top w:type="dxa" w:w="200"/>
               <w:left w:type="dxa" w:w="115"/>
               <w:bottom w:type="dxa" w:w="32"/>
               <w:right w:type="dxa" w:w="115"/>
             </w:tcMar>
             <w:vAlign w:val="bottom"/>
           </w:tcPr>
-          <w:p>
-            <w:pPr>
-              <w:spacing w:after="0" w:line="240"/>
-            </w:pPr>
-            <w:r>
-              <w:rPr>
-                <w:sz w:val="22"/>
-                <w:szCs w:val="22"/>
-              </w:rPr>
-              <w:t xml:space="preserve"/>
-            </w:r>
-          </w:p>
           <w:p>
             <w:pPr>
               <w:spacing w:after="0" w:line="340"/>
@@ -535,7 +511,7 @@
               <w:right w:val="nil" w:color="FFFFFF" w:sz="0"/>
             </w:tcBorders>
             <w:tcMar>
-              <w:top w:type="dxa" w:w="32"/>
+              <w:top w:type="dxa" w:w="200"/>
               <w:left w:type="dxa" w:w="115"/>
               <w:bottom w:type="dxa" w:w="32"/>
               <w:right w:type="dxa" w:w="115"/>
@@ -715,25 +691,13 @@
               <w:right w:val="nil" w:color="FFFFFF" w:sz="0"/>
             </w:tcBorders>
             <w:tcMar>
-              <w:top w:type="dxa" w:w="32"/>
+              <w:top w:type="dxa" w:w="200"/>
               <w:left w:type="dxa" w:w="115"/>
               <w:bottom w:type="dxa" w:w="32"/>
               <w:right w:type="dxa" w:w="115"/>
             </w:tcMar>
             <w:vAlign w:val="bottom"/>
           </w:tcPr>
-          <w:p>
-            <w:pPr>
-              <w:spacing w:after="0" w:line="240"/>
-            </w:pPr>
-            <w:r>
-              <w:rPr>
-                <w:sz w:val="22"/>
-                <w:szCs w:val="22"/>
-              </w:rPr>
-              <w:t xml:space="preserve"/>
-            </w:r>
-          </w:p>
           <w:p>
             <w:pPr>
               <w:spacing w:after="0" w:line="340"/>
@@ -749,20 +713,20 @@
                 <w:sz w:val="22"/>
                 <w:szCs w:val="22"/>
               </w:rPr>
-              <w:t xml:space="preserve">Non-Solicitation</w:t>
-            </w:r>
-          </w:p>
-        </w:tc>
-        <w:tc>
-          <w:tcPr>
-            <w:tcBorders>
-              <w:top w:val="single" w:color="C7C7C7" w:sz="4"/>
-              <w:left w:val="nil" w:color="FFFFFF" w:sz="0"/>
-              <w:bottom w:val="single" w:color="C7C7C7" w:sz="4"/>
-              <w:right w:val="nil" w:color="FFFFFF" w:sz="0"/>
-            </w:tcBorders>
-            <w:tcMar>
-              <w:top w:type="dxa" w:w="32"/>
+              <w:t xml:space="preserve">{IF employee_nonsolicit_included}Employee Non-Solicitation</w:t>
+            </w:r>
+          </w:p>
+        </w:tc>
+        <w:tc>
+          <w:tcPr>
+            <w:tcBorders>
+              <w:top w:val="single" w:color="C7C7C7" w:sz="4"/>
+              <w:left w:val="nil" w:color="FFFFFF" w:sz="0"/>
+              <w:bottom w:val="single" w:color="C7C7C7" w:sz="4"/>
+              <w:right w:val="nil" w:color="FFFFFF" w:sz="0"/>
+            </w:tcBorders>
+            <w:tcMar>
+              <w:top w:type="dxa" w:w="200"/>
               <w:left w:type="dxa" w:w="115"/>
               <w:bottom w:type="dxa" w:w="32"/>
               <w:right w:type="dxa" w:w="115"/>
@@ -774,6 +738,19 @@
               <w:spacing w:before="0" w:after="0" w:line="340" w:beforeAutospacing="false" w:afterAutospacing="false"/>
               <w:contextualSpacing w:val="false"/>
             </w:pPr>
+            <w:r>
+              <w:rPr>
+                <w:rFonts w:ascii="Arial" w:cs="Arial" w:eastAsia="Arial" w:hAnsi="Arial"/>
+                <w:b w:val="false"/>
+                <w:bCs w:val="false"/>
+                <w:i w:val="false"/>
+                <w:iCs w:val="false"/>
+                <w:color w:val="1D2021"/>
+                <w:sz w:val="22"/>
+                <w:szCs w:val="22"/>
+              </w:rPr>
+              <w:t xml:space="preserve">{END-IF}</w:t>
+            </w:r>
           </w:p>
         </w:tc>
       </w:tr>
@@ -824,7 +801,7 @@
                 <w:sz w:val="20"/>
                 <w:szCs w:val="20"/>
               </w:rPr>
-              <w:t xml:space="preserve">Employee Duration</w:t>
+              <w:t xml:space="preserve">Duration</w:t>
             </w:r>
           </w:p>
         </w:tc>
@@ -878,6 +855,82 @@
               <w:right w:val="nil" w:color="FFFFFF" w:sz="0"/>
             </w:tcBorders>
             <w:tcMar>
+              <w:top w:type="dxa" w:w="200"/>
+              <w:left w:type="dxa" w:w="115"/>
+              <w:bottom w:type="dxa" w:w="32"/>
+              <w:right w:type="dxa" w:w="115"/>
+            </w:tcMar>
+            <w:vAlign w:val="bottom"/>
+          </w:tcPr>
+          <w:p>
+            <w:pPr>
+              <w:spacing w:after="0" w:line="340"/>
+            </w:pPr>
+            <w:r>
+              <w:rPr>
+                <w:rFonts w:ascii="Arial" w:cs="Arial" w:eastAsia="Arial" w:hAnsi="Arial"/>
+                <w:b/>
+                <w:bCs/>
+                <w:i w:val="false"/>
+                <w:iCs w:val="false"/>
+                <w:color w:val="1D2021"/>
+                <w:sz w:val="22"/>
+                <w:szCs w:val="22"/>
+              </w:rPr>
+              <w:t xml:space="preserve">{IF customer_nonsolicit_included}Customer Non-Solicitation</w:t>
+            </w:r>
+          </w:p>
+        </w:tc>
+        <w:tc>
+          <w:tcPr>
+            <w:tcBorders>
+              <w:top w:val="single" w:color="C7C7C7" w:sz="4"/>
+              <w:left w:val="nil" w:color="FFFFFF" w:sz="0"/>
+              <w:bottom w:val="single" w:color="C7C7C7" w:sz="4"/>
+              <w:right w:val="nil" w:color="FFFFFF" w:sz="0"/>
+            </w:tcBorders>
+            <w:tcMar>
+              <w:top w:type="dxa" w:w="200"/>
+              <w:left w:type="dxa" w:w="115"/>
+              <w:bottom w:type="dxa" w:w="32"/>
+              <w:right w:type="dxa" w:w="115"/>
+            </w:tcMar>
+            <w:vAlign w:val="center"/>
+          </w:tcPr>
+          <w:p>
+            <w:pPr>
+              <w:spacing w:before="0" w:after="0" w:line="340" w:beforeAutospacing="false" w:afterAutospacing="false"/>
+              <w:contextualSpacing w:val="false"/>
+            </w:pPr>
+            <w:r>
+              <w:rPr>
+                <w:rFonts w:ascii="Arial" w:cs="Arial" w:eastAsia="Arial" w:hAnsi="Arial"/>
+                <w:b w:val="false"/>
+                <w:bCs w:val="false"/>
+                <w:i w:val="false"/>
+                <w:iCs w:val="false"/>
+                <w:color w:val="1D2021"/>
+                <w:sz w:val="22"/>
+                <w:szCs w:val="22"/>
+              </w:rPr>
+              <w:t xml:space="preserve">{END-IF}</w:t>
+            </w:r>
+          </w:p>
+        </w:tc>
+      </w:tr>
+      <w:tr>
+        <w:trPr>
+          <w:trHeight w:val="403" w:hRule="atLeast"/>
+        </w:trPr>
+        <w:tc>
+          <w:tcPr>
+            <w:tcBorders>
+              <w:top w:val="single" w:color="C7C7C7" w:sz="4"/>
+              <w:left w:val="nil" w:color="FFFFFF" w:sz="0"/>
+              <w:bottom w:val="single" w:color="C7C7C7" w:sz="4"/>
+              <w:right w:val="nil" w:color="FFFFFF" w:sz="0"/>
+            </w:tcBorders>
+            <w:tcMar>
               <w:top w:type="dxa" w:w="32"/>
               <w:left w:type="dxa" w:w="345"/>
               <w:bottom w:type="dxa" w:w="32"/>
@@ -912,7 +965,7 @@
                 <w:sz w:val="20"/>
                 <w:szCs w:val="20"/>
               </w:rPr>
-              <w:t xml:space="preserve">Customer Duration</w:t>
+              <w:t xml:space="preserve">Duration</w:t>
             </w:r>
           </w:p>
         </w:tc>
@@ -966,37 +1019,13 @@
               <w:right w:val="nil" w:color="FFFFFF" w:sz="0"/>
             </w:tcBorders>
             <w:tcMar>
-              <w:top w:type="dxa" w:w="32"/>
+              <w:top w:type="dxa" w:w="200"/>
               <w:left w:type="dxa" w:w="115"/>
               <w:bottom w:type="dxa" w:w="32"/>
               <w:right w:type="dxa" w:w="115"/>
             </w:tcMar>
             <w:vAlign w:val="bottom"/>
           </w:tcPr>
-          <w:p>
-            <w:pPr>
-              <w:spacing w:after="0" w:line="240"/>
-            </w:pPr>
-            <w:r>
-              <w:rPr>
-                <w:sz w:val="22"/>
-                <w:szCs w:val="22"/>
-              </w:rPr>
-              <w:t xml:space="preserve"/>
-            </w:r>
-          </w:p>
-          <w:p>
-            <w:pPr>
-              <w:spacing w:after="0" w:line="0"/>
-            </w:pPr>
-            <w:r>
-              <w:rPr>
-                <w:sz w:val="1"/>
-                <w:szCs w:val="1"/>
-              </w:rPr>
-              <w:t xml:space="preserve">{IF noncompete_included}</w:t>
-            </w:r>
-          </w:p>
           <w:p>
             <w:pPr>
               <w:spacing w:after="0" w:line="340"/>
@@ -1012,20 +1041,20 @@
                 <w:sz w:val="22"/>
                 <w:szCs w:val="22"/>
               </w:rPr>
-              <w:t xml:space="preserve">Non-Competition</w:t>
-            </w:r>
-          </w:p>
-        </w:tc>
-        <w:tc>
-          <w:tcPr>
-            <w:tcBorders>
-              <w:top w:val="single" w:color="C7C7C7" w:sz="4"/>
-              <w:left w:val="nil" w:color="FFFFFF" w:sz="0"/>
-              <w:bottom w:val="single" w:color="C7C7C7" w:sz="4"/>
-              <w:right w:val="nil" w:color="FFFFFF" w:sz="0"/>
-            </w:tcBorders>
-            <w:tcMar>
-              <w:top w:type="dxa" w:w="32"/>
+              <w:t xml:space="preserve">{IF noncompete_included}Non-Competition</w:t>
+            </w:r>
+          </w:p>
+        </w:tc>
+        <w:tc>
+          <w:tcPr>
+            <w:tcBorders>
+              <w:top w:val="single" w:color="C7C7C7" w:sz="4"/>
+              <w:left w:val="nil" w:color="FFFFFF" w:sz="0"/>
+              <w:bottom w:val="single" w:color="C7C7C7" w:sz="4"/>
+              <w:right w:val="nil" w:color="FFFFFF" w:sz="0"/>
+            </w:tcBorders>
+            <w:tcMar>
+              <w:top w:type="dxa" w:w="200"/>
               <w:left w:type="dxa" w:w="115"/>
               <w:bottom w:type="dxa" w:w="32"/>
               <w:right w:type="dxa" w:w="115"/>
@@ -1418,37 +1447,13 @@
               <w:right w:val="nil" w:color="FFFFFF" w:sz="0"/>
             </w:tcBorders>
             <w:tcMar>
-              <w:top w:type="dxa" w:w="32"/>
+              <w:top w:type="dxa" w:w="200"/>
               <w:left w:type="dxa" w:w="115"/>
               <w:bottom w:type="dxa" w:w="32"/>
               <w:right w:type="dxa" w:w="115"/>
             </w:tcMar>
             <w:vAlign w:val="bottom"/>
           </w:tcPr>
-          <w:p>
-            <w:pPr>
-              <w:spacing w:after="0" w:line="240"/>
-            </w:pPr>
-            <w:r>
-              <w:rPr>
-                <w:sz w:val="22"/>
-                <w:szCs w:val="22"/>
-              </w:rPr>
-              <w:t xml:space="preserve"/>
-            </w:r>
-          </w:p>
-          <w:p>
-            <w:pPr>
-              <w:spacing w:after="0" w:line="0"/>
-            </w:pPr>
-            <w:r>
-              <w:rPr>
-                <w:sz w:val="1"/>
-                <w:szCs w:val="1"/>
-              </w:rPr>
-              <w:t xml:space="preserve">{IF nondealing_included}</w:t>
-            </w:r>
-          </w:p>
           <w:p>
             <w:pPr>
               <w:spacing w:after="0" w:line="340"/>
@@ -1464,20 +1469,20 @@
                 <w:sz w:val="22"/>
                 <w:szCs w:val="22"/>
               </w:rPr>
-              <w:t xml:space="preserve">No Business with Covered Customers</w:t>
-            </w:r>
-          </w:p>
-        </w:tc>
-        <w:tc>
-          <w:tcPr>
-            <w:tcBorders>
-              <w:top w:val="single" w:color="C7C7C7" w:sz="4"/>
-              <w:left w:val="nil" w:color="FFFFFF" w:sz="0"/>
-              <w:bottom w:val="single" w:color="C7C7C7" w:sz="4"/>
-              <w:right w:val="nil" w:color="FFFFFF" w:sz="0"/>
-            </w:tcBorders>
-            <w:tcMar>
-              <w:top w:type="dxa" w:w="32"/>
+              <w:t xml:space="preserve">{IF nondealing_included}No Business with Covered Customers</w:t>
+            </w:r>
+          </w:p>
+        </w:tc>
+        <w:tc>
+          <w:tcPr>
+            <w:tcBorders>
+              <w:top w:val="single" w:color="C7C7C7" w:sz="4"/>
+              <w:left w:val="nil" w:color="FFFFFF" w:sz="0"/>
+              <w:bottom w:val="single" w:color="C7C7C7" w:sz="4"/>
+              <w:right w:val="nil" w:color="FFFFFF" w:sz="0"/>
+            </w:tcBorders>
+            <w:tcMar>
+              <w:top w:type="dxa" w:w="200"/>
               <w:left w:type="dxa" w:w="115"/>
               <w:bottom w:type="dxa" w:w="32"/>
               <w:right w:type="dxa" w:w="115"/>
@@ -1606,37 +1611,13 @@
               <w:right w:val="nil" w:color="FFFFFF" w:sz="0"/>
             </w:tcBorders>
             <w:tcMar>
-              <w:top w:type="dxa" w:w="32"/>
+              <w:top w:type="dxa" w:w="200"/>
               <w:left w:type="dxa" w:w="115"/>
               <w:bottom w:type="dxa" w:w="32"/>
               <w:right w:type="dxa" w:w="115"/>
             </w:tcMar>
             <w:vAlign w:val="bottom"/>
           </w:tcPr>
-          <w:p>
-            <w:pPr>
-              <w:spacing w:after="0" w:line="240"/>
-            </w:pPr>
-            <w:r>
-              <w:rPr>
-                <w:sz w:val="22"/>
-                <w:szCs w:val="22"/>
-              </w:rPr>
-              <w:t xml:space="preserve"/>
-            </w:r>
-          </w:p>
-          <w:p>
-            <w:pPr>
-              <w:spacing w:after="0" w:line="0"/>
-            </w:pPr>
-            <w:r>
-              <w:rPr>
-                <w:sz w:val="1"/>
-                <w:szCs w:val="1"/>
-              </w:rPr>
-              <w:t xml:space="preserve">{IF noninvestment_included}</w:t>
-            </w:r>
-          </w:p>
           <w:p>
             <w:pPr>
               <w:spacing w:after="0" w:line="340"/>
@@ -1652,20 +1633,20 @@
                 <w:sz w:val="22"/>
                 <w:szCs w:val="22"/>
               </w:rPr>
-              <w:t xml:space="preserve">Non-Investment</w:t>
-            </w:r>
-          </w:p>
-        </w:tc>
-        <w:tc>
-          <w:tcPr>
-            <w:tcBorders>
-              <w:top w:val="single" w:color="C7C7C7" w:sz="4"/>
-              <w:left w:val="nil" w:color="FFFFFF" w:sz="0"/>
-              <w:bottom w:val="single" w:color="C7C7C7" w:sz="4"/>
-              <w:right w:val="nil" w:color="FFFFFF" w:sz="0"/>
-            </w:tcBorders>
-            <w:tcMar>
-              <w:top w:type="dxa" w:w="32"/>
+              <w:t xml:space="preserve">{IF noninvestment_included}Non-Investment</w:t>
+            </w:r>
+          </w:p>
+        </w:tc>
+        <w:tc>
+          <w:tcPr>
+            <w:tcBorders>
+              <w:top w:val="single" w:color="C7C7C7" w:sz="4"/>
+              <w:left w:val="nil" w:color="FFFFFF" w:sz="0"/>
+              <w:bottom w:val="single" w:color="C7C7C7" w:sz="4"/>
+              <w:right w:val="nil" w:color="FFFFFF" w:sz="0"/>
+            </w:tcBorders>
+            <w:tcMar>
+              <w:top w:type="dxa" w:w="200"/>
               <w:left w:type="dxa" w:w="115"/>
               <w:bottom w:type="dxa" w:w="32"/>
               <w:right w:type="dxa" w:w="115"/>
@@ -1794,25 +1775,13 @@
               <w:right w:val="nil" w:color="FFFFFF" w:sz="0"/>
             </w:tcBorders>
             <w:tcMar>
-              <w:top w:type="dxa" w:w="32"/>
+              <w:top w:type="dxa" w:w="200"/>
               <w:left w:type="dxa" w:w="115"/>
               <w:bottom w:type="dxa" w:w="32"/>
               <w:right w:type="dxa" w:w="115"/>
             </w:tcMar>
             <w:vAlign w:val="bottom"/>
           </w:tcPr>
-          <w:p>
-            <w:pPr>
-              <w:spacing w:after="0" w:line="240"/>
-            </w:pPr>
-            <w:r>
-              <w:rPr>
-                <w:sz w:val="22"/>
-                <w:szCs w:val="22"/>
-              </w:rPr>
-              <w:t xml:space="preserve"/>
-            </w:r>
-          </w:p>
           <w:p>
             <w:pPr>
               <w:spacing w:after="0" w:line="340"/>
@@ -1841,7 +1810,7 @@
               <w:right w:val="nil" w:color="FFFFFF" w:sz="0"/>
             </w:tcBorders>
             <w:tcMar>
-              <w:top w:type="dxa" w:w="32"/>
+              <w:top w:type="dxa" w:w="200"/>
               <w:left w:type="dxa" w:w="115"/>
               <w:bottom w:type="dxa" w:w="32"/>
               <w:right w:type="dxa" w:w="115"/>

</xml_diff>

<commit_message>
refactor(wyoming-rc): inline governing law instead of defined term
Wyoming is already hard-coded in statutory citations (§ 1-23-108,
§ 6-3-501), template ID, and practice note. A "Governing Law" defined
term only partially abstracts the state — the abstraction is leaky.

Inline "the laws of the State of Wyoming" directly in the governing
law clause. Remove the Governing Law row from Cover Terms.
</commit_message>
<xml_diff>
--- a/content/templates/openagreements-restrictive-covenant-wyoming/template.docx
+++ b/content/templates/openagreements-restrictive-covenant-wyoming/template.docx
@@ -389,82 +389,6 @@
       </w:tr>
       <w:tr>
         <w:trPr>
-          <w:trHeight w:val="317" w:hRule="atLeast"/>
-        </w:trPr>
-        <w:tc>
-          <w:tcPr>
-            <w:tcBorders>
-              <w:top w:val="single" w:color="C7C7C7" w:sz="4"/>
-              <w:left w:val="nil" w:color="FFFFFF" w:sz="0"/>
-              <w:bottom w:val="single" w:color="C7C7C7" w:sz="4"/>
-              <w:right w:val="nil" w:color="FFFFFF" w:sz="0"/>
-            </w:tcBorders>
-            <w:tcMar>
-              <w:top w:type="dxa" w:w="80"/>
-              <w:left w:type="dxa" w:w="115"/>
-              <w:bottom w:type="dxa" w:w="80"/>
-              <w:right w:type="dxa" w:w="115"/>
-            </w:tcMar>
-            <w:vAlign w:val="center"/>
-          </w:tcPr>
-          <w:p>
-            <w:pPr>
-              <w:spacing w:before="0" w:after="0" w:line="340"/>
-            </w:pPr>
-            <w:r>
-              <w:rPr>
-                <w:rFonts w:ascii="Arial" w:cs="Arial" w:eastAsia="Arial" w:hAnsi="Arial"/>
-                <w:b/>
-                <w:bCs/>
-                <w:i w:val="false"/>
-                <w:iCs w:val="false"/>
-                <w:color w:val="1D2021"/>
-                <w:sz w:val="22"/>
-                <w:szCs w:val="22"/>
-              </w:rPr>
-              <w:t xml:space="preserve">Governing Law</w:t>
-            </w:r>
-          </w:p>
-        </w:tc>
-        <w:tc>
-          <w:tcPr>
-            <w:tcBorders>
-              <w:top w:val="single" w:color="C7C7C7" w:sz="4"/>
-              <w:left w:val="nil" w:color="FFFFFF" w:sz="0"/>
-              <w:bottom w:val="single" w:color="C7C7C7" w:sz="4"/>
-              <w:right w:val="nil" w:color="FFFFFF" w:sz="0"/>
-            </w:tcBorders>
-            <w:tcMar>
-              <w:top w:type="dxa" w:w="80"/>
-              <w:left w:type="dxa" w:w="115"/>
-              <w:bottom w:type="dxa" w:w="80"/>
-              <w:right w:type="dxa" w:w="115"/>
-            </w:tcMar>
-            <w:vAlign w:val="center"/>
-          </w:tcPr>
-          <w:p>
-            <w:pPr>
-              <w:spacing w:before="0" w:after="0" w:line="340" w:beforeAutospacing="false" w:afterAutospacing="false"/>
-              <w:contextualSpacing w:val="false"/>
-            </w:pPr>
-            <w:r>
-              <w:rPr>
-                <w:rFonts w:ascii="Arial" w:cs="Arial" w:eastAsia="Arial" w:hAnsi="Arial"/>
-                <w:b w:val="false"/>
-                <w:bCs w:val="false"/>
-                <w:i w:val="false"/>
-                <w:iCs w:val="false"/>
-                <w:color w:val="1D2021"/>
-                <w:sz w:val="22"/>
-                <w:szCs w:val="22"/>
-              </w:rPr>
-              <w:t xml:space="preserve">{governing_law}</w:t>
-            </w:r>
-          </w:p>
-        </w:tc>
-      </w:tr>
-      <w:tr>
-        <w:trPr>
           <w:trHeight w:val="358" w:hRule="atLeast"/>
         </w:trPr>
         <w:tc>
@@ -3612,7 +3536,7 @@
           <w:sz w:val="22"/>
           <w:szCs w:val="22"/>
         </w:rPr>
-        <w:t xml:space="preserve">This agreement is governed by the law listed in Cover Terms, including Wyo. Stat. § 1-23-108 for contracts entered into on or after July 1, 2025. Disputes will be resolved in the courts of the Governing Law state, subject to non-waivable rights under applicable law.</w:t>
+        <w:t xml:space="preserve">This agreement is governed by and construed in accordance with the laws of the State of Wyoming, including Wyo. Stat. § 1-23-108 for contracts entered into on or after July 1, 2025. Disputes will be resolved in the state and federal courts located in Wyoming, subject to non-waivable rights under applicable law.</w:t>
       </w:r>
     </w:p>
     <w:p>

</xml_diff>

<commit_message>
fix(metadata): clarify signatory vs entity name in field descriptions
Across 22 templates, updated field descriptions to prevent AI from
confusing entity names with signatory names:

- "Full legal name of the X's signatory" → "Name of the human
  individual who signs on behalf of the X (not the company name)"
- "Company name for the X signatory" → "Legal entity name of the X
  (not the person signing)"
- "Title/role of the X's signatory" → "Title of the human individual
  signing on behalf of the X (e.g., CEO)"

Also: Wyoming template now uses stacked-two-party signature mode with
separate Company row for employer, and inline governing law clause.
</commit_message>
<xml_diff>
--- a/content/templates/openagreements-restrictive-covenant-wyoming/template.docx
+++ b/content/templates/openagreements-restrictive-covenant-wyoming/template.docx
@@ -3627,7 +3627,7 @@
     </w:p>
     <w:tbl>
       <w:tblPr>
-        <w:tblW w:type="dxa" w:w="10075"/>
+        <w:tblW w:type="dxa" w:w="10070"/>
         <w:tblBorders>
           <w:top w:val="nil" w:color="FFFFFF" w:sz="0"/>
           <w:left w:val="nil" w:color="FFFFFF" w:sz="0"/>
@@ -3640,9 +3640,7 @@
       </w:tblPr>
       <w:tblGrid>
         <w:gridCol w:w="2605"/>
-        <w:gridCol w:w="3600"/>
-        <w:gridCol w:w="250"/>
-        <w:gridCol w:w="3620"/>
+        <w:gridCol w:w="7465"/>
       </w:tblGrid>
       <w:tr>
         <w:tc>
@@ -3712,6 +3710,11 @@
             </w:r>
           </w:p>
         </w:tc>
+      </w:tr>
+      <w:tr>
+        <w:trPr>
+          <w:trHeight w:val="690" w:hRule="atLeast"/>
+        </w:trPr>
         <w:tc>
           <w:tcPr>
             <w:tcBorders>
@@ -3722,14 +3725,390 @@
             </w:tcBorders>
             <w:tcMar>
               <w:top w:type="dxa" w:w="216"/>
-              <w:left w:type="dxa" w:w="0"/>
+              <w:left w:type="dxa" w:w="115"/>
               <w:bottom w:type="dxa" w:w="216"/>
-              <w:right w:type="dxa" w:w="0"/>
-            </w:tcMar>
-            <w:vAlign w:val="center"/>
-          </w:tcPr>
-          <w:p>
-            <w:r>
+              <w:right w:type="dxa" w:w="115"/>
+            </w:tcMar>
+            <w:vAlign w:val="center"/>
+          </w:tcPr>
+          <w:p>
+            <w:pPr>
+              <w:spacing w:after="0" w:line="340"/>
+            </w:pPr>
+            <w:r>
+              <w:rPr>
+                <w:rFonts w:ascii="Arial" w:cs="Arial" w:eastAsia="Arial" w:hAnsi="Arial"/>
+                <w:b/>
+                <w:bCs/>
+                <w:color w:val="1D2021"/>
+                <w:sz w:val="18"/>
+                <w:szCs w:val="18"/>
+              </w:rPr>
+              <w:t xml:space="preserve">Company</w:t>
+            </w:r>
+          </w:p>
+        </w:tc>
+        <w:tc>
+          <w:tcPr>
+            <w:tcBorders>
+              <w:top w:val="single" w:color="C7C7C7" w:sz="4"/>
+              <w:left w:val="nil" w:color="FFFFFF" w:sz="0"/>
+              <w:bottom w:val="single" w:color="C7C7C7" w:sz="4"/>
+              <w:right w:val="nil" w:color="FFFFFF" w:sz="0"/>
+            </w:tcBorders>
+            <w:tcMar>
+              <w:top w:type="dxa" w:w="216"/>
+              <w:left w:type="dxa" w:w="115"/>
+              <w:bottom w:type="dxa" w:w="216"/>
+              <w:right w:type="dxa" w:w="115"/>
+            </w:tcMar>
+            <w:vAlign w:val="center"/>
+          </w:tcPr>
+          <w:p>
+            <w:pPr>
+              <w:spacing w:after="0" w:line="340"/>
+            </w:pPr>
+            <w:r>
+              <w:rPr>
+                <w:rFonts w:ascii="Arial" w:cs="Arial" w:eastAsia="Arial" w:hAnsi="Arial"/>
+                <w:color w:val="1D2021"/>
+                <w:sz w:val="18"/>
+                <w:szCs w:val="18"/>
+              </w:rPr>
+              <w:t xml:space="preserve">{employer_name}</w:t>
+            </w:r>
+          </w:p>
+        </w:tc>
+      </w:tr>
+      <w:tr>
+        <w:trPr>
+          <w:trHeight w:val="690" w:hRule="atLeast"/>
+        </w:trPr>
+        <w:tc>
+          <w:tcPr>
+            <w:tcBorders>
+              <w:top w:val="nil" w:color="FFFFFF" w:sz="0"/>
+              <w:left w:val="nil" w:color="FFFFFF" w:sz="0"/>
+              <w:bottom w:val="nil" w:color="FFFFFF" w:sz="0"/>
+              <w:right w:val="nil" w:color="FFFFFF" w:sz="0"/>
+            </w:tcBorders>
+            <w:tcMar>
+              <w:top w:type="dxa" w:w="216"/>
+              <w:left w:type="dxa" w:w="115"/>
+              <w:bottom w:type="dxa" w:w="216"/>
+              <w:right w:type="dxa" w:w="115"/>
+            </w:tcMar>
+            <w:vAlign w:val="center"/>
+          </w:tcPr>
+          <w:p>
+            <w:pPr>
+              <w:spacing w:after="0" w:line="340"/>
+            </w:pPr>
+            <w:r>
+              <w:rPr>
+                <w:rFonts w:ascii="Arial" w:cs="Arial" w:eastAsia="Arial" w:hAnsi="Arial"/>
+                <w:b/>
+                <w:bCs/>
+                <w:color w:val="1D2021"/>
+                <w:sz w:val="18"/>
+                <w:szCs w:val="18"/>
+              </w:rPr>
+              <w:t xml:space="preserve">Signature</w:t>
+            </w:r>
+          </w:p>
+        </w:tc>
+        <w:tc>
+          <w:tcPr>
+            <w:tcBorders>
+              <w:top w:val="single" w:color="C7C7C7" w:sz="4"/>
+              <w:left w:val="nil" w:color="FFFFFF" w:sz="0"/>
+              <w:bottom w:val="single" w:color="C7C7C7" w:sz="4"/>
+              <w:right w:val="nil" w:color="FFFFFF" w:sz="0"/>
+            </w:tcBorders>
+            <w:tcMar>
+              <w:top w:type="dxa" w:w="216"/>
+              <w:left w:type="dxa" w:w="115"/>
+              <w:bottom w:type="dxa" w:w="216"/>
+              <w:right w:type="dxa" w:w="115"/>
+            </w:tcMar>
+            <w:vAlign w:val="center"/>
+          </w:tcPr>
+          <w:p>
+            <w:pPr>
+              <w:spacing w:after="0" w:line="340"/>
+            </w:pPr>
+            <w:r>
+              <w:rPr>
+                <w:rFonts w:ascii="Arial" w:cs="Arial" w:eastAsia="Arial" w:hAnsi="Arial"/>
+                <w:color w:val="1D2021"/>
+                <w:sz w:val="18"/>
+                <w:szCs w:val="18"/>
+              </w:rPr>
+              <w:t xml:space="preserve"/>
+            </w:r>
+          </w:p>
+        </w:tc>
+      </w:tr>
+      <w:tr>
+        <w:trPr>
+          <w:trHeight w:val="690" w:hRule="atLeast"/>
+        </w:trPr>
+        <w:tc>
+          <w:tcPr>
+            <w:tcBorders>
+              <w:top w:val="nil" w:color="FFFFFF" w:sz="0"/>
+              <w:left w:val="nil" w:color="FFFFFF" w:sz="0"/>
+              <w:bottom w:val="nil" w:color="FFFFFF" w:sz="0"/>
+              <w:right w:val="nil" w:color="FFFFFF" w:sz="0"/>
+            </w:tcBorders>
+            <w:tcMar>
+              <w:top w:type="dxa" w:w="216"/>
+              <w:left w:type="dxa" w:w="115"/>
+              <w:bottom w:type="dxa" w:w="216"/>
+              <w:right w:type="dxa" w:w="115"/>
+            </w:tcMar>
+            <w:vAlign w:val="center"/>
+          </w:tcPr>
+          <w:p>
+            <w:pPr>
+              <w:spacing w:after="0" w:line="340"/>
+            </w:pPr>
+            <w:r>
+              <w:rPr>
+                <w:rFonts w:ascii="Arial" w:cs="Arial" w:eastAsia="Arial" w:hAnsi="Arial"/>
+                <w:b/>
+                <w:bCs/>
+                <w:color w:val="1D2021"/>
+                <w:sz w:val="18"/>
+                <w:szCs w:val="18"/>
+              </w:rPr>
+              <w:t xml:space="preserve">Print Name</w:t>
+            </w:r>
+          </w:p>
+        </w:tc>
+        <w:tc>
+          <w:tcPr>
+            <w:tcBorders>
+              <w:top w:val="single" w:color="C7C7C7" w:sz="4"/>
+              <w:left w:val="nil" w:color="FFFFFF" w:sz="0"/>
+              <w:bottom w:val="single" w:color="C7C7C7" w:sz="4"/>
+              <w:right w:val="nil" w:color="FFFFFF" w:sz="0"/>
+            </w:tcBorders>
+            <w:tcMar>
+              <w:top w:type="dxa" w:w="216"/>
+              <w:left w:type="dxa" w:w="115"/>
+              <w:bottom w:type="dxa" w:w="216"/>
+              <w:right w:type="dxa" w:w="115"/>
+            </w:tcMar>
+            <w:vAlign w:val="center"/>
+          </w:tcPr>
+          <w:p>
+            <w:pPr>
+              <w:spacing w:after="0" w:line="340"/>
+            </w:pPr>
+            <w:r>
+              <w:rPr>
+                <w:rFonts w:ascii="Arial" w:cs="Arial" w:eastAsia="Arial" w:hAnsi="Arial"/>
+                <w:color w:val="1D2021"/>
+                <w:sz w:val="18"/>
+                <w:szCs w:val="18"/>
+              </w:rPr>
+              <w:t xml:space="preserve"/>
+            </w:r>
+          </w:p>
+        </w:tc>
+      </w:tr>
+      <w:tr>
+        <w:trPr>
+          <w:trHeight w:val="690" w:hRule="atLeast"/>
+        </w:trPr>
+        <w:tc>
+          <w:tcPr>
+            <w:tcBorders>
+              <w:top w:val="nil" w:color="FFFFFF" w:sz="0"/>
+              <w:left w:val="nil" w:color="FFFFFF" w:sz="0"/>
+              <w:bottom w:val="nil" w:color="FFFFFF" w:sz="0"/>
+              <w:right w:val="nil" w:color="FFFFFF" w:sz="0"/>
+            </w:tcBorders>
+            <w:tcMar>
+              <w:top w:type="dxa" w:w="216"/>
+              <w:left w:type="dxa" w:w="115"/>
+              <w:bottom w:type="dxa" w:w="216"/>
+              <w:right w:type="dxa" w:w="115"/>
+            </w:tcMar>
+            <w:vAlign w:val="center"/>
+          </w:tcPr>
+          <w:p>
+            <w:pPr>
+              <w:spacing w:after="0" w:line="340"/>
+            </w:pPr>
+            <w:r>
+              <w:rPr>
+                <w:rFonts w:ascii="Arial" w:cs="Arial" w:eastAsia="Arial" w:hAnsi="Arial"/>
+                <w:b/>
+                <w:bCs/>
+                <w:color w:val="1D2021"/>
+                <w:sz w:val="18"/>
+                <w:szCs w:val="18"/>
+              </w:rPr>
+              <w:t xml:space="preserve">Title</w:t>
+            </w:r>
+          </w:p>
+        </w:tc>
+        <w:tc>
+          <w:tcPr>
+            <w:tcBorders>
+              <w:top w:val="single" w:color="C7C7C7" w:sz="4"/>
+              <w:left w:val="nil" w:color="FFFFFF" w:sz="0"/>
+              <w:bottom w:val="single" w:color="C7C7C7" w:sz="4"/>
+              <w:right w:val="nil" w:color="FFFFFF" w:sz="0"/>
+            </w:tcBorders>
+            <w:tcMar>
+              <w:top w:type="dxa" w:w="216"/>
+              <w:left w:type="dxa" w:w="115"/>
+              <w:bottom w:type="dxa" w:w="216"/>
+              <w:right w:type="dxa" w:w="115"/>
+            </w:tcMar>
+            <w:vAlign w:val="center"/>
+          </w:tcPr>
+          <w:p>
+            <w:pPr>
+              <w:spacing w:after="0" w:line="340"/>
+            </w:pPr>
+            <w:r>
+              <w:rPr>
+                <w:rFonts w:ascii="Arial" w:cs="Arial" w:eastAsia="Arial" w:hAnsi="Arial"/>
+                <w:color w:val="1D2021"/>
+                <w:sz w:val="18"/>
+                <w:szCs w:val="18"/>
+              </w:rPr>
+              <w:t xml:space="preserve"/>
+            </w:r>
+          </w:p>
+        </w:tc>
+      </w:tr>
+      <w:tr>
+        <w:trPr>
+          <w:trHeight w:val="690" w:hRule="atLeast"/>
+        </w:trPr>
+        <w:tc>
+          <w:tcPr>
+            <w:tcBorders>
+              <w:top w:val="nil" w:color="FFFFFF" w:sz="0"/>
+              <w:left w:val="nil" w:color="FFFFFF" w:sz="0"/>
+              <w:bottom w:val="nil" w:color="FFFFFF" w:sz="0"/>
+              <w:right w:val="nil" w:color="FFFFFF" w:sz="0"/>
+            </w:tcBorders>
+            <w:tcMar>
+              <w:top w:type="dxa" w:w="216"/>
+              <w:left w:type="dxa" w:w="115"/>
+              <w:bottom w:type="dxa" w:w="216"/>
+              <w:right w:type="dxa" w:w="115"/>
+            </w:tcMar>
+            <w:vAlign w:val="center"/>
+          </w:tcPr>
+          <w:p>
+            <w:pPr>
+              <w:spacing w:after="0" w:line="340"/>
+            </w:pPr>
+            <w:r>
+              <w:rPr>
+                <w:rFonts w:ascii="Arial" w:cs="Arial" w:eastAsia="Arial" w:hAnsi="Arial"/>
+                <w:b/>
+                <w:bCs/>
+                <w:color w:val="1D2021"/>
+                <w:sz w:val="18"/>
+                <w:szCs w:val="18"/>
+              </w:rPr>
+              <w:t xml:space="preserve">Date</w:t>
+            </w:r>
+          </w:p>
+        </w:tc>
+        <w:tc>
+          <w:tcPr>
+            <w:tcBorders>
+              <w:top w:val="single" w:color="C7C7C7" w:sz="4"/>
+              <w:left w:val="nil" w:color="FFFFFF" w:sz="0"/>
+              <w:bottom w:val="single" w:color="C7C7C7" w:sz="4"/>
+              <w:right w:val="nil" w:color="FFFFFF" w:sz="0"/>
+            </w:tcBorders>
+            <w:tcMar>
+              <w:top w:type="dxa" w:w="216"/>
+              <w:left w:type="dxa" w:w="115"/>
+              <w:bottom w:type="dxa" w:w="216"/>
+              <w:right w:type="dxa" w:w="115"/>
+            </w:tcMar>
+            <w:vAlign w:val="center"/>
+          </w:tcPr>
+          <w:p>
+            <w:pPr>
+              <w:spacing w:after="0" w:line="340"/>
+            </w:pPr>
+            <w:r>
+              <w:rPr>
+                <w:rFonts w:ascii="Arial" w:cs="Arial" w:eastAsia="Arial" w:hAnsi="Arial"/>
+                <w:color w:val="1D2021"/>
+                <w:sz w:val="18"/>
+                <w:szCs w:val="18"/>
+              </w:rPr>
+              <w:t xml:space="preserve"/>
+            </w:r>
+          </w:p>
+        </w:tc>
+      </w:tr>
+    </w:tbl>
+    <w:p>
+      <w:pPr>
+        <w:spacing w:before="400" w:after="0"/>
+      </w:pPr>
+    </w:p>
+    <w:tbl>
+      <w:tblPr>
+        <w:tblW w:type="dxa" w:w="10070"/>
+        <w:tblBorders>
+          <w:top w:val="nil" w:color="FFFFFF" w:sz="0"/>
+          <w:left w:val="nil" w:color="FFFFFF" w:sz="0"/>
+          <w:bottom w:val="nil" w:color="FFFFFF" w:sz="0"/>
+          <w:right w:val="nil" w:color="FFFFFF" w:sz="0"/>
+          <w:insideH w:val="single" w:color="auto" w:sz="4"/>
+          <w:insideV w:val="single" w:color="auto" w:sz="4"/>
+        </w:tblBorders>
+        <w:tblLayout w:type="fixed"/>
+      </w:tblPr>
+      <w:tblGrid>
+        <w:gridCol w:w="2605"/>
+        <w:gridCol w:w="7465"/>
+      </w:tblGrid>
+      <w:tr>
+        <w:tc>
+          <w:tcPr>
+            <w:tcBorders>
+              <w:top w:val="nil" w:color="FFFFFF" w:sz="0"/>
+              <w:left w:val="nil" w:color="FFFFFF" w:sz="0"/>
+              <w:bottom w:val="nil" w:color="FFFFFF" w:sz="0"/>
+              <w:right w:val="nil" w:color="FFFFFF" w:sz="0"/>
+            </w:tcBorders>
+            <w:tcMar>
+              <w:top w:type="dxa" w:w="216"/>
+              <w:left w:type="dxa" w:w="115"/>
+              <w:bottom w:type="dxa" w:w="216"/>
+              <w:right w:type="dxa" w:w="115"/>
+            </w:tcMar>
+            <w:vAlign w:val="center"/>
+          </w:tcPr>
+          <w:p>
+            <w:pPr>
+              <w:spacing w:after="0" w:line="340"/>
+            </w:pPr>
+            <w:r>
+              <w:rPr>
+                <w:rFonts w:ascii="Arial" w:cs="Arial" w:eastAsia="Arial" w:hAnsi="Arial"/>
+                <w:b/>
+                <w:bCs/>
+                <w:color w:val="1D2021"/>
+                <w:sz w:val="18"/>
+                <w:szCs w:val="18"/>
+              </w:rPr>
               <w:t xml:space="preserve"/>
             </w:r>
           </w:p>
@@ -3837,59 +4216,6 @@
             </w:r>
           </w:p>
         </w:tc>
-        <w:tc>
-          <w:tcPr>
-            <w:tcBorders>
-              <w:top w:val="nil" w:color="FFFFFF" w:sz="0"/>
-              <w:left w:val="nil" w:color="FFFFFF" w:sz="0"/>
-              <w:bottom w:val="nil" w:color="FFFFFF" w:sz="0"/>
-              <w:right w:val="nil" w:color="FFFFFF" w:sz="0"/>
-            </w:tcBorders>
-            <w:tcMar>
-              <w:top w:type="dxa" w:w="216"/>
-              <w:left w:type="dxa" w:w="0"/>
-              <w:bottom w:type="dxa" w:w="216"/>
-              <w:right w:type="dxa" w:w="0"/>
-            </w:tcMar>
-            <w:vAlign w:val="center"/>
-          </w:tcPr>
-          <w:p>
-            <w:r>
-              <w:t xml:space="preserve"/>
-            </w:r>
-          </w:p>
-        </w:tc>
-        <w:tc>
-          <w:tcPr>
-            <w:tcBorders>
-              <w:top w:val="single" w:color="C7C7C7" w:sz="4"/>
-              <w:left w:val="nil" w:color="FFFFFF" w:sz="0"/>
-              <w:bottom w:val="single" w:color="C7C7C7" w:sz="4"/>
-              <w:right w:val="nil" w:color="FFFFFF" w:sz="0"/>
-            </w:tcBorders>
-            <w:tcMar>
-              <w:top w:type="dxa" w:w="216"/>
-              <w:left w:type="dxa" w:w="115"/>
-              <w:bottom w:type="dxa" w:w="216"/>
-              <w:right w:type="dxa" w:w="115"/>
-            </w:tcMar>
-            <w:vAlign w:val="center"/>
-          </w:tcPr>
-          <w:p>
-            <w:pPr>
-              <w:spacing w:after="0" w:line="340"/>
-            </w:pPr>
-            <w:r>
-              <w:rPr>
-                <w:rFonts w:ascii="Arial" w:cs="Arial" w:eastAsia="Arial" w:hAnsi="Arial"/>
-                <w:color w:val="1D2021"/>
-                <w:sz w:val="18"/>
-                <w:szCs w:val="18"/>
-              </w:rPr>
-              <w:t xml:space="preserve"/>
-            </w:r>
-          </w:p>
-        </w:tc>
       </w:tr>
       <w:tr>
         <w:trPr>
@@ -3955,59 +4281,6 @@
                 <w:sz w:val="18"/>
                 <w:szCs w:val="18"/>
               </w:rPr>
-              <w:t xml:space="preserve">{employer_name}</w:t>
-            </w:r>
-          </w:p>
-        </w:tc>
-        <w:tc>
-          <w:tcPr>
-            <w:tcBorders>
-              <w:top w:val="nil" w:color="FFFFFF" w:sz="0"/>
-              <w:left w:val="nil" w:color="FFFFFF" w:sz="0"/>
-              <w:bottom w:val="nil" w:color="FFFFFF" w:sz="0"/>
-              <w:right w:val="nil" w:color="FFFFFF" w:sz="0"/>
-            </w:tcBorders>
-            <w:tcMar>
-              <w:top w:type="dxa" w:w="216"/>
-              <w:left w:type="dxa" w:w="0"/>
-              <w:bottom w:type="dxa" w:w="216"/>
-              <w:right w:type="dxa" w:w="0"/>
-            </w:tcMar>
-            <w:vAlign w:val="center"/>
-          </w:tcPr>
-          <w:p>
-            <w:r>
-              <w:t xml:space="preserve"/>
-            </w:r>
-          </w:p>
-        </w:tc>
-        <w:tc>
-          <w:tcPr>
-            <w:tcBorders>
-              <w:top w:val="single" w:color="C7C7C7" w:sz="4"/>
-              <w:left w:val="nil" w:color="FFFFFF" w:sz="0"/>
-              <w:bottom w:val="single" w:color="C7C7C7" w:sz="4"/>
-              <w:right w:val="nil" w:color="FFFFFF" w:sz="0"/>
-            </w:tcBorders>
-            <w:tcMar>
-              <w:top w:type="dxa" w:w="216"/>
-              <w:left w:type="dxa" w:w="115"/>
-              <w:bottom w:type="dxa" w:w="216"/>
-              <w:right w:type="dxa" w:w="115"/>
-            </w:tcMar>
-            <w:vAlign w:val="center"/>
-          </w:tcPr>
-          <w:p>
-            <w:pPr>
-              <w:spacing w:after="0" w:line="340"/>
-            </w:pPr>
-            <w:r>
-              <w:rPr>
-                <w:rFonts w:ascii="Arial" w:cs="Arial" w:eastAsia="Arial" w:hAnsi="Arial"/>
-                <w:color w:val="1D2021"/>
-                <w:sz w:val="18"/>
-                <w:szCs w:val="18"/>
-              </w:rPr>
               <w:t xml:space="preserve">{employee_name}</w:t>
             </w:r>
           </w:p>
@@ -4046,182 +4319,7 @@
                 <w:sz w:val="18"/>
                 <w:szCs w:val="18"/>
               </w:rPr>
-              <w:t xml:space="preserve">Title</w:t>
-            </w:r>
-          </w:p>
-        </w:tc>
-        <w:tc>
-          <w:tcPr>
-            <w:tcBorders>
-              <w:top w:val="single" w:color="C7C7C7" w:sz="4"/>
-              <w:left w:val="nil" w:color="FFFFFF" w:sz="0"/>
-              <w:bottom w:val="single" w:color="C7C7C7" w:sz="4"/>
-              <w:right w:val="nil" w:color="FFFFFF" w:sz="0"/>
-            </w:tcBorders>
-            <w:tcMar>
-              <w:top w:type="dxa" w:w="216"/>
-              <w:left w:type="dxa" w:w="115"/>
-              <w:bottom w:type="dxa" w:w="216"/>
-              <w:right w:type="dxa" w:w="115"/>
-            </w:tcMar>
-            <w:vAlign w:val="center"/>
-          </w:tcPr>
-          <w:p>
-            <w:pPr>
-              <w:spacing w:after="0" w:line="340"/>
-            </w:pPr>
-            <w:r>
-              <w:rPr>
-                <w:rFonts w:ascii="Arial" w:cs="Arial" w:eastAsia="Arial" w:hAnsi="Arial"/>
-                <w:color w:val="1D2021"/>
-                <w:sz w:val="18"/>
-                <w:szCs w:val="18"/>
-              </w:rPr>
-              <w:t xml:space="preserve"/>
-            </w:r>
-          </w:p>
-        </w:tc>
-        <w:tc>
-          <w:tcPr>
-            <w:tcBorders>
-              <w:top w:val="nil" w:color="FFFFFF" w:sz="0"/>
-              <w:left w:val="nil" w:color="FFFFFF" w:sz="0"/>
-              <w:bottom w:val="nil" w:color="FFFFFF" w:sz="0"/>
-              <w:right w:val="nil" w:color="FFFFFF" w:sz="0"/>
-            </w:tcBorders>
-            <w:tcMar>
-              <w:top w:type="dxa" w:w="216"/>
-              <w:left w:type="dxa" w:w="0"/>
-              <w:bottom w:type="dxa" w:w="216"/>
-              <w:right w:type="dxa" w:w="0"/>
-            </w:tcMar>
-            <w:vAlign w:val="center"/>
-          </w:tcPr>
-          <w:p>
-            <w:r>
-              <w:t xml:space="preserve"/>
-            </w:r>
-          </w:p>
-        </w:tc>
-        <w:tc>
-          <w:tcPr>
-            <w:tcBorders>
-              <w:top w:val="nil" w:color="FFFFFF" w:sz="0"/>
-              <w:left w:val="nil" w:color="FFFFFF" w:sz="0"/>
-              <w:bottom w:val="nil" w:color="FFFFFF" w:sz="0"/>
-              <w:right w:val="nil" w:color="FFFFFF" w:sz="0"/>
-            </w:tcBorders>
-            <w:tcMar>
-              <w:top w:type="dxa" w:w="216"/>
-              <w:left w:type="dxa" w:w="115"/>
-              <w:bottom w:type="dxa" w:w="216"/>
-              <w:right w:type="dxa" w:w="115"/>
-            </w:tcMar>
-            <w:vAlign w:val="center"/>
-          </w:tcPr>
-          <w:p>
-            <w:pPr>
-              <w:spacing w:after="0" w:line="340"/>
-            </w:pPr>
-            <w:r>
-              <w:rPr>
-                <w:rFonts w:ascii="Arial" w:cs="Arial" w:eastAsia="Arial" w:hAnsi="Arial"/>
-                <w:color w:val="1D2021"/>
-                <w:sz w:val="18"/>
-                <w:szCs w:val="18"/>
-              </w:rPr>
-              <w:t xml:space="preserve"/>
-            </w:r>
-          </w:p>
-        </w:tc>
-      </w:tr>
-      <w:tr>
-        <w:trPr>
-          <w:trHeight w:val="690" w:hRule="atLeast"/>
-        </w:trPr>
-        <w:tc>
-          <w:tcPr>
-            <w:tcBorders>
-              <w:top w:val="nil" w:color="FFFFFF" w:sz="0"/>
-              <w:left w:val="nil" w:color="FFFFFF" w:sz="0"/>
-              <w:bottom w:val="nil" w:color="FFFFFF" w:sz="0"/>
-              <w:right w:val="nil" w:color="FFFFFF" w:sz="0"/>
-            </w:tcBorders>
-            <w:tcMar>
-              <w:top w:type="dxa" w:w="216"/>
-              <w:left w:type="dxa" w:w="115"/>
-              <w:bottom w:type="dxa" w:w="216"/>
-              <w:right w:type="dxa" w:w="115"/>
-            </w:tcMar>
-            <w:vAlign w:val="center"/>
-          </w:tcPr>
-          <w:p>
-            <w:pPr>
-              <w:spacing w:after="0" w:line="340"/>
-            </w:pPr>
-            <w:r>
-              <w:rPr>
-                <w:rFonts w:ascii="Arial" w:cs="Arial" w:eastAsia="Arial" w:hAnsi="Arial"/>
-                <w:b/>
-                <w:bCs/>
-                <w:color w:val="1D2021"/>
-                <w:sz w:val="18"/>
-                <w:szCs w:val="18"/>
-              </w:rPr>
               <w:t xml:space="preserve">Date</w:t>
-            </w:r>
-          </w:p>
-        </w:tc>
-        <w:tc>
-          <w:tcPr>
-            <w:tcBorders>
-              <w:top w:val="single" w:color="C7C7C7" w:sz="4"/>
-              <w:left w:val="nil" w:color="FFFFFF" w:sz="0"/>
-              <w:bottom w:val="single" w:color="C7C7C7" w:sz="4"/>
-              <w:right w:val="nil" w:color="FFFFFF" w:sz="0"/>
-            </w:tcBorders>
-            <w:tcMar>
-              <w:top w:type="dxa" w:w="216"/>
-              <w:left w:type="dxa" w:w="115"/>
-              <w:bottom w:type="dxa" w:w="216"/>
-              <w:right w:type="dxa" w:w="115"/>
-            </w:tcMar>
-            <w:vAlign w:val="center"/>
-          </w:tcPr>
-          <w:p>
-            <w:pPr>
-              <w:spacing w:after="0" w:line="340"/>
-            </w:pPr>
-            <w:r>
-              <w:rPr>
-                <w:rFonts w:ascii="Arial" w:cs="Arial" w:eastAsia="Arial" w:hAnsi="Arial"/>
-                <w:color w:val="1D2021"/>
-                <w:sz w:val="18"/>
-                <w:szCs w:val="18"/>
-              </w:rPr>
-              <w:t xml:space="preserve"/>
-            </w:r>
-          </w:p>
-        </w:tc>
-        <w:tc>
-          <w:tcPr>
-            <w:tcBorders>
-              <w:top w:val="nil" w:color="FFFFFF" w:sz="0"/>
-              <w:left w:val="nil" w:color="FFFFFF" w:sz="0"/>
-              <w:bottom w:val="nil" w:color="FFFFFF" w:sz="0"/>
-              <w:right w:val="nil" w:color="FFFFFF" w:sz="0"/>
-            </w:tcBorders>
-            <w:tcMar>
-              <w:top w:type="dxa" w:w="216"/>
-              <w:left w:type="dxa" w:w="0"/>
-              <w:bottom w:type="dxa" w:w="216"/>
-              <w:right w:type="dxa" w:w="0"/>
-            </w:tcMar>
-            <w:vAlign w:val="center"/>
-          </w:tcPr>
-          <w:p>
-            <w:r>
-              <w:t xml:space="preserve"/>
             </w:r>
           </w:p>
         </w:tc>

</xml_diff>

<commit_message>
feat: migrate wyoming restrictive covenant to canonical template.md
</commit_message>
<xml_diff>
--- a/content/templates/openagreements-restrictive-covenant-wyoming/template.docx
+++ b/content/templates/openagreements-restrictive-covenant-wyoming/template.docx
@@ -4,7 +4,7 @@
   <w:body>
     <w:p>
       <w:pPr>
-        <w:spacing w:before="240" w:after="210"/>
+        <w:spacing w:after="210" w:before="240"/>
       </w:pPr>
       <w:r>
         <w:rPr>
@@ -105,7 +105,7 @@
           </w:tcPr>
           <w:p>
             <w:pPr>
-              <w:spacing w:before="0" w:after="0" w:line="340"/>
+              <w:spacing w:after="0" w:before="0" w:line="340"/>
             </w:pPr>
             <w:r>
               <w:rPr>
@@ -140,7 +140,7 @@
           </w:tcPr>
           <w:p>
             <w:pPr>
-              <w:spacing w:before="0" w:after="0" w:line="340" w:beforeAutospacing="false" w:afterAutospacing="false"/>
+              <w:spacing w:after="0" w:before="0" w:line="340" w:beforeAutospacing="false" w:afterAutospacing="false"/>
               <w:contextualSpacing w:val="false"/>
             </w:pPr>
             <w:r>
@@ -181,7 +181,7 @@
           </w:tcPr>
           <w:p>
             <w:pPr>
-              <w:spacing w:before="0" w:after="0" w:line="340"/>
+              <w:spacing w:after="0" w:before="0" w:line="340"/>
             </w:pPr>
             <w:r>
               <w:rPr>
@@ -216,7 +216,7 @@
           </w:tcPr>
           <w:p>
             <w:pPr>
-              <w:spacing w:before="0" w:after="0" w:line="340" w:beforeAutospacing="false" w:afterAutospacing="false"/>
+              <w:spacing w:after="0" w:before="0" w:line="340" w:beforeAutospacing="false" w:afterAutospacing="false"/>
               <w:contextualSpacing w:val="false"/>
             </w:pPr>
             <w:r>
@@ -257,7 +257,7 @@
           </w:tcPr>
           <w:p>
             <w:pPr>
-              <w:spacing w:before="0" w:after="0" w:line="340"/>
+              <w:spacing w:after="0" w:before="0" w:line="340"/>
             </w:pPr>
             <w:r>
               <w:rPr>
@@ -292,7 +292,7 @@
           </w:tcPr>
           <w:p>
             <w:pPr>
-              <w:spacing w:before="0" w:after="0" w:line="340" w:beforeAutospacing="false" w:afterAutospacing="false"/>
+              <w:spacing w:after="0" w:before="0" w:line="340" w:beforeAutospacing="false" w:afterAutospacing="false"/>
               <w:contextualSpacing w:val="false"/>
             </w:pPr>
             <w:r>
@@ -333,7 +333,7 @@
           </w:tcPr>
           <w:p>
             <w:pPr>
-              <w:spacing w:before="0" w:after="0" w:line="340"/>
+              <w:spacing w:after="0" w:before="0" w:line="340"/>
             </w:pPr>
             <w:r>
               <w:rPr>
@@ -368,7 +368,7 @@
           </w:tcPr>
           <w:p>
             <w:pPr>
-              <w:spacing w:before="0" w:after="0" w:line="340" w:beforeAutospacing="false" w:afterAutospacing="false"/>
+              <w:spacing w:after="0" w:before="0" w:line="340" w:beforeAutospacing="false" w:afterAutospacing="false"/>
               <w:contextualSpacing w:val="false"/>
             </w:pPr>
             <w:r>
@@ -409,7 +409,7 @@
           </w:tcPr>
           <w:p>
             <w:pPr>
-              <w:spacing w:before="0" w:after="0" w:line="340"/>
+              <w:spacing w:after="0" w:before="0" w:line="340"/>
             </w:pPr>
             <w:r>
               <w:rPr>
@@ -444,7 +444,7 @@
           </w:tcPr>
           <w:p>
             <w:pPr>
-              <w:spacing w:before="0" w:after="0" w:line="340" w:beforeAutospacing="false" w:afterAutospacing="false"/>
+              <w:spacing w:after="0" w:before="0" w:line="340" w:beforeAutospacing="false" w:afterAutospacing="false"/>
               <w:contextualSpacing w:val="false"/>
             </w:pPr>
             <w:r>
@@ -497,7 +497,7 @@
           </w:p>
           <w:p>
             <w:pPr>
-              <w:spacing w:before="0" w:after="0" w:line="240"/>
+              <w:spacing w:after="0" w:before="0" w:line="240"/>
             </w:pPr>
             <w:r>
               <w:rPr>
@@ -532,7 +532,7 @@
           </w:tcPr>
           <w:p>
             <w:pPr>
-              <w:spacing w:before="0" w:after="0" w:line="340" w:beforeAutospacing="false" w:afterAutospacing="false"/>
+              <w:spacing w:after="0" w:before="0" w:line="340" w:beforeAutospacing="false" w:afterAutospacing="false"/>
               <w:contextualSpacing w:val="false"/>
             </w:pPr>
           </w:p>
@@ -560,7 +560,7 @@
           </w:tcPr>
           <w:p>
             <w:pPr>
-              <w:spacing w:before="0" w:after="0" w:line="340"/>
+              <w:spacing w:after="0" w:before="0" w:line="340"/>
             </w:pPr>
             <w:r>
               <w:rPr>
@@ -595,7 +595,7 @@
           </w:tcPr>
           <w:p>
             <w:pPr>
-              <w:spacing w:before="0" w:after="0" w:line="340" w:beforeAutospacing="false" w:afterAutospacing="false"/>
+              <w:spacing w:after="0" w:before="0" w:line="340" w:beforeAutospacing="false" w:afterAutospacing="false"/>
               <w:contextualSpacing w:val="false"/>
             </w:pPr>
             <w:r>
@@ -636,7 +636,7 @@
           </w:tcPr>
           <w:p>
             <w:pPr>
-              <w:spacing w:before="0" w:after="0" w:line="340"/>
+              <w:spacing w:after="0" w:before="0" w:line="340"/>
             </w:pPr>
             <w:r>
               <w:rPr>
@@ -671,7 +671,7 @@
           </w:tcPr>
           <w:p>
             <w:pPr>
-              <w:spacing w:before="0" w:after="0" w:line="340" w:beforeAutospacing="false" w:afterAutospacing="false"/>
+              <w:spacing w:after="0" w:before="0" w:line="340" w:beforeAutospacing="false" w:afterAutospacing="false"/>
               <w:contextualSpacing w:val="false"/>
             </w:pPr>
             <w:r>
@@ -724,7 +724,7 @@
           </w:p>
           <w:p>
             <w:pPr>
-              <w:spacing w:before="0" w:after="0" w:line="240"/>
+              <w:spacing w:after="0" w:before="0" w:line="240"/>
             </w:pPr>
             <w:r>
               <w:rPr>
@@ -759,7 +759,7 @@
           </w:tcPr>
           <w:p>
             <w:pPr>
-              <w:spacing w:before="0" w:after="0" w:line="340" w:beforeAutospacing="false" w:afterAutospacing="false"/>
+              <w:spacing w:after="0" w:before="0" w:line="340" w:beforeAutospacing="false" w:afterAutospacing="false"/>
               <w:contextualSpacing w:val="false"/>
             </w:pPr>
             <w:r>
@@ -812,7 +812,7 @@
           </w:p>
           <w:p>
             <w:pPr>
-              <w:spacing w:before="0" w:after="0" w:line="340"/>
+              <w:spacing w:after="0" w:before="0" w:line="340"/>
             </w:pPr>
             <w:r>
               <w:rPr>
@@ -847,7 +847,7 @@
           </w:tcPr>
           <w:p>
             <w:pPr>
-              <w:spacing w:before="0" w:after="0" w:line="340" w:beforeAutospacing="false" w:afterAutospacing="false"/>
+              <w:spacing w:after="0" w:before="0" w:line="340" w:beforeAutospacing="false" w:afterAutospacing="false"/>
               <w:contextualSpacing w:val="false"/>
             </w:pPr>
             <w:r>
@@ -900,7 +900,7 @@
           </w:p>
           <w:p>
             <w:pPr>
-              <w:spacing w:before="0" w:after="0" w:line="240"/>
+              <w:spacing w:after="0" w:before="0" w:line="240"/>
             </w:pPr>
             <w:r>
               <w:rPr>
@@ -935,7 +935,7 @@
           </w:tcPr>
           <w:p>
             <w:pPr>
-              <w:spacing w:before="0" w:after="0" w:line="340" w:beforeAutospacing="false" w:afterAutospacing="false"/>
+              <w:spacing w:after="0" w:before="0" w:line="340" w:beforeAutospacing="false" w:afterAutospacing="false"/>
               <w:contextualSpacing w:val="false"/>
             </w:pPr>
             <w:r>
@@ -988,7 +988,7 @@
           </w:p>
           <w:p>
             <w:pPr>
-              <w:spacing w:before="0" w:after="0" w:line="340"/>
+              <w:spacing w:after="0" w:before="0" w:line="340"/>
             </w:pPr>
             <w:r>
               <w:rPr>
@@ -1023,7 +1023,7 @@
           </w:tcPr>
           <w:p>
             <w:pPr>
-              <w:spacing w:before="0" w:after="0" w:line="340" w:beforeAutospacing="false" w:afterAutospacing="false"/>
+              <w:spacing w:after="0" w:before="0" w:line="340" w:beforeAutospacing="false" w:afterAutospacing="false"/>
               <w:contextualSpacing w:val="false"/>
             </w:pPr>
             <w:r>
@@ -1076,7 +1076,7 @@
           </w:p>
           <w:p>
             <w:pPr>
-              <w:spacing w:before="0" w:after="0" w:line="240"/>
+              <w:spacing w:after="0" w:before="0" w:line="240"/>
             </w:pPr>
             <w:r>
               <w:rPr>
@@ -1111,7 +1111,7 @@
           </w:tcPr>
           <w:p>
             <w:pPr>
-              <w:spacing w:before="0" w:after="0" w:line="340" w:beforeAutospacing="false" w:afterAutospacing="false"/>
+              <w:spacing w:after="0" w:before="0" w:line="340" w:beforeAutospacing="false" w:afterAutospacing="false"/>
               <w:contextualSpacing w:val="false"/>
             </w:pPr>
             <w:r>
@@ -1164,7 +1164,7 @@
           </w:p>
           <w:p>
             <w:pPr>
-              <w:spacing w:before="0" w:after="0" w:line="340"/>
+              <w:spacing w:after="0" w:before="0" w:line="340"/>
             </w:pPr>
             <w:r>
               <w:rPr>
@@ -1199,7 +1199,7 @@
           </w:tcPr>
           <w:p>
             <w:pPr>
-              <w:spacing w:before="0" w:after="0" w:line="340" w:beforeAutospacing="false" w:afterAutospacing="false"/>
+              <w:spacing w:after="0" w:before="0" w:line="340" w:beforeAutospacing="false" w:afterAutospacing="false"/>
               <w:contextualSpacing w:val="false"/>
             </w:pPr>
             <w:r>
@@ -1252,7 +1252,7 @@
           </w:p>
           <w:p>
             <w:pPr>
-              <w:spacing w:before="0" w:after="0" w:line="340"/>
+              <w:spacing w:after="0" w:before="0" w:line="340"/>
             </w:pPr>
             <w:r>
               <w:rPr>
@@ -1287,7 +1287,7 @@
           </w:tcPr>
           <w:p>
             <w:pPr>
-              <w:spacing w:before="0" w:after="0" w:line="340" w:beforeAutospacing="false" w:afterAutospacing="false"/>
+              <w:spacing w:after="0" w:before="0" w:line="340" w:beforeAutospacing="false" w:afterAutospacing="false"/>
               <w:contextualSpacing w:val="false"/>
             </w:pPr>
             <w:r>
@@ -1340,7 +1340,7 @@
           </w:p>
           <w:p>
             <w:pPr>
-              <w:spacing w:before="0" w:after="0" w:line="340"/>
+              <w:spacing w:after="0" w:before="0" w:line="340"/>
             </w:pPr>
             <w:r>
               <w:rPr>
@@ -1375,7 +1375,7 @@
           </w:tcPr>
           <w:p>
             <w:pPr>
-              <w:spacing w:before="0" w:after="0" w:line="340" w:beforeAutospacing="false" w:afterAutospacing="false"/>
+              <w:spacing w:after="0" w:before="0" w:line="340" w:beforeAutospacing="false" w:afterAutospacing="false"/>
               <w:contextualSpacing w:val="false"/>
             </w:pPr>
             <w:r>
@@ -1428,7 +1428,7 @@
           </w:p>
           <w:p>
             <w:pPr>
-              <w:spacing w:before="0" w:after="0" w:line="340"/>
+              <w:spacing w:after="0" w:before="0" w:line="340"/>
             </w:pPr>
             <w:r>
               <w:rPr>
@@ -1463,7 +1463,7 @@
           </w:tcPr>
           <w:p>
             <w:pPr>
-              <w:spacing w:before="0" w:after="0" w:line="340" w:beforeAutospacing="false" w:afterAutospacing="false"/>
+              <w:spacing w:after="0" w:before="0" w:line="340" w:beforeAutospacing="false" w:afterAutospacing="false"/>
               <w:contextualSpacing w:val="false"/>
             </w:pPr>
             <w:r>
@@ -1516,7 +1516,7 @@
           </w:p>
           <w:p>
             <w:pPr>
-              <w:spacing w:before="0" w:after="0" w:line="240"/>
+              <w:spacing w:after="0" w:before="0" w:line="240"/>
             </w:pPr>
             <w:r>
               <w:rPr>
@@ -1551,7 +1551,7 @@
           </w:tcPr>
           <w:p>
             <w:pPr>
-              <w:spacing w:before="0" w:after="0" w:line="340" w:beforeAutospacing="false" w:afterAutospacing="false"/>
+              <w:spacing w:after="0" w:before="0" w:line="340" w:beforeAutospacing="false" w:afterAutospacing="false"/>
               <w:contextualSpacing w:val="false"/>
             </w:pPr>
             <w:r>
@@ -1604,7 +1604,7 @@
           </w:p>
           <w:p>
             <w:pPr>
-              <w:spacing w:before="0" w:after="0" w:line="340"/>
+              <w:spacing w:after="0" w:before="0" w:line="340"/>
             </w:pPr>
             <w:r>
               <w:rPr>
@@ -1639,7 +1639,7 @@
           </w:tcPr>
           <w:p>
             <w:pPr>
-              <w:spacing w:before="0" w:after="0" w:line="340" w:beforeAutospacing="false" w:afterAutospacing="false"/>
+              <w:spacing w:after="0" w:before="0" w:line="340" w:beforeAutospacing="false" w:afterAutospacing="false"/>
               <w:contextualSpacing w:val="false"/>
             </w:pPr>
             <w:r>
@@ -1692,7 +1692,7 @@
           </w:p>
           <w:p>
             <w:pPr>
-              <w:spacing w:before="0" w:after="0" w:line="240"/>
+              <w:spacing w:after="0" w:before="0" w:line="240"/>
             </w:pPr>
             <w:r>
               <w:rPr>
@@ -1727,7 +1727,7 @@
           </w:tcPr>
           <w:p>
             <w:pPr>
-              <w:spacing w:before="0" w:after="0" w:line="340" w:beforeAutospacing="false" w:afterAutospacing="false"/>
+              <w:spacing w:after="0" w:before="0" w:line="340" w:beforeAutospacing="false" w:afterAutospacing="false"/>
               <w:contextualSpacing w:val="false"/>
             </w:pPr>
             <w:r>
@@ -1780,7 +1780,7 @@
           </w:p>
           <w:p>
             <w:pPr>
-              <w:spacing w:before="0" w:after="0" w:line="340"/>
+              <w:spacing w:after="0" w:before="0" w:line="340"/>
             </w:pPr>
             <w:r>
               <w:rPr>
@@ -1815,7 +1815,7 @@
           </w:tcPr>
           <w:p>
             <w:pPr>
-              <w:spacing w:before="0" w:after="0" w:line="340" w:beforeAutospacing="false" w:afterAutospacing="false"/>
+              <w:spacing w:after="0" w:before="0" w:line="340" w:beforeAutospacing="false" w:afterAutospacing="false"/>
               <w:contextualSpacing w:val="false"/>
             </w:pPr>
             <w:r>
@@ -1868,7 +1868,7 @@
           </w:p>
           <w:p>
             <w:pPr>
-              <w:spacing w:before="0" w:after="0" w:line="240"/>
+              <w:spacing w:after="0" w:before="0" w:line="240"/>
             </w:pPr>
             <w:r>
               <w:rPr>
@@ -1903,7 +1903,7 @@
           </w:tcPr>
           <w:p>
             <w:pPr>
-              <w:spacing w:before="0" w:after="0" w:line="340" w:beforeAutospacing="false" w:afterAutospacing="false"/>
+              <w:spacing w:after="0" w:before="0" w:line="340" w:beforeAutospacing="false" w:afterAutospacing="false"/>
               <w:contextualSpacing w:val="false"/>
             </w:pPr>
           </w:p>
@@ -1931,7 +1931,7 @@
           </w:tcPr>
           <w:p>
             <w:pPr>
-              <w:spacing w:before="0" w:after="0" w:line="340"/>
+              <w:spacing w:after="0" w:before="0" w:line="340"/>
             </w:pPr>
             <w:r>
               <w:rPr>
@@ -1966,7 +1966,7 @@
           </w:tcPr>
           <w:p>
             <w:pPr>
-              <w:spacing w:before="0" w:after="0" w:line="340" w:beforeAutospacing="false" w:afterAutospacing="false"/>
+              <w:spacing w:after="0" w:before="0" w:line="340" w:beforeAutospacing="false" w:afterAutospacing="false"/>
               <w:contextualSpacing w:val="false"/>
             </w:pPr>
             <w:r>
@@ -1989,8 +1989,8 @@
     <w:p>
       <w:pPr>
         <w:sectPr>
-          <w:headerReference w:type="default" r:id="rId6"/>
-          <w:footerReference w:type="default" r:id="rId7"/>
+          <w:headerReference w:type="default" r:id="rId7"/>
+          <w:footerReference w:type="default" r:id="rId8"/>
           <w:pgSz w:w="11906" w:h="16838" w:orient="portrait"/>
           <w:pgMar w:top="936" w:right="1080" w:bottom="720" w:left="1080" w:header="360" w:footer="432" w:gutter="0"/>
           <w:pgNumType/>
@@ -2000,7 +2000,7 @@
     </w:p>
     <w:p>
       <w:pPr>
-        <w:spacing w:before="0" w:after="240" w:line="340" w:beforeAutospacing="false" w:afterAutospacing="false"/>
+        <w:spacing w:after="240" w:before="0" w:line="340" w:beforeAutospacing="false" w:afterAutospacing="false"/>
         <w:contextualSpacing w:val="false"/>
       </w:pPr>
       <w:r>
@@ -2018,7 +2018,7 @@
     <w:p>
       <w:pPr>
         <w:pStyle w:val="OAClauseHeading"/>
-        <w:spacing w:before="320" w:after="120" w:line="340" w:beforeAutospacing="false" w:afterAutospacing="false"/>
+        <w:spacing w:after="120" w:before="320" w:line="340" w:beforeAutospacing="false" w:afterAutospacing="false"/>
         <w:contextualSpacing w:val="false"/>
       </w:pPr>
       <w:r>
@@ -2036,7 +2036,7 @@
     <w:p>
       <w:pPr>
         <w:pStyle w:val="OAClauseBody"/>
-        <w:spacing w:before="0" w:after="280" w:line="340" w:beforeAutospacing="false" w:afterAutospacing="false"/>
+        <w:spacing w:after="280" w:before="0" w:line="340" w:beforeAutospacing="false" w:afterAutospacing="false"/>
         <w:contextualSpacing w:val="false"/>
       </w:pPr>
       <w:r>
@@ -2072,7 +2072,7 @@
     <w:p>
       <w:pPr>
         <w:pStyle w:val="OAClauseBody"/>
-        <w:spacing w:before="320" w:after="280" w:line="340" w:beforeAutospacing="false" w:afterAutospacing="false"/>
+        <w:spacing w:after="280" w:before="320" w:line="340" w:beforeAutospacing="false" w:afterAutospacing="false"/>
         <w:contextualSpacing w:val="false"/>
       </w:pPr>
       <w:r>
@@ -2108,7 +2108,7 @@
     <w:p>
       <w:pPr>
         <w:pStyle w:val="OAClauseBody"/>
-        <w:spacing w:before="320" w:after="280" w:line="340" w:beforeAutospacing="false" w:afterAutospacing="false"/>
+        <w:spacing w:after="280" w:before="320" w:line="340" w:beforeAutospacing="false" w:afterAutospacing="false"/>
         <w:contextualSpacing w:val="false"/>
       </w:pPr>
       <w:r>
@@ -2144,7 +2144,7 @@
     <w:p>
       <w:pPr>
         <w:pStyle w:val="OAClauseBody"/>
-        <w:spacing w:before="320" w:after="280" w:line="340" w:beforeAutospacing="false" w:afterAutospacing="false"/>
+        <w:spacing w:after="280" w:before="320" w:line="340" w:beforeAutospacing="false" w:afterAutospacing="false"/>
         <w:contextualSpacing w:val="false"/>
       </w:pPr>
       <w:r>
@@ -2180,7 +2180,7 @@
     <w:p>
       <w:pPr>
         <w:pStyle w:val="OAClauseBody"/>
-        <w:spacing w:before="320" w:after="280" w:line="340" w:beforeAutospacing="false" w:afterAutospacing="false"/>
+        <w:spacing w:after="280" w:before="320" w:line="340" w:beforeAutospacing="false" w:afterAutospacing="false"/>
         <w:contextualSpacing w:val="false"/>
       </w:pPr>
       <w:r>
@@ -2216,7 +2216,7 @@
     <w:p>
       <w:pPr>
         <w:pStyle w:val="OAClauseBody"/>
-        <w:spacing w:before="320" w:after="280" w:line="340" w:beforeAutospacing="false" w:afterAutospacing="false"/>
+        <w:spacing w:after="280" w:before="320" w:line="340" w:beforeAutospacing="false" w:afterAutospacing="false"/>
         <w:contextualSpacing w:val="false"/>
       </w:pPr>
       <w:r>
@@ -2252,7 +2252,7 @@
     <w:p>
       <w:pPr>
         <w:pStyle w:val="OAClauseBody"/>
-        <w:spacing w:before="320" w:after="280" w:line="340" w:beforeAutospacing="false" w:afterAutospacing="false"/>
+        <w:spacing w:after="280" w:before="320" w:line="340" w:beforeAutospacing="false" w:afterAutospacing="false"/>
         <w:contextualSpacing w:val="false"/>
       </w:pPr>
       <w:r>
@@ -2288,7 +2288,7 @@
     <w:p>
       <w:pPr>
         <w:pStyle w:val="OAClauseBody"/>
-        <w:spacing w:before="320" w:after="280" w:line="340" w:beforeAutospacing="false" w:afterAutospacing="false"/>
+        <w:spacing w:after="280" w:before="320" w:line="340" w:beforeAutospacing="false" w:afterAutospacing="false"/>
         <w:contextualSpacing w:val="false"/>
       </w:pPr>
       <w:r>
@@ -2324,7 +2324,7 @@
     <w:p>
       <w:pPr>
         <w:pStyle w:val="OAClauseBody"/>
-        <w:spacing w:before="320" w:after="280" w:line="340" w:beforeAutospacing="false" w:afterAutospacing="false"/>
+        <w:spacing w:after="280" w:before="320" w:line="340" w:beforeAutospacing="false" w:afterAutospacing="false"/>
         <w:contextualSpacing w:val="false"/>
       </w:pPr>
       <w:r>
@@ -2360,7 +2360,7 @@
     <w:p>
       <w:pPr>
         <w:pStyle w:val="OAClauseBody"/>
-        <w:spacing w:before="320" w:after="280" w:line="340" w:beforeAutospacing="false" w:afterAutospacing="false"/>
+        <w:spacing w:after="280" w:before="320" w:line="340" w:beforeAutospacing="false" w:afterAutospacing="false"/>
         <w:contextualSpacing w:val="false"/>
       </w:pPr>
       <w:r>
@@ -2396,7 +2396,7 @@
     <w:p>
       <w:pPr>
         <w:pStyle w:val="OAClauseHeading"/>
-        <w:spacing w:before="320" w:after="120" w:line="340" w:beforeAutospacing="false" w:afterAutospacing="false"/>
+        <w:spacing w:after="120" w:before="320" w:line="340" w:beforeAutospacing="false" w:afterAutospacing="false"/>
         <w:contextualSpacing w:val="false"/>
       </w:pPr>
       <w:r>
@@ -2414,7 +2414,7 @@
     <w:p>
       <w:pPr>
         <w:pStyle w:val="OAClauseBody"/>
-        <w:spacing w:before="0" w:after="280" w:line="340" w:beforeAutospacing="false" w:afterAutospacing="false"/>
+        <w:spacing w:after="280" w:before="0" w:line="340" w:beforeAutospacing="false" w:afterAutospacing="false"/>
         <w:contextualSpacing w:val="false"/>
       </w:pPr>
       <w:r>
@@ -2434,7 +2434,7 @@
     <w:p>
       <w:pPr>
         <w:pStyle w:val="OAClauseHeading"/>
-        <w:spacing w:before="320" w:after="120" w:line="340" w:beforeAutospacing="false" w:afterAutospacing="false"/>
+        <w:spacing w:after="120" w:before="320" w:line="340" w:beforeAutospacing="false" w:afterAutospacing="false"/>
         <w:contextualSpacing w:val="false"/>
       </w:pPr>
       <w:r>
@@ -2452,7 +2452,7 @@
     <w:p>
       <w:pPr>
         <w:pStyle w:val="OAClauseBody"/>
-        <w:spacing w:before="0" w:after="280" w:line="340" w:beforeAutospacing="false" w:afterAutospacing="false"/>
+        <w:spacing w:after="280" w:before="0" w:line="340" w:beforeAutospacing="false" w:afterAutospacing="false"/>
         <w:contextualSpacing w:val="false"/>
       </w:pPr>
       <w:r>
@@ -2472,7 +2472,7 @@
     <w:p>
       <w:pPr>
         <w:pStyle w:val="OAClauseHeading"/>
-        <w:spacing w:before="320" w:after="120" w:line="340" w:beforeAutospacing="false" w:afterAutospacing="false"/>
+        <w:spacing w:after="120" w:before="320" w:line="340" w:beforeAutospacing="false" w:afterAutospacing="false"/>
         <w:contextualSpacing w:val="false"/>
       </w:pPr>
       <w:r>
@@ -2490,7 +2490,7 @@
     <w:p>
       <w:pPr>
         <w:pStyle w:val="OAClauseBody"/>
-        <w:spacing w:before="0" w:after="280" w:line="340" w:beforeAutospacing="false" w:afterAutospacing="false"/>
+        <w:spacing w:after="280" w:before="0" w:line="340" w:beforeAutospacing="false" w:afterAutospacing="false"/>
         <w:contextualSpacing w:val="false"/>
       </w:pPr>
       <w:r>
@@ -2510,7 +2510,7 @@
     <w:p>
       <w:pPr>
         <w:pStyle w:val="OAClauseHeading"/>
-        <w:spacing w:before="320" w:after="120" w:line="340" w:beforeAutospacing="false" w:afterAutospacing="false"/>
+        <w:spacing w:after="120" w:before="320" w:line="340" w:beforeAutospacing="false" w:afterAutospacing="false"/>
         <w:contextualSpacing w:val="false"/>
       </w:pPr>
       <w:r>
@@ -2528,7 +2528,7 @@
     <w:p>
       <w:pPr>
         <w:pStyle w:val="OAClauseBody"/>
-        <w:spacing w:before="0" w:after="280" w:line="340" w:beforeAutospacing="false" w:afterAutospacing="false"/>
+        <w:spacing w:after="280" w:before="0" w:line="340" w:beforeAutospacing="false" w:afterAutospacing="false"/>
         <w:contextualSpacing w:val="false"/>
       </w:pPr>
       <w:r>
@@ -2548,7 +2548,7 @@
     <w:p>
       <w:pPr>
         <w:pStyle w:val="OAClauseHeading"/>
-        <w:spacing w:before="320" w:after="120" w:line="340" w:beforeAutospacing="false" w:afterAutospacing="false"/>
+        <w:spacing w:after="120" w:before="320" w:line="340" w:beforeAutospacing="false" w:afterAutospacing="false"/>
         <w:contextualSpacing w:val="false"/>
       </w:pPr>
       <w:r>
@@ -2566,7 +2566,7 @@
     <w:p>
       <w:pPr>
         <w:pStyle w:val="OAClauseBody"/>
-        <w:spacing w:before="0" w:after="280" w:line="340" w:beforeAutospacing="false" w:afterAutospacing="false"/>
+        <w:spacing w:after="280" w:before="0" w:line="340" w:beforeAutospacing="false" w:afterAutospacing="false"/>
         <w:contextualSpacing w:val="false"/>
       </w:pPr>
       <w:r>
@@ -2586,7 +2586,7 @@
     <w:p>
       <w:pPr>
         <w:pStyle w:val="OAClauseBody"/>
-        <w:spacing w:before="0" w:after="280" w:line="340" w:beforeAutospacing="false" w:afterAutospacing="false"/>
+        <w:spacing w:after="280" w:before="0" w:line="340" w:beforeAutospacing="false" w:afterAutospacing="false"/>
         <w:contextualSpacing w:val="false"/>
       </w:pPr>
       <w:r>
@@ -2606,7 +2606,7 @@
     <w:p>
       <w:pPr>
         <w:pStyle w:val="OAClauseBody"/>
-        <w:spacing w:before="0" w:after="280" w:line="340" w:beforeAutospacing="false" w:afterAutospacing="false"/>
+        <w:spacing w:after="280" w:before="0" w:line="340" w:beforeAutospacing="false" w:afterAutospacing="false"/>
         <w:contextualSpacing w:val="false"/>
       </w:pPr>
       <w:r>
@@ -2626,7 +2626,7 @@
     <w:p>
       <w:pPr>
         <w:pStyle w:val="OAClauseBody"/>
-        <w:spacing w:before="0" w:after="280" w:line="340" w:beforeAutospacing="false" w:afterAutospacing="false"/>
+        <w:spacing w:after="280" w:before="0" w:line="340" w:beforeAutospacing="false" w:afterAutospacing="false"/>
         <w:contextualSpacing w:val="false"/>
       </w:pPr>
       <w:r>
@@ -2646,7 +2646,7 @@
     <w:p>
       <w:pPr>
         <w:pStyle w:val="OAClauseBody"/>
-        <w:spacing w:before="0" w:after="280" w:line="340" w:beforeAutospacing="false" w:afterAutospacing="false"/>
+        <w:spacing w:after="280" w:before="0" w:line="340" w:beforeAutospacing="false" w:afterAutospacing="false"/>
         <w:contextualSpacing w:val="false"/>
       </w:pPr>
       <w:r>
@@ -2666,7 +2666,7 @@
     <w:p>
       <w:pPr>
         <w:pStyle w:val="OAClauseBody"/>
-        <w:spacing w:before="0" w:after="280" w:line="340" w:beforeAutospacing="false" w:afterAutospacing="false"/>
+        <w:spacing w:after="280" w:before="0" w:line="340" w:beforeAutospacing="false" w:afterAutospacing="false"/>
         <w:contextualSpacing w:val="false"/>
       </w:pPr>
       <w:r>
@@ -2686,7 +2686,7 @@
     <w:p>
       <w:pPr>
         <w:pStyle w:val="OAClauseHeading"/>
-        <w:spacing w:before="320" w:after="120" w:line="340" w:beforeAutospacing="false" w:afterAutospacing="false"/>
+        <w:spacing w:after="120" w:before="320" w:line="340" w:beforeAutospacing="false" w:afterAutospacing="false"/>
         <w:contextualSpacing w:val="false"/>
       </w:pPr>
       <w:r>
@@ -2704,7 +2704,7 @@
     <w:p>
       <w:pPr>
         <w:pStyle w:val="OAClauseBody"/>
-        <w:spacing w:before="0" w:after="280" w:line="340" w:beforeAutospacing="false" w:afterAutospacing="false"/>
+        <w:spacing w:after="280" w:before="0" w:line="340" w:beforeAutospacing="false" w:afterAutospacing="false"/>
         <w:contextualSpacing w:val="false"/>
       </w:pPr>
       <w:r>
@@ -2724,7 +2724,7 @@
     <w:p>
       <w:pPr>
         <w:pStyle w:val="OAClauseBody"/>
-        <w:spacing w:before="0" w:after="280" w:line="340" w:beforeAutospacing="false" w:afterAutospacing="false"/>
+        <w:spacing w:after="280" w:before="0" w:line="340" w:beforeAutospacing="false" w:afterAutospacing="false"/>
         <w:contextualSpacing w:val="false"/>
       </w:pPr>
       <w:r>
@@ -2744,7 +2744,7 @@
     <w:p>
       <w:pPr>
         <w:pStyle w:val="OAClauseBody"/>
-        <w:spacing w:before="0" w:after="280" w:line="340" w:beforeAutospacing="false" w:afterAutospacing="false"/>
+        <w:spacing w:after="280" w:before="0" w:line="340" w:beforeAutospacing="false" w:afterAutospacing="false"/>
         <w:contextualSpacing w:val="false"/>
       </w:pPr>
       <w:r>
@@ -2764,7 +2764,7 @@
     <w:p>
       <w:pPr>
         <w:pStyle w:val="OAClauseBody"/>
-        <w:spacing w:before="0" w:after="280" w:line="340" w:beforeAutospacing="false" w:afterAutospacing="false"/>
+        <w:spacing w:after="280" w:before="0" w:line="340" w:beforeAutospacing="false" w:afterAutospacing="false"/>
         <w:contextualSpacing w:val="false"/>
       </w:pPr>
       <w:r>
@@ -2784,7 +2784,7 @@
     <w:p>
       <w:pPr>
         <w:pStyle w:val="OAClauseBody"/>
-        <w:spacing w:before="0" w:after="280" w:line="340" w:beforeAutospacing="false" w:afterAutospacing="false"/>
+        <w:spacing w:after="280" w:before="0" w:line="340" w:beforeAutospacing="false" w:afterAutospacing="false"/>
         <w:contextualSpacing w:val="false"/>
       </w:pPr>
       <w:r>
@@ -2804,7 +2804,7 @@
     <w:p>
       <w:pPr>
         <w:pStyle w:val="OAClauseBody"/>
-        <w:spacing w:before="0" w:after="280" w:line="340" w:beforeAutospacing="false" w:afterAutospacing="false"/>
+        <w:spacing w:after="280" w:before="0" w:line="340" w:beforeAutospacing="false" w:afterAutospacing="false"/>
         <w:contextualSpacing w:val="false"/>
       </w:pPr>
       <w:r>
@@ -2824,7 +2824,7 @@
     <w:p>
       <w:pPr>
         <w:pStyle w:val="OAClauseHeading"/>
-        <w:spacing w:before="320" w:after="120" w:line="340" w:beforeAutospacing="false" w:afterAutospacing="false"/>
+        <w:spacing w:after="120" w:before="320" w:line="340" w:beforeAutospacing="false" w:afterAutospacing="false"/>
         <w:contextualSpacing w:val="false"/>
       </w:pPr>
       <w:r>
@@ -2842,7 +2842,7 @@
     <w:p>
       <w:pPr>
         <w:pStyle w:val="OAClauseBody"/>
-        <w:spacing w:before="0" w:after="280" w:line="340" w:beforeAutospacing="false" w:afterAutospacing="false"/>
+        <w:spacing w:after="280" w:before="0" w:line="340" w:beforeAutospacing="false" w:afterAutospacing="false"/>
         <w:contextualSpacing w:val="false"/>
       </w:pPr>
       <w:r>
@@ -2862,7 +2862,7 @@
     <w:p>
       <w:pPr>
         <w:pStyle w:val="OAClauseBody"/>
-        <w:spacing w:before="0" w:after="280" w:line="340" w:beforeAutospacing="false" w:afterAutospacing="false"/>
+        <w:spacing w:after="280" w:before="0" w:line="340" w:beforeAutospacing="false" w:afterAutospacing="false"/>
         <w:contextualSpacing w:val="false"/>
       </w:pPr>
       <w:r>
@@ -2882,7 +2882,7 @@
     <w:p>
       <w:pPr>
         <w:pStyle w:val="OAClauseBody"/>
-        <w:spacing w:before="0" w:after="280" w:line="340" w:beforeAutospacing="false" w:afterAutospacing="false"/>
+        <w:spacing w:after="280" w:before="0" w:line="340" w:beforeAutospacing="false" w:afterAutospacing="false"/>
         <w:contextualSpacing w:val="false"/>
       </w:pPr>
       <w:r>
@@ -2902,7 +2902,7 @@
     <w:p>
       <w:pPr>
         <w:pStyle w:val="OAClauseBody"/>
-        <w:spacing w:before="0" w:after="280" w:line="340" w:beforeAutospacing="false" w:afterAutospacing="false"/>
+        <w:spacing w:after="280" w:before="0" w:line="340" w:beforeAutospacing="false" w:afterAutospacing="false"/>
         <w:contextualSpacing w:val="false"/>
       </w:pPr>
       <w:r>
@@ -2922,7 +2922,7 @@
     <w:p>
       <w:pPr>
         <w:pStyle w:val="OAClauseBody"/>
-        <w:spacing w:before="0" w:after="280" w:line="340" w:beforeAutospacing="false" w:afterAutospacing="false"/>
+        <w:spacing w:after="280" w:before="0" w:line="340" w:beforeAutospacing="false" w:afterAutospacing="false"/>
         <w:contextualSpacing w:val="false"/>
       </w:pPr>
       <w:r>
@@ -2942,7 +2942,7 @@
     <w:p>
       <w:pPr>
         <w:pStyle w:val="OAClauseBody"/>
-        <w:spacing w:before="0" w:after="280" w:line="340" w:beforeAutospacing="false" w:afterAutospacing="false"/>
+        <w:spacing w:after="280" w:before="0" w:line="340" w:beforeAutospacing="false" w:afterAutospacing="false"/>
         <w:contextualSpacing w:val="false"/>
       </w:pPr>
       <w:r>
@@ -2962,7 +2962,7 @@
     <w:p>
       <w:pPr>
         <w:pStyle w:val="OAClauseHeading"/>
-        <w:spacing w:before="320" w:after="120" w:line="340" w:beforeAutospacing="false" w:afterAutospacing="false"/>
+        <w:spacing w:after="120" w:before="320" w:line="340" w:beforeAutospacing="false" w:afterAutospacing="false"/>
         <w:contextualSpacing w:val="false"/>
       </w:pPr>
       <w:r>
@@ -2980,7 +2980,7 @@
     <w:p>
       <w:pPr>
         <w:pStyle w:val="OAClauseBody"/>
-        <w:spacing w:before="0" w:after="280" w:line="340" w:beforeAutospacing="false" w:afterAutospacing="false"/>
+        <w:spacing w:after="280" w:before="0" w:line="340" w:beforeAutospacing="false" w:afterAutospacing="false"/>
         <w:contextualSpacing w:val="false"/>
       </w:pPr>
       <w:r>
@@ -3000,7 +3000,7 @@
     <w:p>
       <w:pPr>
         <w:pStyle w:val="OAClauseBody"/>
-        <w:spacing w:before="0" w:after="280" w:line="340" w:beforeAutospacing="false" w:afterAutospacing="false"/>
+        <w:spacing w:after="280" w:before="0" w:line="340" w:beforeAutospacing="false" w:afterAutospacing="false"/>
         <w:contextualSpacing w:val="false"/>
       </w:pPr>
       <w:r>
@@ -3020,7 +3020,7 @@
     <w:p>
       <w:pPr>
         <w:pStyle w:val="OAClauseBody"/>
-        <w:spacing w:before="0" w:after="280" w:line="340" w:beforeAutospacing="false" w:afterAutospacing="false"/>
+        <w:spacing w:after="280" w:before="0" w:line="340" w:beforeAutospacing="false" w:afterAutospacing="false"/>
         <w:contextualSpacing w:val="false"/>
       </w:pPr>
       <w:r>
@@ -3040,7 +3040,7 @@
     <w:p>
       <w:pPr>
         <w:pStyle w:val="OAClauseBody"/>
-        <w:spacing w:before="0" w:after="280" w:line="340" w:beforeAutospacing="false" w:afterAutospacing="false"/>
+        <w:spacing w:after="280" w:before="0" w:line="340" w:beforeAutospacing="false" w:afterAutospacing="false"/>
         <w:contextualSpacing w:val="false"/>
       </w:pPr>
       <w:r>
@@ -3060,7 +3060,7 @@
     <w:p>
       <w:pPr>
         <w:pStyle w:val="OAClauseBody"/>
-        <w:spacing w:before="0" w:after="280" w:line="340" w:beforeAutospacing="false" w:afterAutospacing="false"/>
+        <w:spacing w:after="280" w:before="0" w:line="340" w:beforeAutospacing="false" w:afterAutospacing="false"/>
         <w:contextualSpacing w:val="false"/>
       </w:pPr>
       <w:r>
@@ -3080,7 +3080,7 @@
     <w:p>
       <w:pPr>
         <w:pStyle w:val="OAClauseBody"/>
-        <w:spacing w:before="0" w:after="280" w:line="340" w:beforeAutospacing="false" w:afterAutospacing="false"/>
+        <w:spacing w:after="280" w:before="0" w:line="340" w:beforeAutospacing="false" w:afterAutospacing="false"/>
         <w:contextualSpacing w:val="false"/>
       </w:pPr>
       <w:r>
@@ -3100,7 +3100,7 @@
     <w:p>
       <w:pPr>
         <w:pStyle w:val="OAClauseHeading"/>
-        <w:spacing w:before="320" w:after="120" w:line="340" w:beforeAutospacing="false" w:afterAutospacing="false"/>
+        <w:spacing w:after="120" w:before="320" w:line="340" w:beforeAutospacing="false" w:afterAutospacing="false"/>
         <w:contextualSpacing w:val="false"/>
       </w:pPr>
       <w:r>
@@ -3118,7 +3118,7 @@
     <w:p>
       <w:pPr>
         <w:pStyle w:val="OAClauseBody"/>
-        <w:spacing w:before="0" w:after="280" w:line="340" w:beforeAutospacing="false" w:afterAutospacing="false"/>
+        <w:spacing w:after="280" w:before="0" w:line="340" w:beforeAutospacing="false" w:afterAutospacing="false"/>
         <w:contextualSpacing w:val="false"/>
       </w:pPr>
       <w:r>
@@ -3138,7 +3138,7 @@
     <w:p>
       <w:pPr>
         <w:pStyle w:val="OAClauseBody"/>
-        <w:spacing w:before="0" w:after="280" w:line="340" w:beforeAutospacing="false" w:afterAutospacing="false"/>
+        <w:spacing w:after="280" w:before="0" w:line="340" w:beforeAutospacing="false" w:afterAutospacing="false"/>
         <w:contextualSpacing w:val="false"/>
       </w:pPr>
       <w:r>
@@ -3158,7 +3158,7 @@
     <w:p>
       <w:pPr>
         <w:pStyle w:val="OAClauseBody"/>
-        <w:spacing w:before="0" w:after="280" w:line="340" w:beforeAutospacing="false" w:afterAutospacing="false"/>
+        <w:spacing w:after="280" w:before="0" w:line="340" w:beforeAutospacing="false" w:afterAutospacing="false"/>
         <w:contextualSpacing w:val="false"/>
       </w:pPr>
       <w:r>
@@ -3178,7 +3178,7 @@
     <w:p>
       <w:pPr>
         <w:pStyle w:val="OAClauseBody"/>
-        <w:spacing w:before="0" w:after="280" w:line="340" w:beforeAutospacing="false" w:afterAutospacing="false"/>
+        <w:spacing w:after="280" w:before="0" w:line="340" w:beforeAutospacing="false" w:afterAutospacing="false"/>
         <w:contextualSpacing w:val="false"/>
       </w:pPr>
       <w:r>
@@ -3198,7 +3198,7 @@
     <w:p>
       <w:pPr>
         <w:pStyle w:val="OAClauseBody"/>
-        <w:spacing w:before="0" w:after="280" w:line="340" w:beforeAutospacing="false" w:afterAutospacing="false"/>
+        <w:spacing w:after="280" w:before="0" w:line="340" w:beforeAutospacing="false" w:afterAutospacing="false"/>
         <w:contextualSpacing w:val="false"/>
       </w:pPr>
       <w:r>
@@ -3218,7 +3218,7 @@
     <w:p>
       <w:pPr>
         <w:pStyle w:val="OAClauseBody"/>
-        <w:spacing w:before="0" w:after="280" w:line="340" w:beforeAutospacing="false" w:afterAutospacing="false"/>
+        <w:spacing w:after="280" w:before="0" w:line="340" w:beforeAutospacing="false" w:afterAutospacing="false"/>
         <w:contextualSpacing w:val="false"/>
       </w:pPr>
       <w:r>
@@ -3238,7 +3238,7 @@
     <w:p>
       <w:pPr>
         <w:pStyle w:val="OAClauseHeading"/>
-        <w:spacing w:before="320" w:after="120" w:line="340" w:beforeAutospacing="false" w:afterAutospacing="false"/>
+        <w:spacing w:after="120" w:before="320" w:line="340" w:beforeAutospacing="false" w:afterAutospacing="false"/>
         <w:contextualSpacing w:val="false"/>
       </w:pPr>
       <w:r>
@@ -3256,7 +3256,7 @@
     <w:p>
       <w:pPr>
         <w:pStyle w:val="OAClauseBody"/>
-        <w:spacing w:before="0" w:after="280" w:line="340" w:beforeAutospacing="false" w:afterAutospacing="false"/>
+        <w:spacing w:after="280" w:before="0" w:line="340" w:beforeAutospacing="false" w:afterAutospacing="false"/>
         <w:contextualSpacing w:val="false"/>
       </w:pPr>
       <w:r>
@@ -3276,7 +3276,7 @@
     <w:p>
       <w:pPr>
         <w:pStyle w:val="OAClauseHeading"/>
-        <w:spacing w:before="320" w:after="120" w:line="340" w:beforeAutospacing="false" w:afterAutospacing="false"/>
+        <w:spacing w:after="120" w:before="320" w:line="340" w:beforeAutospacing="false" w:afterAutospacing="false"/>
         <w:contextualSpacing w:val="false"/>
       </w:pPr>
       <w:r>
@@ -3294,7 +3294,7 @@
     <w:p>
       <w:pPr>
         <w:pStyle w:val="OAClauseBody"/>
-        <w:spacing w:before="0" w:after="280" w:line="340" w:beforeAutospacing="false" w:afterAutospacing="false"/>
+        <w:spacing w:after="280" w:before="0" w:line="340" w:beforeAutospacing="false" w:afterAutospacing="false"/>
         <w:contextualSpacing w:val="false"/>
       </w:pPr>
       <w:r>
@@ -3314,7 +3314,7 @@
     <w:p>
       <w:pPr>
         <w:pStyle w:val="OAClauseHeading"/>
-        <w:spacing w:before="320" w:after="120" w:line="340" w:beforeAutospacing="false" w:afterAutospacing="false"/>
+        <w:spacing w:after="120" w:before="320" w:line="340" w:beforeAutospacing="false" w:afterAutospacing="false"/>
         <w:contextualSpacing w:val="false"/>
       </w:pPr>
       <w:r>
@@ -3332,7 +3332,7 @@
     <w:p>
       <w:pPr>
         <w:pStyle w:val="OAClauseBody"/>
-        <w:spacing w:before="0" w:after="280" w:line="340" w:beforeAutospacing="false" w:afterAutospacing="false"/>
+        <w:spacing w:after="280" w:before="0" w:line="340" w:beforeAutospacing="false" w:afterAutospacing="false"/>
         <w:contextualSpacing w:val="false"/>
       </w:pPr>
       <w:r>
@@ -3352,7 +3352,7 @@
     <w:p>
       <w:pPr>
         <w:pStyle w:val="OAClauseHeading"/>
-        <w:spacing w:before="320" w:after="120" w:line="340" w:beforeAutospacing="false" w:afterAutospacing="false"/>
+        <w:spacing w:after="120" w:before="320" w:line="340" w:beforeAutospacing="false" w:afterAutospacing="false"/>
         <w:contextualSpacing w:val="false"/>
       </w:pPr>
       <w:r>
@@ -3370,7 +3370,7 @@
     <w:p>
       <w:pPr>
         <w:pStyle w:val="OAClauseBody"/>
-        <w:spacing w:before="0" w:after="280" w:line="340" w:beforeAutospacing="false" w:afterAutospacing="false"/>
+        <w:spacing w:after="280" w:before="0" w:line="340" w:beforeAutospacing="false" w:afterAutospacing="false"/>
         <w:contextualSpacing w:val="false"/>
       </w:pPr>
       <w:r>
@@ -3390,7 +3390,7 @@
     <w:p>
       <w:pPr>
         <w:pStyle w:val="OAClauseHeading"/>
-        <w:spacing w:before="320" w:after="120" w:line="340" w:beforeAutospacing="false" w:afterAutospacing="false"/>
+        <w:spacing w:after="120" w:before="320" w:line="340" w:beforeAutospacing="false" w:afterAutospacing="false"/>
         <w:contextualSpacing w:val="false"/>
       </w:pPr>
       <w:r>
@@ -3408,7 +3408,7 @@
     <w:p>
       <w:pPr>
         <w:pStyle w:val="OAClauseBody"/>
-        <w:spacing w:before="0" w:after="280" w:line="340" w:beforeAutospacing="false" w:afterAutospacing="false"/>
+        <w:spacing w:after="280" w:before="0" w:line="340" w:beforeAutospacing="false" w:afterAutospacing="false"/>
         <w:contextualSpacing w:val="false"/>
       </w:pPr>
       <w:r>
@@ -3428,7 +3428,7 @@
     <w:p>
       <w:pPr>
         <w:pStyle w:val="OAClauseHeading"/>
-        <w:spacing w:before="320" w:after="120" w:line="340" w:beforeAutospacing="false" w:afterAutospacing="false"/>
+        <w:spacing w:after="120" w:before="320" w:line="340" w:beforeAutospacing="false" w:afterAutospacing="false"/>
         <w:contextualSpacing w:val="false"/>
       </w:pPr>
       <w:r>
@@ -3446,7 +3446,7 @@
     <w:p>
       <w:pPr>
         <w:pStyle w:val="OAClauseBody"/>
-        <w:spacing w:before="0" w:after="280" w:line="340" w:beforeAutospacing="false" w:afterAutospacing="false"/>
+        <w:spacing w:after="280" w:before="0" w:line="340" w:beforeAutospacing="false" w:afterAutospacing="false"/>
         <w:contextualSpacing w:val="false"/>
       </w:pPr>
       <w:r>
@@ -3466,7 +3466,7 @@
     <w:p>
       <w:pPr>
         <w:pStyle w:val="OAClauseHeading"/>
-        <w:spacing w:before="320" w:after="120" w:line="340" w:beforeAutospacing="false" w:afterAutospacing="false"/>
+        <w:spacing w:after="120" w:before="320" w:line="340" w:beforeAutospacing="false" w:afterAutospacing="false"/>
         <w:contextualSpacing w:val="false"/>
       </w:pPr>
       <w:r>
@@ -3484,7 +3484,7 @@
     <w:p>
       <w:pPr>
         <w:pStyle w:val="OAClauseBody"/>
-        <w:spacing w:before="0" w:after="280" w:line="340" w:beforeAutospacing="false" w:afterAutospacing="false"/>
+        <w:spacing w:after="280" w:before="0" w:line="340" w:beforeAutospacing="false" w:afterAutospacing="false"/>
         <w:contextualSpacing w:val="false"/>
       </w:pPr>
       <w:r>
@@ -3504,7 +3504,7 @@
     <w:p>
       <w:pPr>
         <w:pStyle w:val="OAClauseHeading"/>
-        <w:spacing w:before="320" w:after="120" w:line="340" w:beforeAutospacing="false" w:afterAutospacing="false"/>
+        <w:spacing w:after="120" w:before="320" w:line="340" w:beforeAutospacing="false" w:afterAutospacing="false"/>
         <w:contextualSpacing w:val="false"/>
       </w:pPr>
       <w:r>
@@ -3522,7 +3522,7 @@
     <w:p>
       <w:pPr>
         <w:pStyle w:val="OAClauseBody"/>
-        <w:spacing w:before="0" w:after="280" w:line="340" w:beforeAutospacing="false" w:afterAutospacing="false"/>
+        <w:spacing w:after="280" w:before="0" w:line="340" w:beforeAutospacing="false" w:afterAutospacing="false"/>
         <w:contextualSpacing w:val="false"/>
       </w:pPr>
       <w:r>
@@ -3542,7 +3542,7 @@
     <w:p>
       <w:pPr>
         <w:pStyle w:val="OAClauseHeading"/>
-        <w:spacing w:before="320" w:after="120" w:line="340" w:beforeAutospacing="false" w:afterAutospacing="false"/>
+        <w:spacing w:after="120" w:before="320" w:line="340" w:beforeAutospacing="false" w:afterAutospacing="false"/>
         <w:contextualSpacing w:val="false"/>
       </w:pPr>
       <w:r>
@@ -3560,7 +3560,7 @@
     <w:p>
       <w:pPr>
         <w:pStyle w:val="OAClauseBody"/>
-        <w:spacing w:before="0" w:after="280" w:line="340" w:beforeAutospacing="false" w:afterAutospacing="false"/>
+        <w:spacing w:after="280" w:before="0" w:line="340" w:beforeAutospacing="false" w:afterAutospacing="false"/>
         <w:contextualSpacing w:val="false"/>
       </w:pPr>
       <w:r>
@@ -3580,7 +3580,7 @@
     <w:p>
       <w:pPr>
         <w:pStyle w:val="OAClauseHeading"/>
-        <w:spacing w:before="320" w:after="120" w:line="340" w:beforeAutospacing="false" w:afterAutospacing="false"/>
+        <w:spacing w:after="120" w:before="320" w:line="340" w:beforeAutospacing="false" w:afterAutospacing="false"/>
         <w:contextualSpacing w:val="false"/>
       </w:pPr>
       <w:r>
@@ -3598,7 +3598,7 @@
     <w:p>
       <w:pPr>
         <w:pStyle w:val="OAClauseBody"/>
-        <w:spacing w:before="0" w:after="280" w:line="340" w:beforeAutospacing="false" w:afterAutospacing="false"/>
+        <w:spacing w:after="280" w:before="0" w:line="340" w:beforeAutospacing="false" w:afterAutospacing="false"/>
         <w:contextualSpacing w:val="false"/>
       </w:pPr>
       <w:r>
@@ -3618,7 +3618,7 @@
     <w:p>
       <w:pPr>
         <w:pStyle w:val="OAClauseHeading"/>
-        <w:spacing w:before="320" w:after="120" w:line="340" w:beforeAutospacing="false" w:afterAutospacing="false"/>
+        <w:spacing w:after="120" w:before="320" w:line="340" w:beforeAutospacing="false" w:afterAutospacing="false"/>
         <w:contextualSpacing w:val="false"/>
       </w:pPr>
       <w:r>
@@ -3636,7 +3636,7 @@
     <w:p>
       <w:pPr>
         <w:pStyle w:val="OAClauseBody"/>
-        <w:spacing w:before="0" w:after="280" w:line="340" w:beforeAutospacing="false" w:afterAutospacing="false"/>
+        <w:spacing w:after="280" w:before="0" w:line="340" w:beforeAutospacing="false" w:afterAutospacing="false"/>
         <w:contextualSpacing w:val="false"/>
       </w:pPr>
       <w:r>
@@ -3656,8 +3656,8 @@
     <w:p>
       <w:pPr>
         <w:sectPr>
-          <w:headerReference w:type="default" r:id="rId8"/>
-          <w:footerReference w:type="default" r:id="rId9"/>
+          <w:headerReference w:type="default" r:id="rId9"/>
+          <w:footerReference w:type="default" r:id="rId10"/>
           <w:pgSz w:w="11906" w:h="16838" w:orient="portrait"/>
           <w:pgMar w:top="936" w:right="1080" w:bottom="720" w:left="1080" w:header="360" w:footer="432" w:gutter="0"/>
           <w:pgNumType/>
@@ -3667,7 +3667,7 @@
     </w:p>
     <w:p>
       <w:pPr>
-        <w:spacing w:before="0" w:after="240" w:line="340" w:beforeAutospacing="false" w:afterAutospacing="false"/>
+        <w:spacing w:after="240" w:before="0" w:line="340" w:beforeAutospacing="false" w:afterAutospacing="false"/>
         <w:contextualSpacing w:val="false"/>
       </w:pPr>
       <w:r>
@@ -3684,7 +3684,7 @@
     </w:p>
     <w:p>
       <w:pPr>
-        <w:spacing w:before="0" w:after="280" w:line="340" w:beforeAutospacing="false" w:afterAutospacing="false"/>
+        <w:spacing w:after="280" w:before="0" w:line="340" w:beforeAutospacing="false" w:afterAutospacing="false"/>
         <w:contextualSpacing w:val="false"/>
       </w:pPr>
       <w:r>
@@ -4335,8 +4335,8 @@
       </w:tr>
     </w:tbl>
     <w:sectPr>
-      <w:headerReference w:type="default" r:id="rId10"/>
-      <w:footerReference w:type="default" r:id="rId11"/>
+      <w:headerReference w:type="default" r:id="rId11"/>
+      <w:footerReference w:type="default" r:id="rId12"/>
       <w:pgSz w:w="11906" w:h="16838" w:orient="portrait"/>
       <w:pgMar w:top="936" w:right="1080" w:bottom="720" w:left="1080" w:header="360" w:footer="432" w:gutter="0"/>
       <w:pgNumType/>
@@ -4348,6 +4348,43 @@
 
 <file path=word/comments.xml><?xml version="1.0" encoding="utf-8"?>
 <w:comments xmlns:cx="http://schemas.microsoft.com/office/drawing/2014/chartex" xmlns:cx1="http://schemas.microsoft.com/office/drawing/2015/9/8/chartex" xmlns:cx2="http://schemas.microsoft.com/office/drawing/2015/10/21/chartex" xmlns:cx3="http://schemas.microsoft.com/office/drawing/2016/5/9/chartex" xmlns:cx4="http://schemas.microsoft.com/office/drawing/2016/5/10/chartex" xmlns:cx5="http://schemas.microsoft.com/office/drawing/2016/5/11/chartex" xmlns:cx6="http://schemas.microsoft.com/office/drawing/2016/5/12/chartex" xmlns:cx7="http://schemas.microsoft.com/office/drawing/2016/5/13/chartex" xmlns:cx8="http://schemas.microsoft.com/office/drawing/2016/5/14/chartex" xmlns:mc="http://schemas.openxmlformats.org/markup-compatibility/2006" xmlns:aink="http://schemas.microsoft.com/office/drawing/2016/ink" xmlns:am3d="http://schemas.microsoft.com/office/drawing/2017/model3d" xmlns:o="urn:schemas-microsoft-com:office:office" xmlns:r="http://schemas.openxmlformats.org/officeDocument/2006/relationships" xmlns:m="http://schemas.openxmlformats.org/officeDocument/2006/math" xmlns:v="urn:schemas-microsoft-com:vml" xmlns:wp14="http://schemas.microsoft.com/office/word/2010/wordprocessingDrawing" xmlns:wp="http://schemas.openxmlformats.org/drawingml/2006/wordprocessingDrawing" xmlns:w10="urn:schemas-microsoft-com:office:word" xmlns:w="http://schemas.openxmlformats.org/wordprocessingml/2006/main" xmlns:w14="http://schemas.microsoft.com/office/word/2010/wordml" xmlns:w15="http://schemas.microsoft.com/office/word/2012/wordml" xmlns:w16cex="http://schemas.microsoft.com/office/word/2018/wordml/cex" xmlns:w16cid="http://schemas.microsoft.com/office/word/2016/wordml/cid" xmlns:w16="http://schemas.microsoft.com/office/word/2018/wordml" xmlns:w16sdtdh="http://schemas.microsoft.com/office/word/2020/wordml/sdtdatahash" xmlns:w16se="http://schemas.microsoft.com/office/word/2015/wordml/symex" xmlns:wpg="http://schemas.microsoft.com/office/word/2010/wordprocessingGroup" xmlns:wpi="http://schemas.microsoft.com/office/word/2010/wordprocessingInk" xmlns:wne="http://schemas.microsoft.com/office/word/2006/wordml" xmlns:wps="http://schemas.microsoft.com/office/word/2010/wordprocessingShape"/>
+</file>
+
+<file path=word/endnotes.xml><?xml version="1.0" encoding="utf-8"?>
+<w:endnotes xmlns:wpc="http://schemas.microsoft.com/office/word/2010/wordprocessingCanvas" xmlns:mc="http://schemas.openxmlformats.org/markup-compatibility/2006" xmlns:o="urn:schemas-microsoft-com:office:office" xmlns:r="http://schemas.openxmlformats.org/officeDocument/2006/relationships" xmlns:m="http://schemas.openxmlformats.org/officeDocument/2006/math" xmlns:v="urn:schemas-microsoft-com:vml" xmlns:wp14="http://schemas.microsoft.com/office/word/2010/wordprocessingDrawing" xmlns:wp="http://schemas.openxmlformats.org/drawingml/2006/wordprocessingDrawing" xmlns:w10="urn:schemas-microsoft-com:office:word" xmlns:w="http://schemas.openxmlformats.org/wordprocessingml/2006/main" xmlns:w14="http://schemas.microsoft.com/office/word/2010/wordml" xmlns:w15="http://schemas.microsoft.com/office/word/2012/wordml" xmlns:wpg="http://schemas.microsoft.com/office/word/2010/wordprocessingGroup" xmlns:wpi="http://schemas.microsoft.com/office/word/2010/wordprocessingInk" xmlns:wne="http://schemas.microsoft.com/office/word/2006/wordml" xmlns:wps="http://schemas.microsoft.com/office/word/2010/wordprocessingShape" mc:Ignorable="w14 w15 wp14">
+  <w:endnote w:type="separator" w:id="-1">
+    <w:p>
+      <w:pPr>
+        <w:spacing w:after="0" w:line="240" w:lineRule="auto"/>
+      </w:pPr>
+      <w:r>
+        <w:rPr>
+          <w:rStyle w:val="EndnoteReference"/>
+        </w:rPr>
+        <w:endnoteRef/>
+      </w:r>
+      <w:r>
+        <w:separator/>
+      </w:r>
+    </w:p>
+  </w:endnote>
+  <w:endnote w:type="continuationSeparator" w:id="0">
+    <w:p>
+      <w:pPr>
+        <w:spacing w:after="0" w:line="240" w:lineRule="auto"/>
+      </w:pPr>
+      <w:r>
+        <w:rPr>
+          <w:rStyle w:val="EndnoteReference"/>
+        </w:rPr>
+        <w:endnoteRef/>
+      </w:r>
+      <w:r>
+        <w:continuationSeparator/>
+      </w:r>
+    </w:p>
+  </w:endnote>
+</w:endnotes>
 </file>
 
 <file path=word/footer1.xml><?xml version="1.0" encoding="utf-8"?>
@@ -4412,7 +4449,7 @@
   </w:p>
   <w:p>
     <w:pPr>
-      <w:spacing w:before="0" w:after="0"/>
+      <w:spacing w:after="0" w:before="0"/>
     </w:pPr>
     <w:r>
       <w:rPr>
@@ -4652,7 +4689,7 @@
         </w:tcPr>
         <w:p>
           <w:pPr>
-            <w:spacing w:before="0" w:after="0"/>
+            <w:spacing w:after="0" w:before="0"/>
             <w:jc w:val="right"/>
           </w:pPr>
           <w:r>
@@ -4743,7 +4780,7 @@
         </w:tcPr>
         <w:p>
           <w:pPr>
-            <w:spacing w:before="0" w:after="0"/>
+            <w:spacing w:after="0" w:before="0"/>
             <w:jc w:val="right"/>
           </w:pPr>
           <w:r>
@@ -4834,7 +4871,7 @@
         </w:tcPr>
         <w:p>
           <w:pPr>
-            <w:spacing w:before="0" w:after="0"/>
+            <w:spacing w:after="0" w:before="0"/>
             <w:jc w:val="right"/>
           </w:pPr>
           <w:r>
@@ -4971,7 +5008,7 @@
     </w:rPrDefault>
     <w:pPrDefault>
       <w:pPr>
-        <w:spacing w:before="0" w:after="0" w:line="340" w:lineRule="auto"/>
+        <w:spacing w:after="0" w:before="0" w:line="340" w:lineRule="auto"/>
       </w:pPr>
     </w:pPrDefault>
   </w:docDefaults>
@@ -5109,12 +5146,49 @@
       <w:szCs w:val="20"/>
     </w:rPr>
   </w:style>
+  <w:style w:type="character" w:styleId="EndnoteReference">
+    <w:name w:val="endnote reference"/>
+    <w:basedOn w:val="DefaultParagraphFont"/>
+    <w:uiPriority w:val="99"/>
+    <w:semiHidden/>
+    <w:unhideWhenUsed/>
+    <w:rPr>
+      <w:vertAlign w:val="superscript"/>
+    </w:rPr>
+  </w:style>
+  <w:style w:type="paragraph" w:styleId="EndnoteText">
+    <w:name w:val="endnote text"/>
+    <w:basedOn w:val="Normal"/>
+    <w:link w:val="EndnoteTextChar"/>
+    <w:uiPriority w:val="99"/>
+    <w:semiHidden/>
+    <w:unhideWhenUsed/>
+    <w:pPr>
+      <w:spacing w:after="0" w:line="240" w:lineRule="auto"/>
+    </w:pPr>
+    <w:rPr>
+      <w:sz w:val="20"/>
+      <w:szCs w:val="20"/>
+    </w:rPr>
+  </w:style>
+  <w:style w:type="character" w:styleId="EndnoteTextChar">
+    <w:name w:val="Endnote Text Char"/>
+    <w:basedOn w:val="DefaultParagraphFont"/>
+    <w:link w:val="EndnoteText"/>
+    <w:uiPriority w:val="99"/>
+    <w:semiHidden/>
+    <w:unhideWhenUsed/>
+    <w:rPr>
+      <w:sz w:val="20"/>
+      <w:szCs w:val="20"/>
+    </w:rPr>
+  </w:style>
   <w:style w:type="paragraph" w:styleId="Normal">
     <w:name w:val="Normal"/>
     <w:next w:val="Normal"/>
     <w:qFormat/>
     <w:pPr>
-      <w:spacing w:before="0" w:after="0" w:line="340" w:lineRule="auto"/>
+      <w:spacing w:after="0" w:before="0" w:line="340" w:lineRule="auto"/>
     </w:pPr>
     <w:rPr>
       <w:rFonts w:ascii="Arial" w:cs="Arial" w:eastAsia="Arial" w:hAnsi="Arial"/>
@@ -5129,7 +5203,7 @@
     <w:next w:val="OAClauseBody"/>
     <w:qFormat/>
     <w:pPr>
-      <w:spacing w:before="320" w:after="120" w:line="340" w:lineRule="auto"/>
+      <w:spacing w:after="120" w:before="320" w:line="340" w:lineRule="auto"/>
     </w:pPr>
     <w:rPr>
       <w:rFonts w:ascii="Arial" w:cs="Arial" w:eastAsia="Arial" w:hAnsi="Arial"/>
@@ -5146,7 +5220,7 @@
     <w:next w:val="OAClauseHeading"/>
     <w:qFormat/>
     <w:pPr>
-      <w:spacing w:before="0" w:after="280" w:line="340" w:lineRule="auto"/>
+      <w:spacing w:after="280" w:before="0" w:line="340" w:lineRule="auto"/>
     </w:pPr>
     <w:rPr>
       <w:rFonts w:ascii="Arial" w:cs="Arial" w:eastAsia="Arial" w:hAnsi="Arial"/>

</xml_diff>